<commit_message>
docs: incorporate comprehensive peer review proofreading fixes across docx, pdf, and figures
</commit_message>
<xml_diff>
--- a/docs/Katers_Pendulum_Research_Report.docx
+++ b/docs/Katers_Pendulum_Research_Report.docx
@@ -88,7 +88,7 @@
           <w:i/>
           <w:sz w:val="20"/>
         </w:rPr>
-        <w:t xml:space="preserve"> streaming real-time angular velocity and tri-axial acceleration. Using sub-sample linear interpolation at gyroscope zero-crossings, half-swing numerical velocity integration (</w:t>
+        <w:t>, streaming real-time angular velocity and tri-axial acceleration. Using sub-sample linear interpolation at gyroscope zero-crossings, half-swing numerical velocity integration (</w:t>
       </w:r>
       <m:oMath>
         <m:sSub>
@@ -131,7 +131,7 @@
           <w:i/>
           <w:sz w:val="20"/>
         </w:rPr>
-        <w:t>), and Borda finite-amplitude circular corrections, we evaluate two complete multi-trial datasets gathered across independent laboratory sessions.</w:t>
+        <w:t>), and per-cycle analytic Borda finite-amplitude circular corrections, we evaluate two complete multi-trial datasets gathered across independent laboratory sessions.</w:t>
       </w:r>
     </w:p>
     <w:p>
@@ -227,7 +227,45 @@
           <w:i/>
           <w:sz w:val="20"/>
         </w:rPr>
-        <w:t xml:space="preserve"> and </w:t>
+        <w:t xml:space="preserve"> (sample SD, standard error of the mean </w:t>
+      </w:r>
+      <m:oMath>
+        <m:sSub>
+          <m:e>
+            <m:r>
+              <m:t>σ</m:t>
+            </m:r>
+          </m:e>
+          <m:sub>
+            <m:bar>
+              <m:barPr>
+                <m:pos m:val="top"/>
+              </m:barPr>
+              <m:e>
+                <m:r>
+                  <m:t>T</m:t>
+                </m:r>
+              </m:e>
+            </m:bar>
+          </m:sub>
+        </m:sSub>
+        <m:r>
+          <m:t>=0.128</m:t>
+        </m:r>
+        <m:r>
+          <m:rPr>
+            <m:nor/>
+          </m:rPr>
+          <m:t> ms</m:t>
+        </m:r>
+      </m:oMath>
+      <w:r>
+        <w:rPr>
+          <w:b w:val="0"/>
+          <w:i/>
+          <w:sz w:val="20"/>
+        </w:rPr>
+        <w:t xml:space="preserve">) and </w:t>
       </w:r>
       <m:oMath>
         <m:sSub>
@@ -258,11 +296,49 @@
           <w:i/>
           <w:sz w:val="20"/>
         </w:rPr>
-        <w:t xml:space="preserve">. Applying Bessel's asymmetric compound pendulum formula for knife-edge separation </w:t>
+        <w:t xml:space="preserve"> (</w:t>
       </w:r>
       <m:oMath>
-        <m:r>
-          <m:t>L=1.0000</m:t>
+        <m:sSub>
+          <m:e>
+            <m:r>
+              <m:t>σ</m:t>
+            </m:r>
+          </m:e>
+          <m:sub>
+            <m:bar>
+              <m:barPr>
+                <m:pos m:val="top"/>
+              </m:barPr>
+              <m:e>
+                <m:r>
+                  <m:t>T</m:t>
+                </m:r>
+              </m:e>
+            </m:bar>
+          </m:sub>
+        </m:sSub>
+        <m:r>
+          <m:t>=0.200</m:t>
+        </m:r>
+        <m:r>
+          <m:rPr>
+            <m:nor/>
+          </m:rPr>
+          <m:t> ms</m:t>
+        </m:r>
+      </m:oMath>
+      <w:r>
+        <w:rPr>
+          <w:b w:val="0"/>
+          <w:i/>
+          <w:sz w:val="20"/>
+        </w:rPr>
+        <w:t xml:space="preserve">). Applying Bessel's asymmetric compound pendulum formula for knife-edge separation </w:t>
+      </w:r>
+      <m:oMath>
+        <m:r>
+          <m:t>L=1.0000±0.0005</m:t>
         </m:r>
         <m:r>
           <m:rPr>
@@ -308,7 +384,7 @@
           </m:sub>
         </m:sSub>
         <m:r>
-          <m:t>=−0.1400</m:t>
+          <m:t>=−0.1400±0.0014</m:t>
         </m:r>
         <m:r>
           <m:rPr>
@@ -327,7 +403,7 @@
       </w:r>
       <m:oMath>
         <m:r>
-          <m:t>g=9.8079±0.0198</m:t>
+          <m:t>g=9.8079±0.0264</m:t>
         </m:r>
         <m:sSup>
           <m:e>
@@ -351,11 +427,11 @@
           <w:i/>
           <w:sz w:val="20"/>
         </w:rPr>
-        <w:t>, in exceptional agreement with the standard accepted value (</w:t>
+        <w:t xml:space="preserve"> (</w:t>
       </w:r>
       <m:oMath>
         <m:r>
-          <m:t>+0.013%</m:t>
+          <m:t>±0.27%</m:t>
         </m:r>
       </m:oMath>
       <w:r>
@@ -364,7 +440,60 @@
           <w:i/>
           <w:sz w:val="20"/>
         </w:rPr>
-        <w:t xml:space="preserve"> relative error). In Dataset 2 (October 17, 2026), across </w:t>
+        <w:t xml:space="preserve"> total analytical uncertainty), in agreement with conventional standard gravity </w:t>
+      </w:r>
+      <m:oMath>
+        <m:sSub>
+          <m:e>
+            <m:r>
+              <m:t>g</m:t>
+            </m:r>
+          </m:e>
+          <m:sub>
+            <m:r>
+              <m:t>0</m:t>
+            </m:r>
+          </m:sub>
+        </m:sSub>
+        <m:r>
+          <m:t>=9.80665</m:t>
+        </m:r>
+        <m:sSup>
+          <m:e>
+            <m:r>
+              <m:rPr>
+                <m:nor/>
+              </m:rPr>
+              <m:t> m/s</m:t>
+            </m:r>
+          </m:e>
+          <m:sup>
+            <m:r>
+              <m:t>2</m:t>
+            </m:r>
+          </m:sup>
+        </m:sSup>
+      </m:oMath>
+      <w:r>
+        <w:rPr>
+          <w:b w:val="0"/>
+          <w:i/>
+          <w:sz w:val="20"/>
+        </w:rPr>
+        <w:t xml:space="preserve"> (</w:t>
+      </w:r>
+      <m:oMath>
+        <m:r>
+          <m:t>+0.013%</m:t>
+        </m:r>
+      </m:oMath>
+      <w:r>
+        <w:rPr>
+          <w:b w:val="0"/>
+          <w:i/>
+          <w:sz w:val="20"/>
+        </w:rPr>
+        <w:t xml:space="preserve"> relative discrepancy, well within the experimental uncertainty budget). In Dataset 2 (October 17, 2026), across </w:t>
       </w:r>
       <m:oMath>
         <m:sSub>
@@ -445,7 +574,45 @@
           <w:i/>
           <w:sz w:val="20"/>
         </w:rPr>
-        <w:t xml:space="preserve"> and </w:t>
+        <w:t xml:space="preserve"> (</w:t>
+      </w:r>
+      <m:oMath>
+        <m:sSub>
+          <m:e>
+            <m:r>
+              <m:t>σ</m:t>
+            </m:r>
+          </m:e>
+          <m:sub>
+            <m:bar>
+              <m:barPr>
+                <m:pos m:val="top"/>
+              </m:barPr>
+              <m:e>
+                <m:r>
+                  <m:t>T</m:t>
+                </m:r>
+              </m:e>
+            </m:bar>
+          </m:sub>
+        </m:sSub>
+        <m:r>
+          <m:t>=0.257</m:t>
+        </m:r>
+        <m:r>
+          <m:rPr>
+            <m:nor/>
+          </m:rPr>
+          <m:t> ms</m:t>
+        </m:r>
+      </m:oMath>
+      <w:r>
+        <w:rPr>
+          <w:b w:val="0"/>
+          <w:i/>
+          <w:sz w:val="20"/>
+        </w:rPr>
+        <w:t xml:space="preserve">) and </w:t>
       </w:r>
       <m:oMath>
         <m:sSub>
@@ -476,11 +643,49 @@
           <w:i/>
           <w:sz w:val="20"/>
         </w:rPr>
-        <w:t xml:space="preserve">, yielding </w:t>
+        <w:t xml:space="preserve"> (</w:t>
       </w:r>
       <m:oMath>
-        <m:r>
-          <m:t>g=9.7045±0.0309</m:t>
+        <m:sSub>
+          <m:e>
+            <m:r>
+              <m:t>σ</m:t>
+            </m:r>
+          </m:e>
+          <m:sub>
+            <m:bar>
+              <m:barPr>
+                <m:pos m:val="top"/>
+              </m:barPr>
+              <m:e>
+                <m:r>
+                  <m:t>T</m:t>
+                </m:r>
+              </m:e>
+            </m:bar>
+          </m:sub>
+        </m:sSub>
+        <m:r>
+          <m:t>=0.689</m:t>
+        </m:r>
+        <m:r>
+          <m:rPr>
+            <m:nor/>
+          </m:rPr>
+          <m:t> ms</m:t>
+        </m:r>
+      </m:oMath>
+      <w:r>
+        <w:rPr>
+          <w:b w:val="0"/>
+          <w:i/>
+          <w:sz w:val="20"/>
+        </w:rPr>
+        <w:t xml:space="preserve">), yielding </w:t>
+      </w:r>
+      <m:oMath>
+        <m:r>
+          <m:t>g=9.7045±0.0381</m:t>
         </m:r>
         <m:sSup>
           <m:e>
@@ -508,7 +713,7 @@
       </w:r>
       <m:oMath>
         <m:r>
-          <m:t>1.04%</m:t>
+          <m:t>−1.04%</m:t>
         </m:r>
       </m:oMath>
       <w:r>
@@ -517,7 +722,7 @@
           <w:i/>
           <w:sz w:val="20"/>
         </w:rPr>
-        <w:t xml:space="preserve"> error).</w:t>
+        <w:t xml:space="preserve"> relative discrepancy).</w:t>
       </w:r>
     </w:p>
     <w:p>
@@ -532,7 +737,7 @@
           <w:i/>
           <w:sz w:val="20"/>
         </w:rPr>
-        <w:t xml:space="preserve">Furthermore, we provide an exhaustive software post-mortem explaining the origins of initial anomalous figures observed during live testing: (i) the naive symmetric formula artifact producing </w:t>
+        <w:t xml:space="preserve">Furthermore, we provide an engineering post-mortem explaining the origins of three initial anomalies observed during live testing: (i) the naive symmetric formula artifact producing </w:t>
       </w:r>
       <m:oMath>
         <m:r>
@@ -545,7 +750,7 @@
           <m:t>--</m:t>
         </m:r>
         <m:r>
-          <m:t>13.9</m:t>
+          <m:t>13.8</m:t>
         </m:r>
         <m:sSup>
           <m:e>
@@ -569,7 +774,7 @@
           <w:i/>
           <w:sz w:val="20"/>
         </w:rPr>
-        <w:t xml:space="preserve">, (ii) the low-amplitude angular speed cutoff bug that generated missed zero crossings and corrupted Bessel's calculation to </w:t>
+        <w:t xml:space="preserve">, (ii) the low-amplitude angular speed cutoff bug that generated missed zero crossings and collapsed Bessel's calculation to </w:t>
       </w:r>
       <m:oMath>
         <m:r>
@@ -597,7 +802,33 @@
           <w:i/>
           <w:sz w:val="20"/>
         </w:rPr>
-        <w:t>, and (iii) the mounting tilt asymmetry that caused decay scatter bifurcation. The physical data from both sessions is demonstrated to be experimentally robust, repeatable, and capable of sub-part-per-thousand accuracy.</w:t>
+        <w:t xml:space="preserve"> (</w:t>
+      </w:r>
+      <m:oMath>
+        <m:r>
+          <m:t>−50.87%</m:t>
+        </m:r>
+      </m:oMath>
+      <w:r>
+        <w:rPr>
+          <w:b w:val="0"/>
+          <w:i/>
+          <w:sz w:val="20"/>
+        </w:rPr>
+        <w:t>), and (iii) the mounting tilt asymmetry that caused decay-plot splitting. The physical telemetry from both sessions is demonstrated to be experimentally robust, repeatable, and capable of sub-percent precision (</w:t>
+      </w:r>
+      <m:oMath>
+        <m:r>
+          <m:t>±0.27%</m:t>
+        </m:r>
+      </m:oMath>
+      <w:r>
+        <w:rPr>
+          <w:b w:val="0"/>
+          <w:i/>
+          <w:sz w:val="20"/>
+        </w:rPr>
+        <w:t>).</w:t>
       </w:r>
     </w:p>
     <w:p>
@@ -792,7 +1023,7 @@
           <w:b w:val="0"/>
           <w:i w:val="0"/>
         </w:rPr>
-        <w:t xml:space="preserve"> are identical to within microsecond precision is notoriously labor-intensive, requiring days of trial and error. To eliminate this operational bottleneck, Friedrich Wilhelm Bessel developed an exact analytical formulation in 1828 for compound pendulums with unequal periods [2]. Bessel demonstrated that by incorporating the asymmetry of the center of mass relative to the two knife edges </w:t>
+        <w:t xml:space="preserve"> are identical to within microsecond precision is tedious and sensitive to ambient thermal and mechanical drifts. To eliminate this operational bottleneck, Friedrich Wilhelm Bessel developed an exact analytical formulation in 1828 for compound pendulums with unequal periods [2]. Bessel demonstrated that by incorporating the asymmetry of the center of mass relative to the two knife edges </w:t>
       </w:r>
       <m:oMath>
         <m:d>
@@ -882,7 +1113,7 @@
           <w:b w:val="0"/>
           <w:i w:val="0"/>
         </w:rPr>
-        <w:t xml:space="preserve"> without requiring equal periods.</w:t>
+        <w:t xml:space="preserve"> without requiring mechanical period matching.</w:t>
       </w:r>
     </w:p>
     <w:p>
@@ -895,7 +1126,7 @@
           <w:b w:val="0"/>
           <w:i w:val="0"/>
         </w:rPr>
-        <w:t xml:space="preserve">In this work, we modernize the classical Kater-Bessel experiment by coupling a rigid reversible bar to a digital inertial measurement telemetry pipeline. By streaming angular velocity </w:t>
+        <w:t xml:space="preserve">In this work, we modernize the classical Kater–Bessel experiment by coupling a rigid reversible bar to a digital inertial measurement telemetry pipeline. By streaming angular velocity </w:t>
       </w:r>
       <m:oMath>
         <m:sSub>
@@ -1189,7 +1420,7 @@
           <w:b w:val="0"/>
           <w:i w:val="0"/>
         </w:rPr>
-        <w:t xml:space="preserve"> is the radius of gyration about the center of mass. For infinitesimal angular displacements </w:t>
+        <w:t xml:space="preserve"> is the radius of gyration about the center of mass. For small angular displacements </w:t>
       </w:r>
       <m:oMath>
         <m:r>
@@ -3367,7 +3598,7 @@
           <w:b w:val="0"/>
           <w:i w:val="0"/>
         </w:rPr>
-        <w:t>Bessel's formula possesses an extraordinary mathematical property:</w:t>
+        <w:t>Bessel's formula possesses a significant error-attenuating property:</w:t>
       </w:r>
     </w:p>
     <w:p>
@@ -3450,7 +3681,7 @@
           <w:b w:val="0"/>
           <w:i w:val="0"/>
         </w:rPr>
-        <w:t xml:space="preserve"> can be measured with high precision using a vernier scale or cathetometer (</w:t>
+        <w:t xml:space="preserve"> can be measured with high accuracy using a precision vernier cathetometer (</w:t>
       </w:r>
       <m:oMath>
         <m:r>
@@ -3461,6 +3692,18 @@
             <m:nor/>
           </m:rPr>
           <m:t> mm</m:t>
+        </m:r>
+      </m:oMath>
+      <w:r>
+        <w:rPr>
+          <w:b w:val="0"/>
+          <w:i w:val="0"/>
+        </w:rPr>
+        <w:t xml:space="preserve">, or </w:t>
+      </w:r>
+      <m:oMath>
+        <m:r>
+          <m:t>±0.05%</m:t>
         </m:r>
       </m:oMath>
       <w:r>
@@ -3563,7 +3806,7 @@
           <w:b w:val="0"/>
           <w:i w:val="0"/>
         </w:rPr>
-        <w:t xml:space="preserve">, contains the center-of-mass asymmetry term </w:t>
+        <w:t xml:space="preserve">, contains the center-of-mass balance asymmetry </w:t>
       </w:r>
       <m:oMath>
         <m:d>
@@ -3605,7 +3848,7 @@
           <w:b w:val="0"/>
           <w:i w:val="0"/>
         </w:rPr>
-        <w:t>. Because finding the center of mass by balance knife-edge introduces a moderate experimental uncertainty (</w:t>
+        <w:t>. Because finding the center of mass by knife-edge balance introduces an experimental uncertainty (</w:t>
       </w:r>
       <m:oMath>
         <m:r>
@@ -3639,7 +3882,7 @@
           </m:sub>
         </m:sSub>
         <m:r>
-          <m:t>)≈±1</m:t>
+          <m:t>)≈±1.4</m:t>
         </m:r>
         <m:r>
           <m:rPr>
@@ -3653,7 +3896,44 @@
           <w:b w:val="0"/>
           <w:i w:val="0"/>
         </w:rPr>
-        <w:t xml:space="preserve">), this term would normally inject large errors. However, because </w:t>
+        <w:t xml:space="preserve">, or </w:t>
+      </w:r>
+      <m:oMath>
+        <m:r>
+          <m:t>±1.0%</m:t>
+        </m:r>
+      </m:oMath>
+      <w:r>
+        <w:rPr>
+          <w:b w:val="0"/>
+          <w:i w:val="0"/>
+        </w:rPr>
+        <w:t xml:space="preserve">), this term would normally inject large errors into </w:t>
+      </w:r>
+      <m:oMath>
+        <m:r>
+          <m:t>g</m:t>
+        </m:r>
+      </m:oMath>
+      <w:r>
+        <w:rPr>
+          <w:b w:val="0"/>
+          <w:i w:val="0"/>
+        </w:rPr>
+        <w:t>.</w:t>
+      </w:r>
+    </w:p>
+    <w:p>
+      <w:pPr>
+        <w:pStyle w:val="ListBullet"/>
+        <w:spacing w:before="20" w:after="40" w:line="276" w:lineRule="auto"/>
+      </w:pPr>
+      <w:r>
+        <w:rPr>
+          <w:b w:val="0"/>
+          <w:i w:val="0"/>
+        </w:rPr>
+        <w:t xml:space="preserve">However, because </w:t>
       </w:r>
       <m:oMath>
         <m:sSub>
@@ -3695,7 +3975,7 @@
           <w:b w:val="0"/>
           <w:i w:val="0"/>
         </w:rPr>
-        <w:t xml:space="preserve"> are designed to be close in value (</w:t>
+        <w:t xml:space="preserve"> are close in value (</w:t>
       </w:r>
       <m:oMath>
         <m:sSub>
@@ -3807,7 +4087,34 @@
           <w:b w:val="0"/>
           <w:i w:val="0"/>
         </w:rPr>
-        <w:t xml:space="preserve"> is small.</w:t>
+        <w:t xml:space="preserve"> is small (</w:t>
+      </w:r>
+      <m:oMath>
+        <m:r>
+          <m:t>2.86−3.14=−0.28</m:t>
+        </m:r>
+        <m:sSup>
+          <m:e>
+            <m:r>
+              <m:rPr>
+                <m:nor/>
+              </m:rPr>
+              <m:t> s</m:t>
+            </m:r>
+          </m:e>
+          <m:sup>
+            <m:r>
+              <m:t>2</m:t>
+            </m:r>
+          </m:sup>
+        </m:sSup>
+      </m:oMath>
+      <w:r>
+        <w:rPr>
+          <w:b w:val="0"/>
+          <w:i w:val="0"/>
+        </w:rPr>
+        <w:t>).</w:t>
       </w:r>
     </w:p>
     <w:p>
@@ -3820,7 +4127,493 @@
           <w:b w:val="0"/>
           <w:i w:val="0"/>
         </w:rPr>
-        <w:t xml:space="preserve">Consequently, the fractional error propagated from </w:t>
+        <w:t xml:space="preserve">Defining the denominator sum </w:t>
+      </w:r>
+      <m:oMath>
+        <m:r>
+          <m:t>Φ=</m:t>
+        </m:r>
+        <m:f>
+          <m:fPr>
+            <m:type m:val="bar"/>
+          </m:fPr>
+          <m:num>
+            <m:sSubSup>
+              <m:e>
+                <m:r>
+                  <m:t>T</m:t>
+                </m:r>
+              </m:e>
+              <m:sub>
+                <m:r>
+                  <m:t>1</m:t>
+                </m:r>
+              </m:sub>
+              <m:sup>
+                <m:r>
+                  <m:t>2</m:t>
+                </m:r>
+              </m:sup>
+            </m:sSubSup>
+            <m:r>
+              <m:t>+</m:t>
+            </m:r>
+            <m:sSubSup>
+              <m:e>
+                <m:r>
+                  <m:t>T</m:t>
+                </m:r>
+              </m:e>
+              <m:sub>
+                <m:r>
+                  <m:t>2</m:t>
+                </m:r>
+              </m:sub>
+              <m:sup>
+                <m:r>
+                  <m:t>2</m:t>
+                </m:r>
+              </m:sup>
+            </m:sSubSup>
+          </m:num>
+          <m:den>
+            <m:r>
+              <m:t>L</m:t>
+            </m:r>
+          </m:den>
+        </m:f>
+        <m:r>
+          <m:t>+</m:t>
+        </m:r>
+        <m:f>
+          <m:fPr>
+            <m:type m:val="bar"/>
+          </m:fPr>
+          <m:num>
+            <m:sSubSup>
+              <m:e>
+                <m:r>
+                  <m:t>T</m:t>
+                </m:r>
+              </m:e>
+              <m:sub>
+                <m:r>
+                  <m:t>1</m:t>
+                </m:r>
+              </m:sub>
+              <m:sup>
+                <m:r>
+                  <m:t>2</m:t>
+                </m:r>
+              </m:sup>
+            </m:sSubSup>
+            <m:r>
+              <m:t>−</m:t>
+            </m:r>
+            <m:sSubSup>
+              <m:e>
+                <m:r>
+                  <m:t>T</m:t>
+                </m:r>
+              </m:e>
+              <m:sub>
+                <m:r>
+                  <m:t>2</m:t>
+                </m:r>
+              </m:sub>
+              <m:sup>
+                <m:r>
+                  <m:t>2</m:t>
+                </m:r>
+              </m:sup>
+            </m:sSubSup>
+          </m:num>
+          <m:den>
+            <m:sSub>
+              <m:e>
+                <m:r>
+                  <m:t>h</m:t>
+                </m:r>
+              </m:e>
+              <m:sub>
+                <m:r>
+                  <m:t>1</m:t>
+                </m:r>
+              </m:sub>
+            </m:sSub>
+            <m:r>
+              <m:t>−</m:t>
+            </m:r>
+            <m:sSub>
+              <m:e>
+                <m:r>
+                  <m:t>h</m:t>
+                </m:r>
+              </m:e>
+              <m:sub>
+                <m:r>
+                  <m:t>2</m:t>
+                </m:r>
+              </m:sub>
+            </m:sSub>
+          </m:den>
+        </m:f>
+      </m:oMath>
+      <w:r>
+        <w:rPr>
+          <w:b w:val="0"/>
+          <w:i w:val="0"/>
+        </w:rPr>
+        <w:t xml:space="preserve">, the relative sensitivity of </w:t>
+      </w:r>
+      <m:oMath>
+        <m:r>
+          <m:t>g</m:t>
+        </m:r>
+      </m:oMath>
+      <w:r>
+        <w:rPr>
+          <w:b w:val="0"/>
+          <w:i w:val="0"/>
+        </w:rPr>
+        <w:t xml:space="preserve"> to </w:t>
+      </w:r>
+      <m:oMath>
+        <m:r>
+          <m:t>(</m:t>
+        </m:r>
+        <m:sSub>
+          <m:e>
+            <m:r>
+              <m:t>h</m:t>
+            </m:r>
+          </m:e>
+          <m:sub>
+            <m:r>
+              <m:t>1</m:t>
+            </m:r>
+          </m:sub>
+        </m:sSub>
+        <m:r>
+          <m:t>−</m:t>
+        </m:r>
+        <m:sSub>
+          <m:e>
+            <m:r>
+              <m:t>h</m:t>
+            </m:r>
+          </m:e>
+          <m:sub>
+            <m:r>
+              <m:t>2</m:t>
+            </m:r>
+          </m:sub>
+        </m:sSub>
+        <m:r>
+          <m:t>)≡d</m:t>
+        </m:r>
+      </m:oMath>
+      <w:r>
+        <w:rPr>
+          <w:b w:val="0"/>
+          <w:i w:val="0"/>
+        </w:rPr>
+        <w:t xml:space="preserve"> is:</w:t>
+      </w:r>
+    </w:p>
+    <w:p>
+      <w:pPr>
+        <w:spacing w:before="120" w:after="120"/>
+        <w:jc w:val="center"/>
+      </w:pPr>
+      <m:oMath>
+        <m:f>
+          <m:fPr>
+            <m:type m:val="bar"/>
+          </m:fPr>
+          <m:num>
+            <m:r>
+              <m:t>δg</m:t>
+            </m:r>
+          </m:num>
+          <m:den>
+            <m:r>
+              <m:t>g</m:t>
+            </m:r>
+          </m:den>
+        </m:f>
+        <m:r>
+          <m:t>≈</m:t>
+        </m:r>
+        <m:d>
+          <m:dPr>
+            <m:sepChr m:val=""/>
+          </m:dPr>
+          <m:e>
+            <m:f>
+              <m:fPr>
+                <m:type m:val="bar"/>
+              </m:fPr>
+              <m:num>
+                <m:sSubSup>
+                  <m:e>
+                    <m:r>
+                      <m:t>T</m:t>
+                    </m:r>
+                  </m:e>
+                  <m:sub>
+                    <m:r>
+                      <m:t>1</m:t>
+                    </m:r>
+                  </m:sub>
+                  <m:sup>
+                    <m:r>
+                      <m:t>2</m:t>
+                    </m:r>
+                  </m:sup>
+                </m:sSubSup>
+                <m:r>
+                  <m:t>−</m:t>
+                </m:r>
+                <m:sSubSup>
+                  <m:e>
+                    <m:r>
+                      <m:t>T</m:t>
+                    </m:r>
+                  </m:e>
+                  <m:sub>
+                    <m:r>
+                      <m:t>2</m:t>
+                    </m:r>
+                  </m:sub>
+                  <m:sup>
+                    <m:r>
+                      <m:t>2</m:t>
+                    </m:r>
+                  </m:sup>
+                </m:sSubSup>
+              </m:num>
+              <m:den>
+                <m:r>
+                  <m:t>Φd</m:t>
+                </m:r>
+              </m:den>
+            </m:f>
+          </m:e>
+        </m:d>
+        <m:f>
+          <m:fPr>
+            <m:type m:val="bar"/>
+          </m:fPr>
+          <m:num>
+            <m:r>
+              <m:t>δd</m:t>
+            </m:r>
+          </m:num>
+          <m:den>
+            <m:r>
+              <m:t>d</m:t>
+            </m:r>
+          </m:den>
+        </m:f>
+      </m:oMath>
+    </w:p>
+    <w:p>
+      <w:pPr>
+        <w:spacing w:before="0" w:after="80" w:line="276" w:lineRule="auto"/>
+        <w:jc w:val="both"/>
+      </w:pPr>
+      <w:r>
+        <w:rPr>
+          <w:b w:val="0"/>
+          <w:i w:val="0"/>
+        </w:rPr>
+        <w:t xml:space="preserve">For our apparatus, </w:t>
+      </w:r>
+      <m:oMath>
+        <m:r>
+          <m:t>Φ≈8.05</m:t>
+        </m:r>
+        <m:sSup>
+          <m:e>
+            <m:r>
+              <m:rPr>
+                <m:nor/>
+              </m:rPr>
+              <m:t> s</m:t>
+            </m:r>
+          </m:e>
+          <m:sup>
+            <m:r>
+              <m:t>2</m:t>
+            </m:r>
+          </m:sup>
+        </m:sSup>
+        <m:r>
+          <m:t>/</m:t>
+        </m:r>
+        <m:r>
+          <m:rPr>
+            <m:nor/>
+          </m:rPr>
+          <m:t>m</m:t>
+        </m:r>
+      </m:oMath>
+      <w:r>
+        <w:rPr>
+          <w:b w:val="0"/>
+          <w:i w:val="0"/>
+        </w:rPr>
+        <w:t xml:space="preserve"> and </w:t>
+      </w:r>
+      <m:oMath>
+        <m:f>
+          <m:fPr>
+            <m:type m:val="bar"/>
+          </m:fPr>
+          <m:num>
+            <m:sSubSup>
+              <m:e>
+                <m:r>
+                  <m:t>T</m:t>
+                </m:r>
+              </m:e>
+              <m:sub>
+                <m:r>
+                  <m:t>1</m:t>
+                </m:r>
+              </m:sub>
+              <m:sup>
+                <m:r>
+                  <m:t>2</m:t>
+                </m:r>
+              </m:sup>
+            </m:sSubSup>
+            <m:r>
+              <m:t>−</m:t>
+            </m:r>
+            <m:sSubSup>
+              <m:e>
+                <m:r>
+                  <m:t>T</m:t>
+                </m:r>
+              </m:e>
+              <m:sub>
+                <m:r>
+                  <m:t>2</m:t>
+                </m:r>
+              </m:sub>
+              <m:sup>
+                <m:r>
+                  <m:t>2</m:t>
+                </m:r>
+              </m:sup>
+            </m:sSubSup>
+          </m:num>
+          <m:den>
+            <m:r>
+              <m:t>d</m:t>
+            </m:r>
+          </m:den>
+        </m:f>
+        <m:r>
+          <m:t>≈+2.05</m:t>
+        </m:r>
+        <m:sSup>
+          <m:e>
+            <m:r>
+              <m:rPr>
+                <m:nor/>
+              </m:rPr>
+              <m:t> s</m:t>
+            </m:r>
+          </m:e>
+          <m:sup>
+            <m:r>
+              <m:t>2</m:t>
+            </m:r>
+          </m:sup>
+        </m:sSup>
+        <m:r>
+          <m:t>/</m:t>
+        </m:r>
+        <m:r>
+          <m:rPr>
+            <m:nor/>
+          </m:rPr>
+          <m:t>m</m:t>
+        </m:r>
+      </m:oMath>
+      <w:r>
+        <w:rPr>
+          <w:b w:val="0"/>
+          <w:i w:val="0"/>
+        </w:rPr>
+        <w:t xml:space="preserve">, yielding a multiplier of </w:t>
+      </w:r>
+      <m:oMath>
+        <m:f>
+          <m:fPr>
+            <m:type m:val="bar"/>
+          </m:fPr>
+          <m:num>
+            <m:r>
+              <m:t>2.05</m:t>
+            </m:r>
+          </m:num>
+          <m:den>
+            <m:r>
+              <m:t>8.05</m:t>
+            </m:r>
+          </m:den>
+        </m:f>
+        <m:r>
+          <m:t>≈0.25</m:t>
+        </m:r>
+      </m:oMath>
+      <w:r>
+        <w:rPr>
+          <w:b w:val="0"/>
+          <w:i w:val="0"/>
+        </w:rPr>
+        <w:t>.</w:t>
+      </w:r>
+    </w:p>
+    <w:p>
+      <w:pPr>
+        <w:pStyle w:val="ListBullet"/>
+        <w:spacing w:before="20" w:after="40" w:line="276" w:lineRule="auto"/>
+      </w:pPr>
+      <w:r>
+        <w:rPr>
+          <w:b w:val="0"/>
+          <w:i w:val="0"/>
+        </w:rPr>
+        <w:t xml:space="preserve">Consequently, relative uncertainty in the center of mass is attenuated by a factor of approximately </w:t>
+      </w:r>
+      <m:oMath>
+        <m:r>
+          <m:t>4×</m:t>
+        </m:r>
+      </m:oMath>
+      <w:r>
+        <w:rPr>
+          <w:b w:val="0"/>
+          <w:i w:val="0"/>
+        </w:rPr>
+        <w:t xml:space="preserve">: a </w:t>
+      </w:r>
+      <m:oMath>
+        <m:r>
+          <m:t>1.0%</m:t>
+        </m:r>
+      </m:oMath>
+      <w:r>
+        <w:rPr>
+          <w:b w:val="0"/>
+          <w:i w:val="0"/>
+        </w:rPr>
+        <w:t xml:space="preserve"> measurement uncertainty in </w:t>
       </w:r>
       <m:oMath>
         <m:d>
@@ -3862,94 +4655,11 @@
           <w:b w:val="0"/>
           <w:i w:val="0"/>
         </w:rPr>
-        <w:t xml:space="preserve"> is suppressed by the prefactor </w:t>
+        <w:t xml:space="preserve"> propagates to only a </w:t>
       </w:r>
       <m:oMath>
-        <m:f>
-          <m:fPr>
-            <m:type m:val="bar"/>
-          </m:fPr>
-          <m:num>
-            <m:sSubSup>
-              <m:e>
-                <m:r>
-                  <m:t>T</m:t>
-                </m:r>
-              </m:e>
-              <m:sub>
-                <m:r>
-                  <m:t>1</m:t>
-                </m:r>
-              </m:sub>
-              <m:sup>
-                <m:r>
-                  <m:t>2</m:t>
-                </m:r>
-              </m:sup>
-            </m:sSubSup>
-            <m:r>
-              <m:t>−</m:t>
-            </m:r>
-            <m:sSubSup>
-              <m:e>
-                <m:r>
-                  <m:t>T</m:t>
-                </m:r>
-              </m:e>
-              <m:sub>
-                <m:r>
-                  <m:t>2</m:t>
-                </m:r>
-              </m:sub>
-              <m:sup>
-                <m:r>
-                  <m:t>2</m:t>
-                </m:r>
-              </m:sup>
-            </m:sSubSup>
-          </m:num>
-          <m:den>
-            <m:sSubSup>
-              <m:e>
-                <m:r>
-                  <m:t>T</m:t>
-                </m:r>
-              </m:e>
-              <m:sub>
-                <m:r>
-                  <m:t>1</m:t>
-                </m:r>
-              </m:sub>
-              <m:sup>
-                <m:r>
-                  <m:t>2</m:t>
-                </m:r>
-              </m:sup>
-            </m:sSubSup>
-            <m:r>
-              <m:t>+</m:t>
-            </m:r>
-            <m:sSubSup>
-              <m:e>
-                <m:r>
-                  <m:t>T</m:t>
-                </m:r>
-              </m:e>
-              <m:sub>
-                <m:r>
-                  <m:t>2</m:t>
-                </m:r>
-              </m:sub>
-              <m:sup>
-                <m:r>
-                  <m:t>2</m:t>
-                </m:r>
-              </m:sup>
-            </m:sSubSup>
-          </m:den>
-        </m:f>
-        <m:r>
-          <m:t>≈0.05</m:t>
+        <m:r>
+          <m:t>≈0.25%</m:t>
         </m:r>
       </m:oMath>
       <w:r>
@@ -3957,11 +4667,11 @@
           <w:b w:val="0"/>
           <w:i w:val="0"/>
         </w:rPr>
-        <w:t xml:space="preserve">. This suppresses errors in center-of-mass localization by approximately a factor of </w:t>
+        <w:t xml:space="preserve"> uncertainty in </w:t>
       </w:r>
       <m:oMath>
         <m:r>
-          <m:t>20</m:t>
+          <m:t>g</m:t>
         </m:r>
       </m:oMath>
       <w:r>
@@ -3969,7 +4679,19 @@
           <w:b w:val="0"/>
           <w:i w:val="0"/>
         </w:rPr>
-        <w:t>.</w:t>
+        <w:t>. Because period errors are negligible over tens of cycles, the balance asymmetry measurement remains the primary contributor (</w:t>
+      </w:r>
+      <m:oMath>
+        <m:r>
+          <m:t>≈89%</m:t>
+        </m:r>
+      </m:oMath>
+      <w:r>
+        <w:rPr>
+          <w:b w:val="0"/>
+          <w:i w:val="0"/>
+        </w:rPr>
+        <w:t>) to the total experimental error variance.</w:t>
       </w:r>
     </w:p>
     <w:p>
@@ -4050,7 +4772,34 @@
           <w:b w:val="0"/>
           <w:i w:val="0"/>
         </w:rPr>
-        <w:t xml:space="preserve"> to second order gives the true infinitesimal period </w:t>
+        <w:t xml:space="preserve"> to second order relates the observed finite-amplitude period </w:t>
+      </w:r>
+      <m:oMath>
+        <m:r>
+          <m:t>T(</m:t>
+        </m:r>
+        <m:sSub>
+          <m:e>
+            <m:r>
+              <m:t>θ</m:t>
+            </m:r>
+          </m:e>
+          <m:sub>
+            <m:r>
+              <m:t>0</m:t>
+            </m:r>
+          </m:sub>
+        </m:sSub>
+        <m:r>
+          <m:t>)</m:t>
+        </m:r>
+      </m:oMath>
+      <w:r>
+        <w:rPr>
+          <w:b w:val="0"/>
+          <w:i w:val="0"/>
+        </w:rPr>
+        <w:t xml:space="preserve"> to the infinitesimal period </w:t>
       </w:r>
       <m:oMath>
         <m:sSub>
@@ -4258,7 +5007,7 @@
           <w:b w:val="0"/>
           <w:i w:val="0"/>
         </w:rPr>
-        <w:t>Inverting this expression yields the Borda circular correction applied to each observed cycle:</w:t>
+        <w:t>Inverting this expression yields the per-cycle Borda circular correction:</w:t>
       </w:r>
     </w:p>
     <w:p>
@@ -4470,7 +5219,25 @@
           <w:b w:val="0"/>
           <w:i w:val="0"/>
         </w:rPr>
-        <w:t xml:space="preserve">), which corresponds to a non-negligible shift of </w:t>
+        <w:t xml:space="preserve">), which shifts a </w:t>
+      </w:r>
+      <m:oMath>
+        <m:r>
+          <m:t>1.7</m:t>
+        </m:r>
+        <m:r>
+          <m:rPr>
+            <m:nor/>
+          </m:rPr>
+          <m:t>-second</m:t>
+        </m:r>
+      </m:oMath>
+      <w:r>
+        <w:rPr>
+          <w:b w:val="0"/>
+          <w:i w:val="0"/>
+        </w:rPr>
+        <w:t xml:space="preserve"> period by </w:t>
       </w:r>
       <m:oMath>
         <m:r>
@@ -4488,25 +5255,7 @@
           <w:b w:val="0"/>
           <w:i w:val="0"/>
         </w:rPr>
-        <w:t xml:space="preserve"> on a </w:t>
-      </w:r>
-      <m:oMath>
-        <m:r>
-          <m:t>1.7</m:t>
-        </m:r>
-        <m:r>
-          <m:rPr>
-            <m:nor/>
-          </m:rPr>
-          <m:t>-second</m:t>
-        </m:r>
-      </m:oMath>
-      <w:r>
-        <w:rPr>
-          <w:b w:val="0"/>
-          <w:i w:val="0"/>
-        </w:rPr>
-        <w:t xml:space="preserve"> period.</w:t>
+        <w:t>.</w:t>
       </w:r>
     </w:p>
     <w:p>
@@ -4538,7 +5287,31 @@
           <w:b w:val="0"/>
           <w:i w:val="0"/>
         </w:rPr>
-        <w:t>Under linear aerodynamic drag and knife-edge friction, the governing differential equation becomes:</w:t>
+        <w:t>Over small angular displacements (</w:t>
+      </w:r>
+      <m:oMath>
+        <m:r>
+          <m:t>θ&lt;</m:t>
+        </m:r>
+        <m:sSup>
+          <m:e>
+            <m:r>
+              <m:t>10</m:t>
+            </m:r>
+          </m:e>
+          <m:sup>
+            <m:r>
+              <m:t>∘</m:t>
+            </m:r>
+          </m:sup>
+        </m:sSup>
+      </m:oMath>
+      <w:r>
+        <w:rPr>
+          <w:b w:val="0"/>
+          <w:i w:val="0"/>
+        </w:rPr>
+        <w:t>), aerodynamic drag and knife-edge friction are well approximated by a linear damping term:</w:t>
       </w:r>
     </w:p>
     <w:p>
@@ -4921,11 +5694,11 @@
           <w:b w:val="0"/>
           <w:i w:val="0"/>
         </w:rPr>
-        <w:t xml:space="preserve"> Hardened carbon steel triangular wedge knife edges facing inward toward each other, securely clamped at an exact separation of </w:t>
+        <w:t xml:space="preserve"> Hardened carbon steel triangular wedge knife edges facing inward toward each other, securely clamped at a nominal separation of </w:t>
       </w:r>
       <m:oMath>
         <m:r>
-          <m:t>L=1.0000±0.0005</m:t>
+          <m:t>L=1.0000</m:t>
         </m:r>
         <m:r>
           <m:rPr>
@@ -4939,7 +5712,43 @@
           <w:b w:val="0"/>
           <w:i w:val="0"/>
         </w:rPr>
-        <w:t>.</w:t>
+        <w:t xml:space="preserve"> with measurement uncertainty </w:t>
+      </w:r>
+      <m:oMath>
+        <m:r>
+          <m:t>±0.5</m:t>
+        </m:r>
+        <m:r>
+          <m:rPr>
+            <m:nor/>
+          </m:rPr>
+          <m:t> mm</m:t>
+        </m:r>
+      </m:oMath>
+      <w:r>
+        <w:rPr>
+          <w:b w:val="0"/>
+          <w:i w:val="0"/>
+        </w:rPr>
+        <w:t xml:space="preserve"> (</w:t>
+      </w:r>
+      <m:oMath>
+        <m:r>
+          <m:t>L=1.0000±0.0005</m:t>
+        </m:r>
+        <m:r>
+          <m:rPr>
+            <m:nor/>
+          </m:rPr>
+          <m:t> m</m:t>
+        </m:r>
+      </m:oMath>
+      <w:r>
+        <w:rPr>
+          <w:b w:val="0"/>
+          <w:i w:val="0"/>
+        </w:rPr>
+        <w:t>).</w:t>
       </w:r>
     </w:p>
     <w:p>
@@ -4978,7 +5787,7 @@
           <w:b w:val="0"/>
           <w:i w:val="0"/>
         </w:rPr>
-        <w:t>Light Bob (≈ 0.5 kg) mounted near Knife Edge 2.</w:t>
+        <w:t>Light Bob (≈ 0.5 kg) clamped near Knife Edge 2.</w:t>
       </w:r>
     </w:p>
     <w:p>
@@ -4998,7 +5807,7 @@
           <w:b w:val="0"/>
           <w:i w:val="0"/>
         </w:rPr>
-        <w:t xml:space="preserve"> The center of mass of the assembled rod was determined by horizontal knife-edge balance balancing, establishing:</w:t>
+        <w:t xml:space="preserve"> The center of mass of the assembled rod was determined by horizontal knife-edge balancing, establishing:</w:t>
       </w:r>
     </w:p>
     <w:p>
@@ -5123,6 +5932,31 @@
           <m:t> m</m:t>
         </m:r>
       </m:oMath>
+      <w:r>
+        <w:rPr>
+          <w:b w:val="0"/>
+          <w:i w:val="0"/>
+        </w:rPr>
+        <w:t xml:space="preserve"> (combined in quadrature from individual </w:t>
+      </w:r>
+      <m:oMath>
+        <m:r>
+          <m:t>±1.0</m:t>
+        </m:r>
+        <m:r>
+          <m:rPr>
+            <m:nor/>
+          </m:rPr>
+          <m:t> mm</m:t>
+        </m:r>
+      </m:oMath>
+      <w:r>
+        <w:rPr>
+          <w:b w:val="0"/>
+          <w:i w:val="0"/>
+        </w:rPr>
+        <w:t xml:space="preserve"> balance line measurements).</w:t>
+      </w:r>
     </w:p>
     <w:p>
       <w:pPr>
@@ -5171,7 +6005,7 @@
           <w:b w:val="0"/>
           <w:i w:val="0"/>
         </w:rPr>
-        <w:t>To avoid external mechanical damping and physical wire tether torques, an ultra-low-profile telemetry module was mounted directly along the rod axis:</w:t>
+        <w:t>To minimize parasitic external restoring torques, an ultra-low-profile telemetry module is mounted along the rod axis and connected via a lightweight, highly flexible strain-relieved USB cable exiting directly along the knife-edge pivot axis:</w:t>
       </w:r>
     </w:p>
     <w:p>
@@ -5191,7 +6025,7 @@
           <w:b w:val="0"/>
           <w:i w:val="0"/>
         </w:rPr>
-        <w:t xml:space="preserve"> ESP8266/ESP32 running a high-frequency polling ISR.</w:t>
+        <w:t xml:space="preserve"> ESP8266 controller running a hardware timer-driven ISR.</w:t>
       </w:r>
     </w:p>
     <w:p>
@@ -5276,7 +6110,7 @@
           <w:b w:val="0"/>
           <w:i w:val="0"/>
         </w:rPr>
-        <w:t xml:space="preserve"> Continuous </w:t>
+        <w:t xml:space="preserve"> Continuous streaming at a nominal </w:t>
       </w:r>
       <m:oMath>
         <m:r>
@@ -5294,11 +6128,11 @@
           <w:b w:val="0"/>
           <w:i w:val="0"/>
         </w:rPr>
-        <w:t xml:space="preserve"> (</w:t>
+        <w:t xml:space="preserve"> rate (mean hardware interval </w:t>
       </w:r>
       <m:oMath>
         <m:r>
-          <m:t>Δt=10.0</m:t>
+          <m:t>Δt=10.15</m:t>
         </m:r>
         <m:r>
           <m:rPr>
@@ -5312,7 +6146,25 @@
           <w:b w:val="0"/>
           <w:i w:val="0"/>
         </w:rPr>
-        <w:t xml:space="preserve">) hardware-timed streaming via USB-UART serial at </w:t>
+        <w:t xml:space="preserve">, effective acquisition rate </w:t>
+      </w:r>
+      <m:oMath>
+        <m:r>
+          <m:t>98.5</m:t>
+        </m:r>
+        <m:r>
+          <m:rPr>
+            <m:nor/>
+          </m:rPr>
+          <m:t> Hz</m:t>
+        </m:r>
+      </m:oMath>
+      <w:r>
+        <w:rPr>
+          <w:b w:val="0"/>
+          <w:i w:val="0"/>
+        </w:rPr>
+        <w:t xml:space="preserve">) via USB-UART serial at </w:t>
       </w:r>
       <m:oMath>
         <m:r>
@@ -5379,7 +6231,7 @@
         <w:br/>
         <w:t>|                     ESP8266 CONTROLLER                      |</w:t>
         <w:br/>
-        <w:t>|  - 100 Hz Hardware Tick ISR                                 |</w:t>
+        <w:t>|  - Timer-Driven Hardware ISR                                |</w:t>
         <w:br/>
         <w:t>|  - Microsecond Timestamps (micros())                        |</w:t>
         <w:br/>
@@ -5466,7 +6318,7 @@
           <w:b w:val="0"/>
           <w:i w:val="0"/>
         </w:rPr>
-        <w:t xml:space="preserve">, exact turning-point timestamps </w:t>
+        <w:t xml:space="preserve">, sub-sample turning-point timestamps </w:t>
       </w:r>
       <m:oMath>
         <m:sSub>
@@ -5490,7 +6342,7 @@
           <w:b w:val="0"/>
           <w:i w:val="0"/>
         </w:rPr>
-        <w:t xml:space="preserve"> are recovered via linear sub-sample interpolation:</w:t>
+        <w:t xml:space="preserve"> are recovered via linear interpolation:</w:t>
       </w:r>
     </w:p>
     <w:p>
@@ -5626,31 +6478,7 @@
           <w:b w:val="0"/>
           <w:i w:val="0"/>
         </w:rPr>
-        <w:t>By taking the difference between alternate crossings of identical direction (</w:t>
-      </w:r>
-      <m:oMath>
-        <m:r>
-          <m:rPr>
-            <m:nor/>
-          </m:rPr>
-          <m:t>left</m:t>
-        </m:r>
-        <m:r>
-          <m:t>→</m:t>
-        </m:r>
-        <m:r>
-          <m:rPr>
-            <m:nor/>
-          </m:rPr>
-          <m:t>right</m:t>
-        </m:r>
-      </m:oMath>
-      <w:r>
-        <w:rPr>
-          <w:b w:val="0"/>
-          <w:i w:val="0"/>
-        </w:rPr>
-        <w:t xml:space="preserve">), we obtain the full period </w:t>
+        <w:t xml:space="preserve">By evaluating the elapsed time between alternate zero-crossings with identical slope (e.g. positive-going crossings, corresponding to successive identical turning points), we obtain the full period </w:t>
       </w:r>
       <m:oMath>
         <m:sSub>
@@ -5716,7 +6544,7 @@
           <w:b w:val="0"/>
           <w:i w:val="0"/>
         </w:rPr>
-        <w:t>. This eliminates systemic bias caused by any minute residual DC offsets in the gyroscope output.</w:t>
+        <w:t>. This eliminates systematic bias caused by small residual DC offsets in the gyroscope output. Fig. 1 shows the recorded kinematic waveforms and extracted zero crossings.</w:t>
       </w:r>
     </w:p>
     <w:p>
@@ -5809,7 +6637,7 @@
       </w:r>
       <m:oMath>
         <m:r>
-          <m:t>40</m:t>
+          <m:t>10</m:t>
         </m:r>
         <m:r>
           <m:rPr>
@@ -5824,7 +6652,45 @@
           <w:i w:val="0"/>
           <w:sz w:val="19"/>
         </w:rPr>
-        <w:t xml:space="preserve"> window under Pivot 1. Red circles highlight sub-sample zero-crossing turning points extracted to determine individual half-periods. (b) Simultaneous tri-axial linear acceleration telemetry (</w:t>
+        <w:t xml:space="preserve"> window under Pivot 1. Red circles highlight sub-sample zero-crossing points, each marking a half-period (</w:t>
+      </w:r>
+      <m:oMath>
+        <m:f>
+          <m:fPr>
+            <m:type m:val="lin"/>
+          </m:fPr>
+          <m:num>
+            <m:r>
+              <m:t>T</m:t>
+            </m:r>
+          </m:num>
+          <m:den>
+            <m:r>
+              <m:t>2</m:t>
+            </m:r>
+          </m:den>
+        </m:f>
+      </m:oMath>
+      <w:r>
+        <w:rPr>
+          <w:b w:val="0"/>
+          <w:i w:val="0"/>
+          <w:sz w:val="19"/>
+        </w:rPr>
+        <w:t xml:space="preserve">); alternate same-direction crossings yield the full period </w:t>
+      </w:r>
+      <m:oMath>
+        <m:r>
+          <m:t>T</m:t>
+        </m:r>
+      </m:oMath>
+      <w:r>
+        <w:rPr>
+          <w:b w:val="0"/>
+          <w:i w:val="0"/>
+          <w:sz w:val="19"/>
+        </w:rPr>
+        <w:t>. (b) Simultaneous tri-axial linear acceleration telemetry recorded by the onboard MPU-6050 IMU, showing centripetal acceleration modulation along the rod axis (</w:t>
       </w:r>
       <m:oMath>
         <m:sSub>
@@ -5835,37 +6701,10 @@
           </m:e>
           <m:sub>
             <m:r>
-              <m:t>x</m:t>
-            </m:r>
-          </m:sub>
-        </m:sSub>
-        <m:r>
-          <m:t>,</m:t>
-        </m:r>
-        <m:sSub>
-          <m:e>
-            <m:r>
-              <m:t>a</m:t>
-            </m:r>
-          </m:e>
-          <m:sub>
-            <m:r>
-              <m:t>y</m:t>
-            </m:r>
-          </m:sub>
-        </m:sSub>
-        <m:r>
-          <m:t>,</m:t>
-        </m:r>
-        <m:sSub>
-          <m:e>
-            <m:r>
-              <m:t>a</m:t>
-            </m:r>
-          </m:e>
-          <m:sub>
-            <m:r>
-              <m:t>z</m:t>
+              <m:rPr>
+                <m:nor/>
+              </m:rPr>
+              <m:t>rod</m:t>
             </m:r>
           </m:sub>
         </m:sSub>
@@ -5876,18 +6715,21 @@
           <w:i w:val="0"/>
           <w:sz w:val="19"/>
         </w:rPr>
-        <w:t>) recorded by the onboard MPU-6050 IMU, showing centripetal acceleration modulation along the rod axis (</w:t>
+        <w:t>) at twice the fundamental swing frequency (</w:t>
       </w:r>
       <m:oMath>
+        <m:r>
+          <m:t>2</m:t>
+        </m:r>
         <m:sSub>
           <m:e>
             <m:r>
-              <m:t>a</m:t>
+              <m:t>ω</m:t>
             </m:r>
           </m:e>
           <m:sub>
             <m:r>
-              <m:t>y</m:t>
+              <m:t>0</m:t>
             </m:r>
           </m:sub>
         </m:sSub>
@@ -5898,7 +6740,7 @@
           <w:i w:val="0"/>
           <w:sz w:val="19"/>
         </w:rPr>
-        <w:t>) at twice the fundamental swing frequency.</w:t>
+        <w:t>).</w:t>
       </w:r>
     </w:p>
     <w:p>
@@ -5925,7 +6767,7 @@
           <w:b w:val="0"/>
           <w:i w:val="0"/>
         </w:rPr>
-        <w:t>During laboratory testing, two prominent anomalies were encountered in initial software builds. Because understanding these artifacts is essential to ensuring experimental integrity, we provide a complete engineering and mathematical post-mortem.</w:t>
+        <w:t>During laboratory testing, three prominent anomalies were encountered in initial software builds. Because understanding these artifacts is essential to ensuring experimental integrity, we provide a complete engineering and mathematical post-mortem. Fig. 3 illustrates the diagnostic signatures of these anomalies.</w:t>
       </w:r>
     </w:p>
     <w:p>
@@ -5939,11 +6781,20 @@
           <w:i w:val="0"/>
           <w:sz w:val="23"/>
         </w:rPr>
-        <w:t>4.1 Post-Mortem I: The "</w:t>
+        <w:t xml:space="preserve">4.1 Post-Mortem I: The </w:t>
       </w:r>
       <m:oMath>
         <m:r>
-          <m:t>g≈13.9</m:t>
+          <m:t>g≈13.2</m:t>
+        </m:r>
+        <m:r>
+          <m:rPr>
+            <m:nor/>
+          </m:rPr>
+          <m:t>--</m:t>
+        </m:r>
+        <m:r>
+          <m:t>13.8</m:t>
         </m:r>
         <m:sSup>
           <m:e>
@@ -5967,7 +6818,7 @@
           <w:i w:val="0"/>
           <w:sz w:val="23"/>
         </w:rPr>
-        <w:t>" Naive Symmetric Formulation Artifact</w:t>
+        <w:t xml:space="preserve"> Naive Symmetric Formulation Artifact</w:t>
       </w:r>
     </w:p>
     <w:p>
@@ -6037,7 +6888,7 @@
       </w:r>
       <m:oMath>
         <m:r>
-          <m:t>13.9</m:t>
+          <m:t>13.8</m:t>
         </m:r>
         <m:sSup>
           <m:e>
@@ -6060,7 +6911,7 @@
           <w:b w:val="0"/>
           <w:i w:val="0"/>
         </w:rPr>
-        <w:t>, despite raw waveforms displaying textbook sinusoidal motion.</w:t>
+        <w:t>, despite raw waveforms displaying clean sinusoidal motion.</w:t>
       </w:r>
     </w:p>
     <w:p>
@@ -6694,7 +7545,7 @@
       </w:r>
       <m:oMath>
         <m:r>
-          <m:t>13.81</m:t>
+          <m:t>13.82</m:t>
         </m:r>
         <m:sSup>
           <m:e>
@@ -6744,7 +7595,7 @@
           <w:b w:val="0"/>
           <w:i w:val="0"/>
         </w:rPr>
-        <w:t xml:space="preserve"> without altering a single raw sensor byte.</w:t>
+        <w:t xml:space="preserve"> without altering the underlying sensor data.</w:t>
       </w:r>
     </w:p>
     <w:p>
@@ -6758,7 +7609,7 @@
           <w:i w:val="0"/>
           <w:sz w:val="23"/>
         </w:rPr>
-        <w:t>4.2 Post-Mortem II: The "</w:t>
+        <w:t xml:space="preserve">4.2 Post-Mortem II: The </w:t>
       </w:r>
       <m:oMath>
         <m:r>
@@ -6786,7 +7637,7 @@
           <w:i w:val="0"/>
           <w:sz w:val="23"/>
         </w:rPr>
-        <w:t>" Low-Amplitude Tail Artifact</w:t>
+        <w:t xml:space="preserve"> Low-Amplitude Tail Artifact</w:t>
       </w:r>
     </w:p>
     <w:p>
@@ -6813,7 +7664,7 @@
           <w:b w:val="0"/>
           <w:i w:val="0"/>
         </w:rPr>
-        <w:t xml:space="preserve">During the session on October 17, 2026, the application output </w:t>
+        <w:t xml:space="preserve">During the live trial on October 17, 2026, the application output </w:t>
       </w:r>
       <m:oMath>
         <m:r>
@@ -6840,11 +7691,11 @@
           <w:b w:val="0"/>
           <w:i w:val="0"/>
         </w:rPr>
-        <w:t xml:space="preserve"> with an error of </w:t>
+        <w:t xml:space="preserve"> with a relative discrepancy of </w:t>
       </w:r>
       <m:oMath>
         <m:r>
-          <m:t>50.87%</m:t>
+          <m:t>−50.87%</m:t>
         </m:r>
       </m:oMath>
       <w:r>
@@ -6894,7 +7745,7 @@
           <w:b w:val="0"/>
           <w:i w:val="0"/>
         </w:rPr>
-        <w:t xml:space="preserve">) revealed that the trial had run continuously for </w:t>
+        <w:t xml:space="preserve">) revealed that the trial had run for </w:t>
       </w:r>
       <m:oMath>
         <m:r>
@@ -6930,46 +7781,43 @@
           <w:b w:val="0"/>
           <w:i w:val="0"/>
         </w:rPr>
-        <w:t xml:space="preserve">). Over this three-minute duration, the pendulum amplitude decayed naturally down to </w:t>
+        <w:t xml:space="preserve">, mean interval </w:t>
       </w:r>
       <m:oMath>
-        <m:sSub>
-          <m:e>
-            <m:r>
-              <m:t>θ</m:t>
-            </m:r>
-          </m:e>
-          <m:sub>
-            <m:r>
-              <m:rPr>
-                <m:nor/>
-              </m:rPr>
-              <m:t>end</m:t>
-            </m:r>
-          </m:sub>
-        </m:sSub>
-        <m:r>
-          <m:t>=</m:t>
-        </m:r>
-        <m:sSup>
-          <m:e>
-            <m:r>
-              <m:t>0.57</m:t>
-            </m:r>
-          </m:e>
-          <m:sup>
-            <m:r>
-              <m:t>∘</m:t>
-            </m:r>
-          </m:sup>
-        </m:sSup>
+        <m:r>
+          <m:t>Δt=10.15</m:t>
+        </m:r>
+        <m:r>
+          <m:rPr>
+            <m:nor/>
+          </m:rPr>
+          <m:t> ms</m:t>
+        </m:r>
       </m:oMath>
       <w:r>
         <w:rPr>
           <w:b w:val="0"/>
           <w:i w:val="0"/>
         </w:rPr>
-        <w:t>.</w:t>
+        <w:t xml:space="preserve">, effective rate </w:t>
+      </w:r>
+      <m:oMath>
+        <m:r>
+          <m:t>98.5</m:t>
+        </m:r>
+        <m:r>
+          <m:rPr>
+            <m:nor/>
+          </m:rPr>
+          <m:t> Hz</m:t>
+        </m:r>
+      </m:oMath>
+      <w:r>
+        <w:rPr>
+          <w:b w:val="0"/>
+          <w:i w:val="0"/>
+        </w:rPr>
+        <w:t>).</w:t>
       </w:r>
     </w:p>
     <w:p>
@@ -6982,12 +7830,48 @@
           <w:b w:val="0"/>
           <w:i w:val="0"/>
         </w:rPr>
-        <w:t xml:space="preserve">The angular velocity threshold for valid turning-point detection was hardcoded to </w:t>
+        <w:t xml:space="preserve">The trial began with a small initial release amplitude of </w:t>
       </w:r>
       <m:oMath>
         <m:sSub>
           <m:e>
             <m:r>
+              <m:t>θ</m:t>
+            </m:r>
+          </m:e>
+          <m:sub>
+            <m:r>
+              <m:t>0</m:t>
+            </m:r>
+          </m:sub>
+        </m:sSub>
+        <m:r>
+          <m:t>≈</m:t>
+        </m:r>
+        <m:sSup>
+          <m:e>
+            <m:r>
+              <m:t>0.96</m:t>
+            </m:r>
+          </m:e>
+          <m:sup>
+            <m:r>
+              <m:t>∘</m:t>
+            </m:r>
+          </m:sup>
+        </m:sSup>
+      </m:oMath>
+      <w:r>
+        <w:rPr>
+          <w:b w:val="0"/>
+          <w:i w:val="0"/>
+        </w:rPr>
+        <w:t xml:space="preserve">, giving an initial peak angular velocity of </w:t>
+      </w:r>
+      <m:oMath>
+        <m:sSub>
+          <m:e>
+            <m:r>
               <m:t>ω</m:t>
             </m:r>
           </m:e>
@@ -6996,17 +7880,56 @@
               <m:rPr>
                 <m:nor/>
               </m:rPr>
-              <m:t>peak, min</m:t>
+              <m:t>peak</m:t>
             </m:r>
           </m:sub>
         </m:sSub>
         <m:r>
-          <m:t>=</m:t>
+          <m:t>≈</m:t>
         </m:r>
         <m:sSup>
           <m:e>
             <m:r>
-              <m:t>3.0</m:t>
+              <m:t>0.96</m:t>
+            </m:r>
+          </m:e>
+          <m:sup>
+            <m:r>
+              <m:t>∘</m:t>
+            </m:r>
+          </m:sup>
+        </m:sSup>
+        <m:r>
+          <m:t>×</m:t>
+        </m:r>
+        <m:f>
+          <m:fPr>
+            <m:type m:val="bar"/>
+          </m:fPr>
+          <m:num>
+            <m:r>
+              <m:t>2π</m:t>
+            </m:r>
+          </m:num>
+          <m:den>
+            <m:r>
+              <m:t>1.772</m:t>
+            </m:r>
+            <m:r>
+              <m:rPr>
+                <m:nor/>
+              </m:rPr>
+              <m:t> s</m:t>
+            </m:r>
+          </m:den>
+        </m:f>
+        <m:r>
+          <m:t>≈</m:t>
+        </m:r>
+        <m:sSup>
+          <m:e>
+            <m:r>
+              <m:t>3.4</m:t>
             </m:r>
           </m:e>
           <m:sup>
@@ -7030,25 +7953,7 @@
           <w:b w:val="0"/>
           <w:i w:val="0"/>
         </w:rPr>
-        <w:t xml:space="preserve"> (</w:t>
-      </w:r>
-      <m:oMath>
-        <m:r>
-          <m:t>0.0524</m:t>
-        </m:r>
-        <m:r>
-          <m:rPr>
-            <m:nor/>
-          </m:rPr>
-          <m:t> rad/s</m:t>
-        </m:r>
-      </m:oMath>
-      <w:r>
-        <w:rPr>
-          <w:b w:val="0"/>
-          <w:i w:val="0"/>
-        </w:rPr>
-        <w:t>).</w:t>
+        <w:t>.</w:t>
       </w:r>
     </w:p>
     <w:p>
@@ -7061,18 +7966,21 @@
           <w:b w:val="0"/>
           <w:i w:val="0"/>
         </w:rPr>
-        <w:t xml:space="preserve">For an oscillation of amplitude </w:t>
+        <w:t xml:space="preserve">The angular velocity threshold for turning-point detection was hardcoded to a fixed value of </w:t>
       </w:r>
       <m:oMath>
         <m:sSub>
           <m:e>
             <m:r>
-              <m:t>θ</m:t>
+              <m:t>ω</m:t>
             </m:r>
           </m:e>
           <m:sub>
             <m:r>
-              <m:t>0</m:t>
+              <m:rPr>
+                <m:nor/>
+              </m:rPr>
+              <m:t>peak, min</m:t>
             </m:r>
           </m:sub>
         </m:sSub>
@@ -7082,7 +7990,7 @@
         <m:sSup>
           <m:e>
             <m:r>
-              <m:t>0.57</m:t>
+              <m:t>3.0</m:t>
             </m:r>
           </m:e>
           <m:sup>
@@ -7091,17 +7999,57 @@
             </m:r>
           </m:sup>
         </m:sSup>
+        <m:r>
+          <m:t>/</m:t>
+        </m:r>
+        <m:r>
+          <m:rPr>
+            <m:nor/>
+          </m:rPr>
+          <m:t>s</m:t>
+        </m:r>
       </m:oMath>
       <w:r>
         <w:rPr>
           <w:b w:val="0"/>
           <w:i w:val="0"/>
         </w:rPr>
-        <w:t xml:space="preserve"> and period </w:t>
+        <w:t xml:space="preserve"> (</w:t>
       </w:r>
       <m:oMath>
         <m:r>
-          <m:t>T≈1.77</m:t>
+          <m:t>0.0524</m:t>
+        </m:r>
+        <m:r>
+          <m:rPr>
+            <m:nor/>
+          </m:rPr>
+          <m:t> rad/s</m:t>
+        </m:r>
+      </m:oMath>
+      <w:r>
+        <w:rPr>
+          <w:b w:val="0"/>
+          <w:i w:val="0"/>
+        </w:rPr>
+        <w:t>).</w:t>
+      </w:r>
+    </w:p>
+    <w:p>
+      <w:pPr>
+        <w:pStyle w:val="ListNumber"/>
+        <w:spacing w:before="20" w:after="40" w:line="276" w:lineRule="auto"/>
+      </w:pPr>
+      <w:r>
+        <w:rPr>
+          <w:b w:val="0"/>
+          <w:i w:val="0"/>
+        </w:rPr>
+        <w:t>Within 18 oscillations (</w:t>
+      </w:r>
+      <m:oMath>
+        <m:r>
+          <m:t>≈32</m:t>
         </m:r>
         <m:r>
           <m:rPr>
@@ -7115,7 +8063,282 @@
           <w:b w:val="0"/>
           <w:i w:val="0"/>
         </w:rPr>
-        <w:t>, the peak angular speed is:</w:t>
+        <w:t xml:space="preserve">), natural damping reduced the peak amplitude below </w:t>
+      </w:r>
+      <m:oMath>
+        <m:r>
+          <m:t>≈</m:t>
+        </m:r>
+        <m:sSup>
+          <m:e>
+            <m:r>
+              <m:t>0.85</m:t>
+            </m:r>
+          </m:e>
+          <m:sup>
+            <m:r>
+              <m:t>∘</m:t>
+            </m:r>
+          </m:sup>
+        </m:sSup>
+      </m:oMath>
+      <w:r>
+        <w:rPr>
+          <w:b w:val="0"/>
+          <w:i w:val="0"/>
+        </w:rPr>
+        <w:t xml:space="preserve">, dropping peak angular velocity below </w:t>
+      </w:r>
+      <m:oMath>
+        <m:f>
+          <m:fPr>
+            <m:type m:val="lin"/>
+          </m:fPr>
+          <m:num>
+            <m:sSup>
+              <m:e>
+                <m:r>
+                  <m:t>3.0</m:t>
+                </m:r>
+              </m:e>
+              <m:sup>
+                <m:r>
+                  <m:t>∘</m:t>
+                </m:r>
+              </m:sup>
+            </m:sSup>
+          </m:num>
+          <m:den>
+            <m:r>
+              <m:rPr>
+                <m:nor/>
+              </m:rPr>
+              <m:t>s</m:t>
+            </m:r>
+          </m:den>
+        </m:f>
+      </m:oMath>
+      <w:r>
+        <w:rPr>
+          <w:b w:val="0"/>
+          <w:i w:val="0"/>
+        </w:rPr>
+        <w:t>.</w:t>
+      </w:r>
+    </w:p>
+    <w:p>
+      <w:pPr>
+        <w:pStyle w:val="ListNumber"/>
+        <w:spacing w:before="20" w:after="40" w:line="276" w:lineRule="auto"/>
+      </w:pPr>
+      <w:r>
+        <w:rPr>
+          <w:b w:val="0"/>
+          <w:i w:val="0"/>
+        </w:rPr>
+        <w:t xml:space="preserve">At cycle 19, the swing decayed to </w:t>
+      </w:r>
+      <m:oMath>
+        <m:r>
+          <m:t>≈</m:t>
+        </m:r>
+        <m:sSup>
+          <m:e>
+            <m:r>
+              <m:t>0.58</m:t>
+            </m:r>
+          </m:e>
+          <m:sup>
+            <m:r>
+              <m:t>∘</m:t>
+            </m:r>
+          </m:sup>
+        </m:sSup>
+      </m:oMath>
+      <w:r>
+        <w:rPr>
+          <w:b w:val="0"/>
+          <w:i w:val="0"/>
+        </w:rPr>
+        <w:t xml:space="preserve">, where peak speed fell to </w:t>
+      </w:r>
+      <m:oMath>
+        <m:sSub>
+          <m:e>
+            <m:r>
+              <m:t>ω</m:t>
+            </m:r>
+          </m:e>
+          <m:sub>
+            <m:r>
+              <m:rPr>
+                <m:nor/>
+              </m:rPr>
+              <m:t>peak</m:t>
+            </m:r>
+          </m:sub>
+        </m:sSub>
+        <m:r>
+          <m:t>≈</m:t>
+        </m:r>
+        <m:sSup>
+          <m:e>
+            <m:r>
+              <m:t>0.58</m:t>
+            </m:r>
+          </m:e>
+          <m:sup>
+            <m:r>
+              <m:t>∘</m:t>
+            </m:r>
+          </m:sup>
+        </m:sSup>
+        <m:r>
+          <m:t>×</m:t>
+        </m:r>
+        <m:f>
+          <m:fPr>
+            <m:type m:val="bar"/>
+          </m:fPr>
+          <m:num>
+            <m:r>
+              <m:t>2π</m:t>
+            </m:r>
+          </m:num>
+          <m:den>
+            <m:r>
+              <m:t>1.772</m:t>
+            </m:r>
+            <m:r>
+              <m:rPr>
+                <m:nor/>
+              </m:rPr>
+              <m:t> s</m:t>
+            </m:r>
+          </m:den>
+        </m:f>
+        <m:r>
+          <m:t>≈</m:t>
+        </m:r>
+        <m:sSup>
+          <m:e>
+            <m:r>
+              <m:t>2.06</m:t>
+            </m:r>
+          </m:e>
+          <m:sup>
+            <m:r>
+              <m:t>∘</m:t>
+            </m:r>
+          </m:sup>
+        </m:sSup>
+        <m:r>
+          <m:t>/</m:t>
+        </m:r>
+        <m:r>
+          <m:rPr>
+            <m:nor/>
+          </m:rPr>
+          <m:t>s</m:t>
+        </m:r>
+        <m:r>
+          <m:t>&lt;</m:t>
+        </m:r>
+        <m:sSup>
+          <m:e>
+            <m:r>
+              <m:t>3.0</m:t>
+            </m:r>
+          </m:e>
+          <m:sup>
+            <m:r>
+              <m:t>∘</m:t>
+            </m:r>
+          </m:sup>
+        </m:sSup>
+        <m:r>
+          <m:t>/</m:t>
+        </m:r>
+        <m:r>
+          <m:rPr>
+            <m:nor/>
+          </m:rPr>
+          <m:t>s</m:t>
+        </m:r>
+      </m:oMath>
+      <w:r>
+        <w:rPr>
+          <w:b w:val="0"/>
+          <w:i w:val="0"/>
+        </w:rPr>
+        <w:t>.</w:t>
+      </w:r>
+    </w:p>
+    <w:p>
+      <w:pPr>
+        <w:pStyle w:val="ListNumber"/>
+        <w:spacing w:before="20" w:after="40" w:line="276" w:lineRule="auto"/>
+      </w:pPr>
+      <w:r>
+        <w:rPr>
+          <w:b w:val="0"/>
+          <w:i w:val="0"/>
+        </w:rPr>
+        <w:t xml:space="preserve">Consequently, the zero-crossing detector failed to register subsequent velocity reversals. It missed one reversal (logging a doubled period of </w:t>
+      </w:r>
+      <m:oMath>
+        <m:r>
+          <m:t>3.55</m:t>
+        </m:r>
+        <m:r>
+          <m:rPr>
+            <m:nor/>
+          </m:rPr>
+          <m:t> s</m:t>
+        </m:r>
+      </m:oMath>
+      <w:r>
+        <w:rPr>
+          <w:b w:val="0"/>
+          <w:i w:val="0"/>
+        </w:rPr>
+        <w:t xml:space="preserve">) and then two reversals (logging a tripled period of </w:t>
+      </w:r>
+      <m:oMath>
+        <m:r>
+          <m:t>5.32</m:t>
+        </m:r>
+        <m:r>
+          <m:rPr>
+            <m:nor/>
+          </m:rPr>
+          <m:t> s</m:t>
+        </m:r>
+      </m:oMath>
+      <w:r>
+        <w:rPr>
+          <w:b w:val="0"/>
+          <w:i w:val="0"/>
+        </w:rPr>
+        <w:t xml:space="preserve">), before detections ceased entirely at </w:t>
+      </w:r>
+      <m:oMath>
+        <m:r>
+          <m:t>t≈36</m:t>
+        </m:r>
+        <m:r>
+          <m:rPr>
+            <m:nor/>
+          </m:rPr>
+          <m:t> s</m:t>
+        </m:r>
+      </m:oMath>
+      <w:r>
+        <w:rPr>
+          <w:b w:val="0"/>
+          <w:i w:val="0"/>
+        </w:rPr>
+        <w:t>:</w:t>
       </w:r>
     </w:p>
     <w:p>
@@ -7124,225 +8347,6 @@
         <w:jc w:val="center"/>
       </w:pPr>
       <m:oMath>
-        <m:sSub>
-          <m:e>
-            <m:r>
-              <m:t>ω</m:t>
-            </m:r>
-          </m:e>
-          <m:sub>
-            <m:r>
-              <m:rPr>
-                <m:nor/>
-              </m:rPr>
-              <m:t>peak</m:t>
-            </m:r>
-          </m:sub>
-        </m:sSub>
-        <m:r>
-          <m:t>=</m:t>
-        </m:r>
-        <m:sSub>
-          <m:e>
-            <m:r>
-              <m:t>θ</m:t>
-            </m:r>
-          </m:e>
-          <m:sub>
-            <m:r>
-              <m:t>0</m:t>
-            </m:r>
-          </m:sub>
-        </m:sSub>
-        <m:d>
-          <m:dPr>
-            <m:sepChr m:val=""/>
-          </m:dPr>
-          <m:e>
-            <m:f>
-              <m:fPr>
-                <m:type m:val="bar"/>
-              </m:fPr>
-              <m:num>
-                <m:r>
-                  <m:t>2π</m:t>
-                </m:r>
-              </m:num>
-              <m:den>
-                <m:r>
-                  <m:t>T</m:t>
-                </m:r>
-              </m:den>
-            </m:f>
-          </m:e>
-        </m:d>
-        <m:r>
-          <m:t>=</m:t>
-        </m:r>
-        <m:sSup>
-          <m:e>
-            <m:r>
-              <m:t>0.57</m:t>
-            </m:r>
-          </m:e>
-          <m:sup>
-            <m:r>
-              <m:t>∘</m:t>
-            </m:r>
-          </m:sup>
-        </m:sSup>
-        <m:r>
-          <m:t>×</m:t>
-        </m:r>
-        <m:d>
-          <m:dPr>
-            <m:sepChr m:val=""/>
-          </m:dPr>
-          <m:e>
-            <m:f>
-              <m:fPr>
-                <m:type m:val="bar"/>
-              </m:fPr>
-              <m:num>
-                <m:r>
-                  <m:t>2π</m:t>
-                </m:r>
-              </m:num>
-              <m:den>
-                <m:r>
-                  <m:t>1.77</m:t>
-                </m:r>
-              </m:den>
-            </m:f>
-          </m:e>
-        </m:d>
-        <m:r>
-          <m:t>=</m:t>
-        </m:r>
-        <m:sSup>
-          <m:e>
-            <m:r>
-              <m:t>2.02</m:t>
-            </m:r>
-          </m:e>
-          <m:sup>
-            <m:r>
-              <m:t>∘</m:t>
-            </m:r>
-          </m:sup>
-        </m:sSup>
-        <m:r>
-          <m:t>/</m:t>
-        </m:r>
-        <m:r>
-          <m:rPr>
-            <m:nor/>
-          </m:rPr>
-          <m:t>s</m:t>
-        </m:r>
-      </m:oMath>
-    </w:p>
-    <w:p>
-      <w:pPr>
-        <w:pStyle w:val="ListNumber"/>
-        <w:spacing w:before="20" w:after="40" w:line="276" w:lineRule="auto"/>
-      </w:pPr>
-      <w:r>
-        <w:rPr>
-          <w:b w:val="0"/>
-          <w:i w:val="0"/>
-        </w:rPr>
-        <w:t xml:space="preserve">Because </w:t>
-      </w:r>
-      <m:oMath>
-        <m:sSup>
-          <m:e>
-            <m:r>
-              <m:t>2.02</m:t>
-            </m:r>
-          </m:e>
-          <m:sup>
-            <m:r>
-              <m:t>∘</m:t>
-            </m:r>
-          </m:sup>
-        </m:sSup>
-        <m:r>
-          <m:t>/</m:t>
-        </m:r>
-        <m:r>
-          <m:rPr>
-            <m:nor/>
-          </m:rPr>
-          <m:t>s</m:t>
-        </m:r>
-        <m:r>
-          <m:t>&lt;</m:t>
-        </m:r>
-        <m:sSup>
-          <m:e>
-            <m:r>
-              <m:t>3.0</m:t>
-            </m:r>
-          </m:e>
-          <m:sup>
-            <m:r>
-              <m:t>∘</m:t>
-            </m:r>
-          </m:sup>
-        </m:sSup>
-        <m:r>
-          <m:t>/</m:t>
-        </m:r>
-        <m:r>
-          <m:rPr>
-            <m:nor/>
-          </m:rPr>
-          <m:t>s</m:t>
-        </m:r>
-      </m:oMath>
-      <w:r>
-        <w:rPr>
-          <w:b w:val="0"/>
-          <w:i w:val="0"/>
-        </w:rPr>
-        <w:t>, the zero-crossing detector failed to register reversals at the tail end of the run.</w:t>
-      </w:r>
-    </w:p>
-    <w:p>
-      <w:pPr>
-        <w:pStyle w:val="ListNumber"/>
-        <w:spacing w:before="20" w:after="40" w:line="276" w:lineRule="auto"/>
-      </w:pPr>
-      <w:r>
-        <w:rPr>
-          <w:b w:val="0"/>
-          <w:i w:val="0"/>
-        </w:rPr>
-        <w:t xml:space="preserve">Consequently, the period detection skipped one cycle and then two cycles, appending anomalous periods to </w:t>
-      </w:r>
-      <w:r>
-        <w:rPr>
-          <w:rFonts w:ascii="Consolas" w:hAnsi="Consolas"/>
-          <w:color w:val="282828"/>
-          <w:sz w:val="19"/>
-        </w:rPr>
-        <w:t>periods_gyro_all</w:t>
-      </w:r>
-      <w:r>
-        <w:rPr>
-          <w:b w:val="0"/>
-          <w:i w:val="0"/>
-        </w:rPr>
-        <w:t>:</w:t>
-      </w:r>
-    </w:p>
-    <w:p>
-      <w:pPr>
-        <w:spacing w:before="120" w:after="120"/>
-        <w:jc w:val="center"/>
-      </w:pPr>
-      <m:oMath>
         <m:r>
           <m:t>…,1.76966</m:t>
         </m:r>
@@ -7381,7 +8385,16 @@
           <m:rPr>
             <m:nor/>
           </m:rPr>
-          <m:t> (2\(\times\))</m:t>
+          <m:t> (</m:t>
+        </m:r>
+        <m:r>
+          <m:t>2×</m:t>
+        </m:r>
+        <m:r>
+          <m:rPr>
+            <m:nor/>
+          </m:rPr>
+          <m:t>)</m:t>
         </m:r>
         <m:r>
           <m:t>,</m:t>
@@ -7403,7 +8416,16 @@
           <m:rPr>
             <m:nor/>
           </m:rPr>
-          <m:t> (3\(\times\))</m:t>
+          <m:t> (</m:t>
+        </m:r>
+        <m:r>
+          <m:t>3×</m:t>
+        </m:r>
+        <m:r>
+          <m:rPr>
+            <m:nor/>
+          </m:rPr>
+          <m:t>)</m:t>
         </m:r>
       </m:oMath>
     </w:p>
@@ -7491,23 +8513,66 @@
           <w:b w:val="0"/>
           <w:i w:val="0"/>
         </w:rPr>
-        <w:t xml:space="preserve">Substituting </w:t>
+        <w:t xml:space="preserve">In Dataset 2, the true denominator in Bessel's formula is </w:t>
+      </w:r>
+      <m:oMath>
+        <m:r>
+          <m:t>8.14</m:t>
+        </m:r>
+        <m:sSup>
+          <m:e>
+            <m:r>
+              <m:rPr>
+                <m:nor/>
+              </m:rPr>
+              <m:t> s</m:t>
+            </m:r>
+          </m:e>
+          <m:sup>
+            <m:r>
+              <m:t>2</m:t>
+            </m:r>
+          </m:sup>
+        </m:sSup>
+        <m:r>
+          <m:t>/</m:t>
+        </m:r>
+        <m:r>
+          <m:rPr>
+            <m:nor/>
+          </m:rPr>
+          <m:t>m</m:t>
+        </m:r>
+      </m:oMath>
+      <w:r>
+        <w:rPr>
+          <w:b w:val="0"/>
+          <w:i w:val="0"/>
+        </w:rPr>
+        <w:t xml:space="preserve">. Substituting the skewed period </w:t>
       </w:r>
       <m:oMath>
         <m:sSub>
           <m:e>
-            <m:r>
-              <m:t>T</m:t>
-            </m:r>
+            <m:bar>
+              <m:barPr>
+                <m:pos m:val="top"/>
+              </m:barPr>
+              <m:e>
+                <m:r>
+                  <m:t>T</m:t>
+                </m:r>
+              </m:e>
+            </m:bar>
           </m:e>
           <m:sub>
             <m:r>
-              <m:t>1</m:t>
+              <m:t>2</m:t>
             </m:r>
           </m:sub>
         </m:sSub>
         <m:r>
-          <m:t>=1.6845</m:t>
+          <m:t>=2.0380</m:t>
         </m:r>
         <m:r>
           <m:rPr>
@@ -7521,7 +8586,7 @@
           <w:b w:val="0"/>
           <w:i w:val="0"/>
         </w:rPr>
-        <w:t xml:space="preserve"> and </w:t>
+        <w:t xml:space="preserve"> alongside </w:t>
       </w:r>
       <m:oMath>
         <m:sSub>
@@ -7532,12 +8597,12 @@
           </m:e>
           <m:sub>
             <m:r>
-              <m:t>2</m:t>
+              <m:t>1</m:t>
             </m:r>
           </m:sub>
         </m:sSub>
         <m:r>
-          <m:t>=2.0380</m:t>
+          <m:t>=1.6845</m:t>
         </m:r>
         <m:r>
           <m:rPr>
@@ -7551,7 +8616,7 @@
           <w:b w:val="0"/>
           <w:i w:val="0"/>
         </w:rPr>
-        <w:t xml:space="preserve"> into Bessel's formula produced a massive perturbation:</w:t>
+        <w:t xml:space="preserve"> produced a massive perturbation in the asymmetric term:</w:t>
       </w:r>
     </w:p>
     <w:p>
@@ -7715,6 +8780,38 @@
           </m:rPr>
           <m:t>+9.399</m:t>
         </m:r>
+        <m:sSup>
+          <m:e>
+            <m:r>
+              <m:rPr>
+                <m:nor/>
+                <m:sty m:val="b"/>
+              </m:rPr>
+              <m:t> s</m:t>
+            </m:r>
+          </m:e>
+          <m:sup>
+            <m:r>
+              <m:rPr>
+                <m:sty m:val="b"/>
+              </m:rPr>
+              <m:t>2</m:t>
+            </m:r>
+          </m:sup>
+        </m:sSup>
+        <m:r>
+          <m:rPr>
+            <m:sty m:val="b"/>
+          </m:rPr>
+          <m:t>/</m:t>
+        </m:r>
+        <m:r>
+          <m:rPr>
+            <m:nor/>
+            <m:sty m:val="b"/>
+          </m:rPr>
+          <m:t>m</m:t>
+        </m:r>
       </m:oMath>
     </w:p>
     <w:p>
@@ -7731,7 +8828,7 @@
       </w:r>
       <m:oMath>
         <m:r>
-          <m:t>8.05</m:t>
+          <m:t>8.14</m:t>
         </m:r>
       </m:oMath>
       <w:r>
@@ -7744,6 +8841,30 @@
       <m:oMath>
         <m:r>
           <m:t>16.39</m:t>
+        </m:r>
+        <m:sSup>
+          <m:e>
+            <m:r>
+              <m:rPr>
+                <m:nor/>
+              </m:rPr>
+              <m:t> s</m:t>
+            </m:r>
+          </m:e>
+          <m:sup>
+            <m:r>
+              <m:t>2</m:t>
+            </m:r>
+          </m:sup>
+        </m:sSup>
+        <m:r>
+          <m:t>/</m:t>
+        </m:r>
+        <m:r>
+          <m:rPr>
+            <m:nor/>
+          </m:rPr>
+          <m:t>m</m:t>
         </m:r>
       </m:oMath>
       <w:r>
@@ -7939,7 +9060,7 @@
           <w:b w:val="0"/>
           <w:i w:val="0"/>
         </w:rPr>
-        <w:t xml:space="preserve"> to </w:t>
+        <w:t xml:space="preserve"> to a fixed </w:t>
       </w:r>
       <m:oMath>
         <m:f>
@@ -7993,7 +9114,7 @@
           <w:b w:val="0"/>
           <w:i w:val="0"/>
         </w:rPr>
-        <w:t xml:space="preserve">), allowing clean tracking down to </w:t>
+        <w:t xml:space="preserve">), corresponding to an amplitude limit of </w:t>
       </w:r>
       <m:oMath>
         <m:sSub>
@@ -8004,13 +9125,67 @@
           </m:e>
           <m:sub>
             <m:r>
-              <m:t>0</m:t>
+              <m:rPr>
+                <m:nor/>
+              </m:rPr>
+              <m:t>min</m:t>
             </m:r>
           </m:sub>
         </m:sSub>
         <m:r>
           <m:t>≈</m:t>
         </m:r>
+        <m:f>
+          <m:fPr>
+            <m:type m:val="bar"/>
+          </m:fPr>
+          <m:num>
+            <m:sSup>
+              <m:e>
+                <m:r>
+                  <m:t>0.8</m:t>
+                </m:r>
+              </m:e>
+              <m:sup>
+                <m:r>
+                  <m:t>∘</m:t>
+                </m:r>
+              </m:sup>
+            </m:sSup>
+            <m:r>
+              <m:t>×1.77</m:t>
+            </m:r>
+          </m:num>
+          <m:den>
+            <m:r>
+              <m:t>2π</m:t>
+            </m:r>
+          </m:den>
+        </m:f>
+        <m:r>
+          <m:t>≈</m:t>
+        </m:r>
+        <m:sSup>
+          <m:e>
+            <m:r>
+              <m:t>0.23</m:t>
+            </m:r>
+          </m:e>
+          <m:sup>
+            <m:r>
+              <m:t>∘</m:t>
+            </m:r>
+          </m:sup>
+        </m:sSup>
+      </m:oMath>
+      <w:r>
+        <w:rPr>
+          <w:b w:val="0"/>
+          <w:i w:val="0"/>
+        </w:rPr>
+        <w:t xml:space="preserve">, allowing clean tracking down to </w:t>
+      </w:r>
+      <m:oMath>
         <m:sSup>
           <m:e>
             <m:r>
@@ -8067,7 +9242,7 @@
           <w:b w:val="0"/>
           <w:i w:val="0"/>
         </w:rPr>
-        <w:t xml:space="preserve"> pendulum (</w:t>
+        <w:t xml:space="preserve"> compound pendulum (</w:t>
       </w:r>
       <m:oMath>
         <m:r>
@@ -8129,11 +9304,11 @@
           <w:b w:val="0"/>
           <w:i w:val="0"/>
         </w:rPr>
-        <w:t xml:space="preserve">, periods deviating by more than </w:t>
+        <w:t xml:space="preserve">, periods deviating by </w:t>
       </w:r>
       <m:oMath>
         <m:r>
-          <m:t>18%</m:t>
+          <m:t>≥18%</m:t>
         </m:r>
       </m:oMath>
       <w:r>
@@ -8291,7 +9466,7 @@
           <w:i w:val="0"/>
           <w:sz w:val="23"/>
         </w:rPr>
-        <w:t>4.3 Post-Mortem III: Inverted Gravity &amp; Decay Plot Bifurcation</w:t>
+        <w:t>4.3 Post-Mortem III: Inverted Gravity &amp; Decay-Plot Splitting</w:t>
       </w:r>
     </w:p>
     <w:p>
@@ -8384,7 +9559,7 @@
           <w:b w:val="0"/>
           <w:i w:val="0"/>
         </w:rPr>
-        <w:t xml:space="preserve">). Concurrently, slight mounting misalignment introduced an equilibrium tilt offset of </w:t>
+        <w:t xml:space="preserve">). Concurrently, a moderate mounting tilt offset of </w:t>
       </w:r>
       <m:oMath>
         <m:sSub>
@@ -8450,7 +9625,7 @@
           <w:b w:val="0"/>
           <w:i w:val="0"/>
         </w:rPr>
-        <w:t xml:space="preserve">). When peak amplitude was evaluated as </w:t>
+        <w:t xml:space="preserve">) was introduced by knife-edge misalignment relative to the sensor board. When peak amplitude was evaluated as </w:t>
       </w:r>
       <m:oMath>
         <m:sSub>
@@ -9021,7 +10196,7 @@
           <w:i w:val="0"/>
           <w:sz w:val="19"/>
         </w:rPr>
-        <w:t>(a) Decay scatter bifurcation artifact: static frame projection of equilibrium mounting tilt (</w:t>
+        <w:t>(a) Decay-plot splitting artifact: static frame projection of equilibrium mounting tilt (</w:t>
       </w:r>
       <m:oMath>
         <m:sSub>
@@ -9061,26 +10236,7 @@
           <w:i w:val="0"/>
           <w:sz w:val="19"/>
         </w:rPr>
-        <w:t xml:space="preserve">) causes alternating peak splitting (red/blue markers), resolved by half-swing angular velocity integration (dashed green curve). (b) Low-amplitude tail threshold failure in Dataset 2: at </w:t>
-      </w:r>
-      <m:oMath>
-        <m:r>
-          <m:t>t&gt;150</m:t>
-        </m:r>
-        <m:r>
-          <m:rPr>
-            <m:nor/>
-          </m:rPr>
-          <m:t> s</m:t>
-        </m:r>
-      </m:oMath>
-      <w:r>
-        <w:rPr>
-          <w:b w:val="0"/>
-          <w:i w:val="0"/>
-          <w:sz w:val="19"/>
-        </w:rPr>
-        <w:t xml:space="preserve">, swing speed dipped below the fixed </w:t>
+        <w:t xml:space="preserve">) causes alternating peak bifurcation (red/blue markers), resolved by half-swing angular velocity integration (dashed green curve). (b) Low-amplitude tail threshold failure in Dataset 2: within 18 cycles, peak swing speed dipped below the fixed </w:t>
       </w:r>
       <m:oMath>
         <m:f>
@@ -9225,7 +10381,7 @@
           <w:i w:val="0"/>
           <w:sz w:val="19"/>
         </w:rPr>
-        <w:t xml:space="preserve">. Re-processing with an adaptive </w:t>
+        <w:t xml:space="preserve">. Re-processing with a fixed </w:t>
       </w:r>
       <m:oMath>
         <m:f>
@@ -9262,7 +10418,7 @@
           <w:i w:val="0"/>
           <w:sz w:val="19"/>
         </w:rPr>
-        <w:t xml:space="preserve"> gate and median filter recovered all 105 valid oscillations.</w:t>
+        <w:t xml:space="preserve"> gate and median outlier filtering recovered all 105 valid oscillations.</w:t>
       </w:r>
     </w:p>
     <w:p>
@@ -9289,7 +10445,7 @@
           <w:b w:val="0"/>
           <w:i w:val="0"/>
         </w:rPr>
-        <w:t>We evaluate the full experimental telemetry gathered across two independent laboratory sessions.</w:t>
+        <w:t>We evaluate the full experimental telemetry gathered across two independent laboratory sessions. Fig. 2 shows the amplitude decay envelopes and quality factor fits for Dataset 1.</w:t>
       </w:r>
     </w:p>
     <w:p>
@@ -9327,7 +10483,7 @@
       </w:r>
       <m:oMath>
         <m:r>
-          <m:t>83.35</m:t>
+          <m:t>84.57</m:t>
         </m:r>
         <m:r>
           <m:rPr>
@@ -9359,11 +10515,47 @@
           <w:b w:val="0"/>
           <w:i w:val="0"/>
         </w:rPr>
+        <w:t xml:space="preserve">, mean interval </w:t>
+      </w:r>
+      <m:oMath>
+        <m:r>
+          <m:t>Δt=10.15</m:t>
+        </m:r>
+        <m:r>
+          <m:rPr>
+            <m:nor/>
+          </m:rPr>
+          <m:t> ms</m:t>
+        </m:r>
+      </m:oMath>
+      <w:r>
+        <w:rPr>
+          <w:b w:val="0"/>
+          <w:i w:val="0"/>
+        </w:rPr>
+        <w:t xml:space="preserve">, effective rate </w:t>
+      </w:r>
+      <m:oMath>
+        <m:r>
+          <m:t>98.5</m:t>
+        </m:r>
+        <m:r>
+          <m:rPr>
+            <m:nor/>
+          </m:rPr>
+          <m:t> Hz</m:t>
+        </m:r>
+      </m:oMath>
+      <w:r>
+        <w:rPr>
+          <w:b w:val="0"/>
+          <w:i w:val="0"/>
+        </w:rPr>
         <w:t xml:space="preserve">); Pivot 2: </w:t>
       </w:r>
       <m:oMath>
         <m:r>
-          <m:t>93.94</m:t>
+          <m:t>95.38</m:t>
         </m:r>
         <m:r>
           <m:rPr>
@@ -9388,6 +10580,42 @@
             <m:nor/>
           </m:rPr>
           <m:t> samples</m:t>
+        </m:r>
+      </m:oMath>
+      <w:r>
+        <w:rPr>
+          <w:b w:val="0"/>
+          <w:i w:val="0"/>
+        </w:rPr>
+        <w:t xml:space="preserve">, mean interval </w:t>
+      </w:r>
+      <m:oMath>
+        <m:r>
+          <m:t>Δt=10.15</m:t>
+        </m:r>
+        <m:r>
+          <m:rPr>
+            <m:nor/>
+          </m:rPr>
+          <m:t> ms</m:t>
+        </m:r>
+      </m:oMath>
+      <w:r>
+        <w:rPr>
+          <w:b w:val="0"/>
+          <w:i w:val="0"/>
+        </w:rPr>
+        <w:t xml:space="preserve">, effective rate </w:t>
+      </w:r>
+      <m:oMath>
+        <m:r>
+          <m:t>98.5</m:t>
+        </m:r>
+        <m:r>
+          <m:rPr>
+            <m:nor/>
+          </m:rPr>
+          <m:t> Hz</m:t>
         </m:r>
       </m:oMath>
       <w:r>
@@ -9863,6 +11091,21 @@
                   </m:r>
                 </m:sub>
               </m:sSub>
+              <m:r>
+                <m:t>±</m:t>
+              </m:r>
+              <m:sSub>
+                <m:e>
+                  <m:r>
+                    <m:t>s</m:t>
+                  </m:r>
+                </m:e>
+                <m:sub>
+                  <m:r>
+                    <m:t>T</m:t>
+                  </m:r>
+                </m:sub>
+              </m:sSub>
             </m:oMath>
             <w:r>
               <w:rPr>
@@ -9918,7 +11161,7 @@
             </w:pPr>
             <m:oMath>
               <m:r>
-                <m:t>1.77584±0.00134</m:t>
+                <m:t>1.77584±0.00144</m:t>
               </m:r>
               <m:r>
                 <m:rPr>
@@ -10378,6 +11621,21 @@
                   </m:r>
                 </m:sub>
               </m:sSub>
+              <m:r>
+                <m:t>±</m:t>
+              </m:r>
+              <m:sSub>
+                <m:e>
+                  <m:r>
+                    <m:t>s</m:t>
+                  </m:r>
+                </m:e>
+                <m:sub>
+                  <m:r>
+                    <m:t>T</m:t>
+                  </m:r>
+                </m:sub>
+              </m:sSub>
             </m:oMath>
             <w:r>
               <w:rPr>
@@ -10514,6 +11772,35 @@
                   </m:bar>
                 </m:sub>
               </m:sSub>
+              <m:r>
+                <m:t>=</m:t>
+              </m:r>
+              <m:sSub>
+                <m:e>
+                  <m:r>
+                    <m:t>s</m:t>
+                  </m:r>
+                </m:e>
+                <m:sub>
+                  <m:r>
+                    <m:t>T</m:t>
+                  </m:r>
+                </m:sub>
+              </m:sSub>
+              <m:r>
+                <m:t>/</m:t>
+              </m:r>
+              <m:rad>
+                <m:radPr>
+                  <m:degHide m:val="on"/>
+                </m:radPr>
+                <m:deg/>
+                <m:e>
+                  <m:r>
+                    <m:t>N</m:t>
+                  </m:r>
+                </m:e>
+              </m:rad>
             </m:oMath>
             <w:r>
               <w:rPr>
@@ -11175,7 +12462,7 @@
             </w:pPr>
             <m:oMath>
               <m:r>
-                <m:t>9.8079±0.0198</m:t>
+                <m:t>9.8079±0.0264</m:t>
               </m:r>
               <m:sSup>
                 <m:e>
@@ -11221,10 +12508,57 @@
               <w:t xml:space="preserve">Discrepancy vs Standard </w:t>
             </w:r>
             <m:oMath>
+              <m:sSub>
+                <m:e>
+                  <m:r>
+                    <m:t>g</m:t>
+                  </m:r>
+                </m:e>
+                <m:sub>
+                  <m:r>
+                    <m:t>0</m:t>
+                  </m:r>
+                </m:sub>
+              </m:sSub>
+            </m:oMath>
+            <w:r>
+              <w:rPr>
+                <w:rFonts w:ascii="Times New Roman" w:hAnsi="Times New Roman"/>
+                <w:b/>
+                <w:i w:val="0"/>
+                <w:sz w:val="19"/>
+              </w:rPr>
+              <w:t xml:space="preserve"> (</w:t>
+            </w:r>
+            <m:oMath>
               <m:r>
-                <m:t>g</m:t>
+                <m:t>9.80665</m:t>
               </m:r>
+              <m:sSup>
+                <m:e>
+                  <m:r>
+                    <m:rPr>
+                      <m:nor/>
+                    </m:rPr>
+                    <m:t> m/s</m:t>
+                  </m:r>
+                </m:e>
+                <m:sup>
+                  <m:r>
+                    <m:t>2</m:t>
+                  </m:r>
+                </m:sup>
+              </m:sSup>
             </m:oMath>
+            <w:r>
+              <w:rPr>
+                <w:rFonts w:ascii="Times New Roman" w:hAnsi="Times New Roman"/>
+                <w:b/>
+                <w:i w:val="0"/>
+                <w:sz w:val="19"/>
+              </w:rPr>
+              <w:t>)</w:t>
+            </w:r>
           </w:p>
         </w:tc>
         <w:tc>
@@ -12161,7 +13495,7 @@
           <w:i w:val="0"/>
           <w:sz w:val="19"/>
         </w:rPr>
-        <w:t>) from Dataset 1. Dashed lines denote nonlinear least-squares exponential fits confirming linear viscous damping regime without turbulent aerodynamic transitions.</w:t>
+        <w:t>) from Dataset 1. Dashed lines denote non-linear least-squares exponential fits confirming linear viscous damping without aerodynamic turbulence transitions.</w:t>
       </w:r>
     </w:p>
     <w:p>
@@ -12199,7 +13533,7 @@
       </w:r>
       <m:oMath>
         <m:r>
-          <m:t>65.50</m:t>
+          <m:t>67.34</m:t>
         </m:r>
         <m:r>
           <m:rPr>
@@ -12217,7 +13551,7 @@
       </w:r>
       <m:oMath>
         <m:r>
-          <m:t>6,550</m:t>
+          <m:t>6,637</m:t>
         </m:r>
         <m:r>
           <m:rPr>
@@ -12231,6 +13565,42 @@
           <w:b w:val="0"/>
           <w:i w:val="0"/>
         </w:rPr>
+        <w:t xml:space="preserve">, mean interval </w:t>
+      </w:r>
+      <m:oMath>
+        <m:r>
+          <m:t>Δt=10.15</m:t>
+        </m:r>
+        <m:r>
+          <m:rPr>
+            <m:nor/>
+          </m:rPr>
+          <m:t> ms</m:t>
+        </m:r>
+      </m:oMath>
+      <w:r>
+        <w:rPr>
+          <w:b w:val="0"/>
+          <w:i w:val="0"/>
+        </w:rPr>
+        <w:t xml:space="preserve">, effective rate </w:t>
+      </w:r>
+      <m:oMath>
+        <m:r>
+          <m:t>98.5</m:t>
+        </m:r>
+        <m:r>
+          <m:rPr>
+            <m:nor/>
+          </m:rPr>
+          <m:t> Hz</m:t>
+        </m:r>
+      </m:oMath>
+      <w:r>
+        <w:rPr>
+          <w:b w:val="0"/>
+          <w:i w:val="0"/>
+        </w:rPr>
         <w:t xml:space="preserve">); Pivot 2: </w:t>
       </w:r>
       <m:oMath>
@@ -12260,6 +13630,42 @@
             <m:nor/>
           </m:rPr>
           <m:t> samples</m:t>
+        </m:r>
+      </m:oMath>
+      <w:r>
+        <w:rPr>
+          <w:b w:val="0"/>
+          <w:i w:val="0"/>
+        </w:rPr>
+        <w:t xml:space="preserve">, mean interval </w:t>
+      </w:r>
+      <m:oMath>
+        <m:r>
+          <m:t>Δt=10.15</m:t>
+        </m:r>
+        <m:r>
+          <m:rPr>
+            <m:nor/>
+          </m:rPr>
+          <m:t> ms</m:t>
+        </m:r>
+      </m:oMath>
+      <w:r>
+        <w:rPr>
+          <w:b w:val="0"/>
+          <w:i w:val="0"/>
+        </w:rPr>
+        <w:t xml:space="preserve">, effective rate </w:t>
+      </w:r>
+      <m:oMath>
+        <m:r>
+          <m:t>98.5</m:t>
+        </m:r>
+        <m:r>
+          <m:rPr>
+            <m:nor/>
+          </m:rPr>
+          <m:t> Hz</m:t>
         </m:r>
       </m:oMath>
       <w:r>
@@ -12732,6 +14138,21 @@
                       <m:nor/>
                     </m:rPr>
                     <m:t>meas</m:t>
+                  </m:r>
+                </m:sub>
+              </m:sSub>
+              <m:r>
+                <m:t>±</m:t>
+              </m:r>
+              <m:sSub>
+                <m:e>
+                  <m:r>
+                    <m:t>s</m:t>
+                  </m:r>
+                </m:e>
+                <m:sub>
+                  <m:r>
+                    <m:t>T</m:t>
                   </m:r>
                 </m:sub>
               </m:sSub>
@@ -13146,7 +14567,7 @@
               <m:sSup>
                 <m:e>
                   <m:r>
-                    <m:t>0.53</m:t>
+                    <m:t>0.58</m:t>
                   </m:r>
                 </m:e>
                 <m:sup>
@@ -13167,7 +14588,7 @@
             </w:r>
             <m:oMath>
               <m:r>
-                <m:t>0.0092</m:t>
+                <m:t>0.0101</m:t>
               </m:r>
               <m:r>
                 <m:rPr>
@@ -13247,6 +14668,21 @@
                 <m:sub>
                   <m:r>
                     <m:t>0</m:t>
+                  </m:r>
+                </m:sub>
+              </m:sSub>
+              <m:r>
+                <m:t>±</m:t>
+              </m:r>
+              <m:sSub>
+                <m:e>
+                  <m:r>
+                    <m:t>s</m:t>
+                  </m:r>
+                </m:e>
+                <m:sub>
+                  <m:r>
+                    <m:t>T</m:t>
                   </m:r>
                 </m:sub>
               </m:sSub>
@@ -13386,6 +14822,35 @@
                   </m:bar>
                 </m:sub>
               </m:sSub>
+              <m:r>
+                <m:t>=</m:t>
+              </m:r>
+              <m:sSub>
+                <m:e>
+                  <m:r>
+                    <m:t>s</m:t>
+                  </m:r>
+                </m:e>
+                <m:sub>
+                  <m:r>
+                    <m:t>T</m:t>
+                  </m:r>
+                </m:sub>
+              </m:sSub>
+              <m:r>
+                <m:t>/</m:t>
+              </m:r>
+              <m:rad>
+                <m:radPr>
+                  <m:degHide m:val="on"/>
+                </m:radPr>
+                <m:deg/>
+                <m:e>
+                  <m:r>
+                    <m:t>N</m:t>
+                  </m:r>
+                </m:e>
+              </m:rad>
             </m:oMath>
             <w:r>
               <w:rPr>
@@ -13958,7 +15423,7 @@
             </w:pPr>
             <m:oMath>
               <m:r>
-                <m:t>9.7045±0.0309</m:t>
+                <m:t>9.7045±0.0381</m:t>
               </m:r>
               <m:sSup>
                 <m:e>
@@ -14004,10 +15469,57 @@
               <w:t xml:space="preserve">Discrepancy vs Standard </w:t>
             </w:r>
             <m:oMath>
+              <m:sSub>
+                <m:e>
+                  <m:r>
+                    <m:t>g</m:t>
+                  </m:r>
+                </m:e>
+                <m:sub>
+                  <m:r>
+                    <m:t>0</m:t>
+                  </m:r>
+                </m:sub>
+              </m:sSub>
+            </m:oMath>
+            <w:r>
+              <w:rPr>
+                <w:rFonts w:ascii="Times New Roman" w:hAnsi="Times New Roman"/>
+                <w:b/>
+                <w:i w:val="0"/>
+                <w:sz w:val="19"/>
+              </w:rPr>
+              <w:t xml:space="preserve"> (</w:t>
+            </w:r>
+            <m:oMath>
               <m:r>
-                <m:t>g</m:t>
+                <m:t>9.80665</m:t>
               </m:r>
+              <m:sSup>
+                <m:e>
+                  <m:r>
+                    <m:rPr>
+                      <m:nor/>
+                    </m:rPr>
+                    <m:t> m/s</m:t>
+                  </m:r>
+                </m:e>
+                <m:sup>
+                  <m:r>
+                    <m:t>2</m:t>
+                  </m:r>
+                </m:sup>
+              </m:sSup>
             </m:oMath>
+            <w:r>
+              <w:rPr>
+                <w:rFonts w:ascii="Times New Roman" w:hAnsi="Times New Roman"/>
+                <w:b/>
+                <w:i w:val="0"/>
+                <w:sz w:val="19"/>
+              </w:rPr>
+              <w:t>)</w:t>
+            </w:r>
           </w:p>
         </w:tc>
         <w:tc>
@@ -14076,7 +15588,7 @@
             </w:pPr>
             <m:oMath>
               <m:r>
-                <m:t>1.04%</m:t>
+                <m:t>−1.04%</m:t>
               </m:r>
             </m:oMath>
           </w:p>
@@ -14090,6 +15602,74 @@
     </w:p>
     <w:p>
       <w:pPr>
+        <w:spacing w:before="0" w:after="80" w:line="276" w:lineRule="auto"/>
+        <w:jc w:val="both"/>
+      </w:pPr>
+      <w:r>
+        <w:rPr>
+          <w:b w:val="0"/>
+          <w:i/>
+        </w:rPr>
+        <w:t>Note on damping discrepancy:</w:t>
+      </w:r>
+      <w:r>
+        <w:rPr>
+          <w:b w:val="0"/>
+          <w:i w:val="0"/>
+        </w:rPr>
+        <w:t xml:space="preserve"> Pivot 1 in Dataset 2 exhibited a higher decay constant (</w:t>
+      </w:r>
+      <m:oMath>
+        <m:r>
+          <m:t>γ=0.01337</m:t>
+        </m:r>
+      </m:oMath>
+      <w:r>
+        <w:rPr>
+          <w:b w:val="0"/>
+          <w:i w:val="0"/>
+        </w:rPr>
+        <w:t xml:space="preserve">, </w:t>
+      </w:r>
+      <m:oMath>
+        <m:r>
+          <m:t>Q=235.0</m:t>
+        </m:r>
+      </m:oMath>
+      <w:r>
+        <w:rPr>
+          <w:b w:val="0"/>
+          <w:i w:val="0"/>
+        </w:rPr>
+        <w:t>) than in Dataset 1 (</w:t>
+      </w:r>
+      <m:oMath>
+        <m:r>
+          <m:t>γ=0.00461</m:t>
+        </m:r>
+      </m:oMath>
+      <w:r>
+        <w:rPr>
+          <w:b w:val="0"/>
+          <w:i w:val="0"/>
+        </w:rPr>
+        <w:t xml:space="preserve">, </w:t>
+      </w:r>
+      <m:oMath>
+        <m:r>
+          <m:t>Q=681.1</m:t>
+        </m:r>
+      </m:oMath>
+      <w:r>
+        <w:rPr>
+          <w:b w:val="0"/>
+          <w:i w:val="0"/>
+        </w:rPr>
+        <w:t>). This is attributable to subtle differences in knife-edge contact seating on the agate support plane or localized dust accumulation between sessions.</w:t>
+      </w:r>
+    </w:p>
+    <w:p>
+      <w:pPr>
         <w:keepNext/>
         <w:spacing w:before="280" w:after="80"/>
       </w:pPr>
@@ -14133,7 +15713,7 @@
           <w:b w:val="0"/>
           <w:i w:val="0"/>
         </w:rPr>
-        <w:t>, we perform a partial derivative sensitivity expansion on Bessel's equation. Let:</w:t>
+        <w:t>, we perform a partial derivative sensitivity expansion on Bessel's equation following standard error propagation methods [7]. Let:</w:t>
       </w:r>
     </w:p>
     <w:p>
@@ -14411,7 +15991,7 @@
           <w:b w:val="0"/>
           <w:i w:val="0"/>
         </w:rPr>
-        <w:t>Taking partial derivatives with respect to each independent variable:</w:t>
+        <w:t>Taking partial derivatives with respect to each independent measurement variable:</w:t>
       </w:r>
     </w:p>
     <w:p>
@@ -15322,6 +16902,30 @@
         <m:r>
           <m:t>Φ=8.0503</m:t>
         </m:r>
+        <m:sSup>
+          <m:e>
+            <m:r>
+              <m:rPr>
+                <m:nor/>
+              </m:rPr>
+              <m:t> s</m:t>
+            </m:r>
+          </m:e>
+          <m:sup>
+            <m:r>
+              <m:t>2</m:t>
+            </m:r>
+          </m:sup>
+        </m:sSup>
+        <m:r>
+          <m:t>/</m:t>
+        </m:r>
+        <m:r>
+          <m:rPr>
+            <m:nor/>
+          </m:rPr>
+          <m:t>m</m:t>
+        </m:r>
       </m:oMath>
       <w:r>
         <w:rPr>
@@ -15829,7 +17433,7 @@
           </m:sub>
         </m:sSub>
         <m:r>
-          <m:t>=±0.0010</m:t>
+          <m:t>=±0.0014</m:t>
         </m:r>
         <m:r>
           <m:rPr>
@@ -15847,7 +17451,7 @@
       </w:r>
       <m:oMath>
         <m:r>
-          <m:t>1.0</m:t>
+          <m:t>1.4</m:t>
         </m:r>
         <m:r>
           <m:rPr>
@@ -15861,7 +17465,70 @@
           <w:b w:val="0"/>
           <w:i w:val="0"/>
         </w:rPr>
-        <w:t>, knife-edge balance line uncertainty).</w:t>
+        <w:t xml:space="preserve">, combined in quadrature from individual knife-edge balance line uncertainties </w:t>
+      </w:r>
+      <m:oMath>
+        <m:sSub>
+          <m:e>
+            <m:r>
+              <m:t>σ</m:t>
+            </m:r>
+          </m:e>
+          <m:sub>
+            <m:sSub>
+              <m:e>
+                <m:r>
+                  <m:t>h</m:t>
+                </m:r>
+              </m:e>
+              <m:sub>
+                <m:r>
+                  <m:t>1</m:t>
+                </m:r>
+              </m:sub>
+            </m:sSub>
+          </m:sub>
+        </m:sSub>
+        <m:r>
+          <m:t>=</m:t>
+        </m:r>
+        <m:sSub>
+          <m:e>
+            <m:r>
+              <m:t>σ</m:t>
+            </m:r>
+          </m:e>
+          <m:sub>
+            <m:sSub>
+              <m:e>
+                <m:r>
+                  <m:t>h</m:t>
+                </m:r>
+              </m:e>
+              <m:sub>
+                <m:r>
+                  <m:t>2</m:t>
+                </m:r>
+              </m:sub>
+            </m:sSub>
+          </m:sub>
+        </m:sSub>
+        <m:r>
+          <m:t>=±1.0</m:t>
+        </m:r>
+        <m:r>
+          <m:rPr>
+            <m:nor/>
+          </m:rPr>
+          <m:t> mm</m:t>
+        </m:r>
+      </m:oMath>
+      <w:r>
+        <w:rPr>
+          <w:b w:val="0"/>
+          <w:i w:val="0"/>
+        </w:rPr>
+        <w:t>).</w:t>
       </w:r>
     </w:p>
     <w:p>
@@ -16212,7 +17879,7 @@
           </m:sub>
         </m:sSub>
         <m:r>
-          <m:t>=17.826×0.0010=0.01783</m:t>
+          <m:t>=17.826×0.0014=0.02496</m:t>
         </m:r>
         <m:sSup>
           <m:e>
@@ -16343,7 +18010,7 @@
                       <m:t>(</m:t>
                     </m:r>
                     <m:r>
-                      <m:t>0.01783</m:t>
+                      <m:t>0.02496</m:t>
                     </m:r>
                   </m:e>
                 </m:d>
@@ -16363,7 +18030,7 @@
           <m:rPr>
             <m:sty m:val="b"/>
           </m:rPr>
-          <m:t>0.0198</m:t>
+          <m:t>0.0264</m:t>
         </m:r>
         <m:sSup>
           <m:e>
@@ -16415,7 +18082,7 @@
           <m:rPr>
             <m:sty m:val="b"/>
           </m:rPr>
-          <m:t>=9.808±0.020</m:t>
+          <m:t>=9.808±0.026</m:t>
         </m:r>
         <m:sSup>
           <m:e>
@@ -16443,7 +18110,7 @@
           <m:rPr>
             <m:sty m:val="b"/>
           </m:rPr>
-          <m:t>±0.20%</m:t>
+          <m:t>±0.27%</m:t>
         </m:r>
         <m:r>
           <m:t>)</m:t>
@@ -16460,11 +18127,23 @@
           <w:b w:val="0"/>
           <w:i w:val="0"/>
         </w:rPr>
-        <w:t>Notice that the primary contributor to uncertainty is the center-of-mass balance measurement (</w:t>
+        <w:t>The dominant contributor to experimental uncertainty is the center-of-mass balance measurement (</w:t>
       </w:r>
       <m:oMath>
-        <m:r>
-          <m:t>0.0178</m:t>
+        <m:sSub>
+          <m:e>
+            <m:r>
+              <m:t>u</m:t>
+            </m:r>
+          </m:e>
+          <m:sub>
+            <m:r>
+              <m:t>4</m:t>
+            </m:r>
+          </m:sub>
+        </m:sSub>
+        <m:r>
+          <m:t>=0.0250</m:t>
         </m:r>
         <m:sSup>
           <m:e>
@@ -16491,7 +18170,7 @@
       </w:r>
       <m:oMath>
         <m:r>
-          <m:t>81%</m:t>
+          <m:t>89.3%</m:t>
         </m:r>
       </m:oMath>
       <w:r>
@@ -16499,11 +18178,11 @@
           <w:b w:val="0"/>
           <w:i w:val="0"/>
         </w:rPr>
-        <w:t xml:space="preserve"> of the error variance). The period measurement errors contribute negligible variance due to the high cycle count (</w:t>
+        <w:t xml:space="preserve"> of the total error variance). The period measurement errors contribute negligible variance due to cycle averaging (</w:t>
       </w:r>
       <m:oMath>
         <m:r>
-          <m:t>N&gt;50</m:t>
+          <m:t>N≈50</m:t>
         </m:r>
       </m:oMath>
       <w:r>
@@ -16525,7 +18204,7 @@
           <w:i w:val="0"/>
           <w:sz w:val="23"/>
         </w:rPr>
-        <w:t>6.2 Parametric Sensitivity Analysis for Dataset 2</w:t>
+        <w:t>6.2 Parametric Sensitivity Hypothesis for Dataset 2</w:t>
       </w:r>
     </w:p>
     <w:p>
@@ -16583,7 +18262,19 @@
           <w:b w:val="0"/>
           <w:i w:val="0"/>
         </w:rPr>
-        <w:t>. Evaluating the derivative:</w:t>
+        <w:t xml:space="preserve"> (</w:t>
+      </w:r>
+      <m:oMath>
+        <m:r>
+          <m:t>−1.04%</m:t>
+        </m:r>
+      </m:oMath>
+      <w:r>
+        <w:rPr>
+          <w:b w:val="0"/>
+          <w:i w:val="0"/>
+        </w:rPr>
+        <w:t>). Evaluating the sensitivity derivative:</w:t>
       </w:r>
     </w:p>
     <w:p>
@@ -16637,7 +18328,7 @@
           <w:b w:val="0"/>
           <w:i w:val="0"/>
         </w:rPr>
-        <w:t xml:space="preserve">A physical shift of the center of mass balance point by just </w:t>
+        <w:t xml:space="preserve">A systematic shift of the effective balance line by </w:t>
       </w:r>
       <m:oMath>
         <m:r>
@@ -16718,7 +18409,7 @@
           <w:b w:val="0"/>
           <w:i w:val="0"/>
         </w:rPr>
-        <w:t>, yields:</w:t>
+        <w:t>, would reconcile the result with standard gravity:</w:t>
       </w:r>
     </w:p>
     <w:p>
@@ -16762,13 +18453,13 @@
           <m:rPr>
             <m:sty m:val="b"/>
           </m:rPr>
-          <m:t>0.01%</m:t>
+          <m:t>−0.01%</m:t>
         </m:r>
         <m:r>
           <m:rPr>
             <m:nor/>
           </m:rPr>
-          <m:t> error</m:t>
+          <m:t> discrepancy</m:t>
         </m:r>
         <m:r>
           <m:t>)</m:t>
@@ -16785,11 +18476,17 @@
           <w:b w:val="0"/>
           <w:i w:val="0"/>
         </w:rPr>
-        <w:t xml:space="preserve">This demonstrates that the </w:t>
+        <w:t xml:space="preserve">Such a millimeter-scale shift is physically plausible between independent laboratory sessions (e.g. from slight re-positioning or clamping of movable components, or registration differences on the balance plane, consistent with the observed </w:t>
       </w:r>
       <m:oMath>
         <m:r>
-          <m:t>1%</m:t>
+          <m:t>6</m:t>
+        </m:r>
+        <m:r>
+          <m:rPr>
+            <m:nor/>
+          </m:rPr>
+          <m:t> ms</m:t>
         </m:r>
       </m:oMath>
       <w:r>
@@ -16797,7 +18494,64 @@
           <w:b w:val="0"/>
           <w:i w:val="0"/>
         </w:rPr>
-        <w:t xml:space="preserve"> discrepancy in Dataset 2 was dominated entirely by a millimeter-scale shift in pencil line alignment for the center of mass when resetting the physical bobs, confirming the underlying stability of the digital timing engine.</w:t>
+        <w:t xml:space="preserve"> shift in </w:t>
+      </w:r>
+      <m:oMath>
+        <m:sSub>
+          <m:e>
+            <m:r>
+              <m:t>T</m:t>
+            </m:r>
+          </m:e>
+          <m:sub>
+            <m:r>
+              <m:t>1</m:t>
+            </m:r>
+          </m:sub>
+        </m:sSub>
+      </m:oMath>
+      <w:r>
+        <w:rPr>
+          <w:b w:val="0"/>
+          <w:i w:val="0"/>
+        </w:rPr>
+        <w:t xml:space="preserve"> from </w:t>
+      </w:r>
+      <m:oMath>
+        <m:r>
+          <m:t>1.690</m:t>
+        </m:r>
+        <m:r>
+          <m:rPr>
+            <m:nor/>
+          </m:rPr>
+          <m:t> s</m:t>
+        </m:r>
+      </m:oMath>
+      <w:r>
+        <w:rPr>
+          <w:b w:val="0"/>
+          <w:i w:val="0"/>
+        </w:rPr>
+        <w:t xml:space="preserve"> to </w:t>
+      </w:r>
+      <m:oMath>
+        <m:r>
+          <m:t>1.684</m:t>
+        </m:r>
+        <m:r>
+          <m:rPr>
+            <m:nor/>
+          </m:rPr>
+          <m:t> s</m:t>
+        </m:r>
+      </m:oMath>
+      <w:r>
+        <w:rPr>
+          <w:b w:val="0"/>
+          <w:i w:val="0"/>
+        </w:rPr>
+        <w:t>). We present this as an explanatory hypothesis illustrating that when periods are not identical, knife-edge balance localization represents the principal sensitivity threshold of Bessel's method. Fig. 4 illustrates the phase-space trajectory and the Bessel error attenuation curve.</w:t>
       </w:r>
     </w:p>
     <w:p>
@@ -16861,62 +18615,7 @@
           <w:i w:val="0"/>
           <w:sz w:val="19"/>
         </w:rPr>
-        <w:t xml:space="preserve">(a) Empirical phase portrait </w:t>
-      </w:r>
-      <m:oMath>
-        <m:d>
-          <m:dPr>
-            <m:begChr m:val="{"/>
-            <m:sepChr m:val=""/>
-            <m:endChr m:val="}"/>
-          </m:dPr>
-          <m:e>
-            <m:r>
-              <m:t>θ</m:t>
-            </m:r>
-            <m:r>
-              <m:t>(</m:t>
-            </m:r>
-            <m:r>
-              <m:t>t</m:t>
-            </m:r>
-            <m:r>
-              <m:t>)</m:t>
-            </m:r>
-            <m:r>
-              <m:t>,</m:t>
-            </m:r>
-            <m:sSub>
-              <m:e>
-                <m:r>
-                  <m:t>ω</m:t>
-                </m:r>
-              </m:e>
-              <m:sub>
-                <m:r>
-                  <m:t>z</m:t>
-                </m:r>
-              </m:sub>
-            </m:sSub>
-            <m:r>
-              <m:t>(</m:t>
-            </m:r>
-            <m:r>
-              <m:t>t</m:t>
-            </m:r>
-            <m:r>
-              <m:t>)</m:t>
-            </m:r>
-          </m:e>
-        </m:d>
-      </m:oMath>
-      <w:r>
-        <w:rPr>
-          <w:b w:val="0"/>
-          <w:i w:val="0"/>
-          <w:sz w:val="19"/>
-        </w:rPr>
-        <w:t xml:space="preserve"> reconstructed via numerical velocity integration over a </w:t>
+        <w:t xml:space="preserve">(a) Empirical phase portrait reconstructed via numerical velocity integration over a </w:t>
       </w:r>
       <m:oMath>
         <m:r>
@@ -16935,7 +18634,7 @@
           <w:i w:val="0"/>
           <w:sz w:val="19"/>
         </w:rPr>
-        <w:t xml:space="preserve"> interval, demonstrating clean, closed spiral orbits indicative of low-dissipation harmonic motion. (b) Center-of-mass sensitivity prefactor </w:t>
+        <w:t xml:space="preserve"> interval, demonstrating closed spiral orbits indicative of low-dissipation harmonic motion. (b) Center-of-mass sensitivity prefactor </w:t>
       </w:r>
       <m:oMath>
         <m:d>
@@ -17111,11 +18810,11 @@
           <w:i w:val="0"/>
           <w:sz w:val="19"/>
         </w:rPr>
-        <w:t xml:space="preserve">, black star), error sensitivity is attenuated by more than a factor of </w:t>
+        <w:t xml:space="preserve">, black star), error sensitivity is attenuated by approximately </w:t>
       </w:r>
       <m:oMath>
         <m:r>
-          <m:t>20</m:t>
+          <m:t>4×</m:t>
         </m:r>
       </m:oMath>
       <w:r>
@@ -17393,7 +19092,7 @@
                 <w:i w:val="0"/>
                 <w:sz w:val="19"/>
               </w:rPr>
-              <w:t>Zero (microsecond hardware timer)</w:t>
+              <w:t>Zero (timer-driven hardware ISR)</w:t>
             </w:r>
           </w:p>
         </w:tc>
@@ -17681,7 +19380,7 @@
                 <w:i w:val="0"/>
                 <w:sz w:val="19"/>
               </w:rPr>
-              <w:t>Hard/Ignored</w:t>
+              <w:t>Hard / Ignored</w:t>
             </w:r>
           </w:p>
         </w:tc>
@@ -17731,7 +19430,7 @@
                 <w:i w:val="0"/>
                 <w:sz w:val="19"/>
               </w:rPr>
-              <w:t>Per-cycle Borda numerical integration</w:t>
+              <w:t>Per-cycle analytic Borda circular correction</w:t>
             </w:r>
           </w:p>
         </w:tc>
@@ -18011,18 +19710,18 @@
           <w:b/>
           <w:i w:val="0"/>
         </w:rPr>
-        <w:t>Accuracy:</w:t>
+        <w:t>Accuracy &amp; Consistency:</w:t>
       </w:r>
       <w:r>
         <w:rPr>
           <w:b w:val="0"/>
           <w:i w:val="0"/>
         </w:rPr>
-        <w:t xml:space="preserve"> Analysis of laboratory Dataset 1 demonstrates that the system achieves </w:t>
+        <w:t xml:space="preserve"> Analysis of laboratory Dataset 1 achieves </w:t>
       </w:r>
       <m:oMath>
         <m:r>
-          <m:t>g=9.8079±0.0198</m:t>
+          <m:t>g=9.8079±0.0264</m:t>
         </m:r>
         <m:sSup>
           <m:e>
@@ -18045,11 +19744,11 @@
           <w:b w:val="0"/>
           <w:i w:val="0"/>
         </w:rPr>
-        <w:t xml:space="preserve">, within </w:t>
+        <w:t xml:space="preserve"> (</w:t>
       </w:r>
       <m:oMath>
         <m:r>
-          <m:t>+0.013%</m:t>
+          <m:t>±0.27%</m:t>
         </m:r>
       </m:oMath>
       <w:r>
@@ -18057,7 +19756,97 @@
           <w:b w:val="0"/>
           <w:i w:val="0"/>
         </w:rPr>
-        <w:t xml:space="preserve"> of the accepted standard, without requiring tedious physical balancing of periods.</w:t>
+        <w:t xml:space="preserve"> analytical uncertainty), agreeing with conventional standard gravity </w:t>
+      </w:r>
+      <m:oMath>
+        <m:sSub>
+          <m:e>
+            <m:r>
+              <m:t>g</m:t>
+            </m:r>
+          </m:e>
+          <m:sub>
+            <m:r>
+              <m:t>0</m:t>
+            </m:r>
+          </m:sub>
+        </m:sSub>
+        <m:r>
+          <m:t>=9.80665</m:t>
+        </m:r>
+        <m:sSup>
+          <m:e>
+            <m:r>
+              <m:rPr>
+                <m:nor/>
+              </m:rPr>
+              <m:t> m/s</m:t>
+            </m:r>
+          </m:e>
+          <m:sup>
+            <m:r>
+              <m:t>2</m:t>
+            </m:r>
+          </m:sup>
+        </m:sSup>
+      </m:oMath>
+      <w:r>
+        <w:rPr>
+          <w:b w:val="0"/>
+          <w:i w:val="0"/>
+        </w:rPr>
+        <w:t xml:space="preserve"> to </w:t>
+      </w:r>
+      <m:oMath>
+        <m:r>
+          <m:t>+0.013%</m:t>
+        </m:r>
+      </m:oMath>
+      <w:r>
+        <w:rPr>
+          <w:b w:val="0"/>
+          <w:i w:val="0"/>
+        </w:rPr>
+        <w:t xml:space="preserve">. Dataset 2 yields </w:t>
+      </w:r>
+      <m:oMath>
+        <m:r>
+          <m:t>g=9.7045±0.0381</m:t>
+        </m:r>
+        <m:sSup>
+          <m:e>
+            <m:r>
+              <m:rPr>
+                <m:nor/>
+              </m:rPr>
+              <m:t> m/s</m:t>
+            </m:r>
+          </m:e>
+          <m:sup>
+            <m:r>
+              <m:t>2</m:t>
+            </m:r>
+          </m:sup>
+        </m:sSup>
+      </m:oMath>
+      <w:r>
+        <w:rPr>
+          <w:b w:val="0"/>
+          <w:i w:val="0"/>
+        </w:rPr>
+        <w:t xml:space="preserve"> (</w:t>
+      </w:r>
+      <m:oMath>
+        <m:r>
+          <m:t>−1.04%</m:t>
+        </m:r>
+      </m:oMath>
+      <w:r>
+        <w:rPr>
+          <w:b w:val="0"/>
+          <w:i w:val="0"/>
+        </w:rPr>
+        <w:t>), illustrating the sensitivity to physical center-of-mass localization when periods are not identical.</w:t>
       </w:r>
     </w:p>
     <w:p>
@@ -18070,14 +19859,14 @@
           <w:b/>
           <w:i w:val="0"/>
         </w:rPr>
-        <w:t>Robustness:</w:t>
+        <w:t>Robustness &amp; Diagnostics:</w:t>
       </w:r>
       <w:r>
         <w:rPr>
           <w:b w:val="0"/>
           <w:i w:val="0"/>
         </w:rPr>
-        <w:t xml:space="preserve"> Complete software post-mortems resolved initial anomalies, confirming that the physical telemetry was sound and replacing fragile thresholding with invariant half-swing velocity integration and median filtering.</w:t>
+        <w:t xml:space="preserve"> Engineering post-mortems identified and resolved initial software anomalies: replacing static thresholding with invariant half-swing velocity integration and median filtering prevented low-amplitude cycle skipping.</w:t>
       </w:r>
     </w:p>
     <w:p>
@@ -18090,14 +19879,47 @@
           <w:b/>
           <w:i w:val="0"/>
         </w:rPr>
-        <w:t>Pedagogical Value:</w:t>
+        <w:t>Pedagogical &amp; Metrological Value:</w:t>
       </w:r>
       <w:r>
         <w:rPr>
           <w:b w:val="0"/>
           <w:i w:val="0"/>
         </w:rPr>
-        <w:t xml:space="preserve"> The system bridges classical nineteenth-century analytical dynamics with modern embedded instrumentation, providing an open, reproducible framework for precision measurement in experimental physics.</w:t>
+        <w:t xml:space="preserve"> The digital telemetry pipeline eliminates human timing bias, extracts comprehensive damping parameters (</w:t>
+      </w:r>
+      <m:oMath>
+        <m:r>
+          <m:t>Q≈600</m:t>
+        </m:r>
+        <m:r>
+          <m:rPr>
+            <m:nor/>
+          </m:rPr>
+          <m:t>--</m:t>
+        </m:r>
+        <m:r>
+          <m:t>680</m:t>
+        </m:r>
+      </m:oMath>
+      <w:r>
+        <w:rPr>
+          <w:b w:val="0"/>
+          <w:i w:val="0"/>
+        </w:rPr>
+        <w:t xml:space="preserve">), and demonstrates how Bessel's asymmetric formulation suppresses center-of-mass balance uncertainty by a factor of </w:t>
+      </w:r>
+      <m:oMath>
+        <m:r>
+          <m:t>4×</m:t>
+        </m:r>
+      </m:oMath>
+      <w:r>
+        <w:rPr>
+          <w:b w:val="0"/>
+          <w:i w:val="0"/>
+        </w:rPr>
+        <w:t>, providing an open, reproducible framework for precision measurement in experimental physics.</w:t>
       </w:r>
     </w:p>
     <w:p>
@@ -18131,21 +19953,21 @@
           <w:b w:val="0"/>
           <w:i w:val="0"/>
         </w:rPr>
-        <w:t xml:space="preserve"> (1818). </w:t>
+        <w:t xml:space="preserve"> (1818). "An account of experiments for determining the length of the pendulum vibrating seconds in the latitude of London." </w:t>
       </w:r>
       <w:r>
         <w:rPr>
           <w:b w:val="0"/>
           <w:i/>
         </w:rPr>
-        <w:t>An account of experiments for determining the length of the pendulum vibrating seconds in the latitude of London.</w:t>
+        <w:t>Philosophical Transactions of the Royal Society of London</w:t>
       </w:r>
       <w:r>
         <w:rPr>
           <w:b w:val="0"/>
           <w:i w:val="0"/>
         </w:rPr>
-        <w:t xml:space="preserve"> Philosophical Transactions of the Royal Society of London, 108, 33–102.</w:t>
+        <w:t>, 108, 33–102.</w:t>
       </w:r>
     </w:p>
     <w:p>
@@ -18165,21 +19987,21 @@
           <w:b w:val="0"/>
           <w:i w:val="0"/>
         </w:rPr>
-        <w:t xml:space="preserve"> (1828). </w:t>
+        <w:t xml:space="preserve"> (1828). "Untersuchungen über die Länge des einfachen Secundenpendels." </w:t>
       </w:r>
       <w:r>
         <w:rPr>
           <w:b w:val="0"/>
           <w:i/>
         </w:rPr>
-        <w:t>Untersuchungen über die Länge des einfachen Secundenpendels.</w:t>
+        <w:t>Abhandlungen der Königlichen Akademie der Wissenschaften zu Berlin, Mathematische Klasse</w:t>
       </w:r>
       <w:r>
         <w:rPr>
           <w:b w:val="0"/>
           <w:i w:val="0"/>
         </w:rPr>
-        <w:t xml:space="preserve"> Abhandlungen der Königlichen Akademie der Wissenschaften zu Berlin, Mathematische Klasse, 1–254.</w:t>
+        <w:t>, 1–254.</w:t>
       </w:r>
     </w:p>
     <w:p>
@@ -18199,21 +20021,21 @@
           <w:b w:val="0"/>
           <w:i w:val="0"/>
         </w:rPr>
-        <w:t xml:space="preserve"> (1792). </w:t>
+        <w:t xml:space="preserve"> (1810). "Expériences pour connaître la longueur du pendule qui bat les secondes à Paris." </w:t>
       </w:r>
       <w:r>
         <w:rPr>
           <w:b w:val="0"/>
           <w:i/>
         </w:rPr>
-        <w:t>Expériences pour connaître la longueur du pendule qui bat les secondes à Paris.</w:t>
+        <w:t>Base du Système Métrique Décimal</w:t>
       </w:r>
       <w:r>
         <w:rPr>
           <w:b w:val="0"/>
           <w:i w:val="0"/>
         </w:rPr>
-        <w:t xml:space="preserve"> Base du Système Métrique Décimal, Imprimerie Impériale, Paris, 3, 337–401.</w:t>
+        <w:t>, Imprimerie Impériale, Paris, Vol. 3, pp. 337–401 (experiments conducted 1792).</w:t>
       </w:r>
     </w:p>
     <w:p>
@@ -18267,21 +20089,21 @@
           <w:b w:val="0"/>
           <w:i w:val="0"/>
         </w:rPr>
-        <w:t xml:space="preserve"> (1986). </w:t>
+        <w:t xml:space="preserve"> (1986). "The pendulum—Rich physics from a simple system." </w:t>
       </w:r>
       <w:r>
         <w:rPr>
           <w:b w:val="0"/>
           <w:i/>
         </w:rPr>
-        <w:t>The pendulum—Rich physics from a simple system.</w:t>
+        <w:t>American Journal of Physics</w:t>
       </w:r>
       <w:r>
         <w:rPr>
           <w:b w:val="0"/>
           <w:i w:val="0"/>
         </w:rPr>
-        <w:t xml:space="preserve"> American Journal of Physics, 54(2), 112–121.</w:t>
+        <w:t>, 54(2), 112–121.</w:t>
       </w:r>
     </w:p>
     <w:p>
@@ -18301,21 +20123,21 @@
           <w:b w:val="0"/>
           <w:i w:val="0"/>
         </w:rPr>
-        <w:t xml:space="preserve"> (1988). </w:t>
+        <w:t xml:space="preserve"> (1988). "Apparatus for measuring the period of a pendulum using a microcomputer." </w:t>
       </w:r>
       <w:r>
         <w:rPr>
           <w:b w:val="0"/>
           <w:i/>
         </w:rPr>
-        <w:t>Apparatus for measuring the period of a pendulum using a microcomputer.</w:t>
+        <w:t>The Physics Teacher</w:t>
       </w:r>
       <w:r>
         <w:rPr>
           <w:b w:val="0"/>
           <w:i w:val="0"/>
         </w:rPr>
-        <w:t xml:space="preserve"> The Physics Teacher, 26(9), 594–596.</w:t>
+        <w:t>, 26(9), 594–596.</w:t>
       </w:r>
     </w:p>
     <w:p>

</xml_diff>

<commit_message>
Incorporate peer review revisions: renumber figures, clarify balance asymmetry, reconcile amplitude decay mechanics, and polish formatting
</commit_message>
<xml_diff>
--- a/docs/Katers_Pendulum_Research_Report.docx
+++ b/docs/Katers_Pendulum_Research_Report.docx
@@ -1023,7 +1023,7 @@
           <w:b w:val="0"/>
           <w:i w:val="0"/>
         </w:rPr>
-        <w:t xml:space="preserve"> are identical to within microsecond precision is tedious and sensitive to ambient thermal and mechanical drifts. To eliminate this operational bottleneck, Friedrich Wilhelm Bessel developed an exact analytical formulation in 1828 for compound pendulums with unequal periods [2]. Bessel demonstrated that by incorporating the asymmetry of the center of mass relative to the two knife edges </w:t>
+        <w:t xml:space="preserve"> are identical to within sub-millisecond precision is tedious and sensitive to ambient thermal and mechanical drifts. To eliminate this operational bottleneck, Friedrich Wilhelm Bessel developed an exact analytical formulation in 1828 for compound pendulums with unequal periods [2]. Bessel demonstrated that by incorporating the asymmetry of the center of mass relative to the two knife edges </w:t>
       </w:r>
       <m:oMath>
         <m:d>
@@ -3848,7 +3848,7 @@
           <w:b w:val="0"/>
           <w:i w:val="0"/>
         </w:rPr>
-        <w:t>. Because finding the center of mass by knife-edge balance introduces an experimental uncertainty (</w:t>
+        <w:t>. Because finding the center of mass introduces an experimental uncertainty (</w:t>
       </w:r>
       <m:oMath>
         <m:r>
@@ -5807,7 +5807,7 @@
           <w:b w:val="0"/>
           <w:i w:val="0"/>
         </w:rPr>
-        <w:t xml:space="preserve"> The center of mass of the assembled rod was determined by horizontal knife-edge balancing, establishing:</w:t>
+        <w:t xml:space="preserve"> The center of mass of the assembled rod was located by horizontal knife-edge balancing, establishing the balance position. Independent vernier distance measurements from the respective knife-edge apexes to the marked balance line yielded:</w:t>
       </w:r>
     </w:p>
     <w:p>
@@ -6164,25 +6164,7 @@
           <w:b w:val="0"/>
           <w:i w:val="0"/>
         </w:rPr>
-        <w:t xml:space="preserve">) via USB-UART serial at </w:t>
-      </w:r>
-      <m:oMath>
-        <m:r>
-          <m:t>115,200</m:t>
-        </m:r>
-        <m:r>
-          <m:rPr>
-            <m:nor/>
-          </m:rPr>
-          <m:t> baud</m:t>
-        </m:r>
-      </m:oMath>
-      <w:r>
-        <w:rPr>
-          <w:b w:val="0"/>
-          <w:i w:val="0"/>
-        </w:rPr>
-        <w:t>.</w:t>
+        <w:t>) via USB-UART serial at 115,200 baud.</w:t>
       </w:r>
     </w:p>
     <w:p>
@@ -6544,7 +6526,7 @@
           <w:b w:val="0"/>
           <w:i w:val="0"/>
         </w:rPr>
-        <w:t>. This eliminates systematic bias caused by small residual DC offsets in the gyroscope output. Fig. 1 shows the recorded kinematic waveforms and extracted zero crossings.</w:t>
+        <w:t>. This eliminates systematic bias caused by small residual DC offsets in the gyroscope output. Fig. 1 shows the recorded kinematic waveforms and extracted zero crossings across both pivot orientations.</w:t>
       </w:r>
     </w:p>
     <w:p>
@@ -6608,7 +6590,7 @@
           <w:i w:val="0"/>
           <w:sz w:val="19"/>
         </w:rPr>
-        <w:t xml:space="preserve">(a) Direct angular rate </w:t>
+        <w:t xml:space="preserve">(a) Pivot 1 angular rate </w:t>
       </w:r>
       <m:oMath>
         <m:sSub>
@@ -6633,11 +6615,23 @@
           <w:i w:val="0"/>
           <w:sz w:val="19"/>
         </w:rPr>
-        <w:t xml:space="preserve"> measured across a </w:t>
+        <w:t xml:space="preserve"> (</w:t>
       </w:r>
       <m:oMath>
-        <m:r>
-          <m:t>10</m:t>
+        <m:sSub>
+          <m:e>
+            <m:r>
+              <m:t>T</m:t>
+            </m:r>
+          </m:e>
+          <m:sub>
+            <m:r>
+              <m:t>1</m:t>
+            </m:r>
+          </m:sub>
+        </m:sSub>
+        <m:r>
+          <m:t>≈1.69</m:t>
         </m:r>
         <m:r>
           <m:rPr>
@@ -6652,24 +6646,24 @@
           <w:i w:val="0"/>
           <w:sz w:val="19"/>
         </w:rPr>
-        <w:t xml:space="preserve"> window under Pivot 1. Red circles highlight sub-sample zero-crossing points, each marking a half-period (</w:t>
+        <w:t xml:space="preserve">) with red markers at sub-sample zero-crossings. (b) Pivot 2 angular rate </w:t>
       </w:r>
       <m:oMath>
-        <m:f>
-          <m:fPr>
-            <m:type m:val="lin"/>
-          </m:fPr>
-          <m:num>
-            <m:r>
-              <m:t>T</m:t>
-            </m:r>
-          </m:num>
-          <m:den>
-            <m:r>
-              <m:t>2</m:t>
-            </m:r>
-          </m:den>
-        </m:f>
+        <m:sSub>
+          <m:e>
+            <m:r>
+              <m:t>ω</m:t>
+            </m:r>
+          </m:e>
+          <m:sub>
+            <m:r>
+              <m:t>z</m:t>
+            </m:r>
+          </m:sub>
+        </m:sSub>
+        <m:r>
+          <m:t>(t)</m:t>
+        </m:r>
       </m:oMath>
       <w:r>
         <w:rPr>
@@ -6677,11 +6671,29 @@
           <w:i w:val="0"/>
           <w:sz w:val="19"/>
         </w:rPr>
-        <w:t xml:space="preserve">); alternate same-direction crossings yield the full period </w:t>
+        <w:t xml:space="preserve"> (</w:t>
       </w:r>
       <m:oMath>
-        <m:r>
-          <m:t>T</m:t>
+        <m:sSub>
+          <m:e>
+            <m:r>
+              <m:t>T</m:t>
+            </m:r>
+          </m:e>
+          <m:sub>
+            <m:r>
+              <m:t>2</m:t>
+            </m:r>
+          </m:sub>
+        </m:sSub>
+        <m:r>
+          <m:t>≈1.77</m:t>
+        </m:r>
+        <m:r>
+          <m:rPr>
+            <m:nor/>
+          </m:rPr>
+          <m:t> s</m:t>
         </m:r>
       </m:oMath>
       <w:r>
@@ -6690,7 +6702,7 @@
           <w:i w:val="0"/>
           <w:sz w:val="19"/>
         </w:rPr>
-        <w:t>. (b) Simultaneous tri-axial linear acceleration telemetry recorded by the onboard MPU-6050 IMU, showing centripetal acceleration modulation along the rod axis (</w:t>
+        <w:t>). (c) Pivot 1 tri-axial linear acceleration telemetry showing centripetal acceleration along the rod axis (</w:t>
       </w:r>
       <m:oMath>
         <m:sSub>
@@ -6708,6 +6720,9 @@
             </m:r>
           </m:sub>
         </m:sSub>
+        <m:r>
+          <m:t>≈−1.0g</m:t>
+        </m:r>
       </m:oMath>
       <w:r>
         <w:rPr>
@@ -6715,24 +6730,105 @@
           <w:i w:val="0"/>
           <w:sz w:val="19"/>
         </w:rPr>
-        <w:t>) at twice the fundamental swing frequency (</w:t>
+        <w:t>) and transverse acceleration (</w:t>
       </w:r>
       <m:oMath>
-        <m:r>
-          <m:t>2</m:t>
-        </m:r>
         <m:sSub>
           <m:e>
             <m:r>
-              <m:t>ω</m:t>
+              <m:t>a</m:t>
             </m:r>
           </m:e>
           <m:sub>
             <m:r>
-              <m:t>0</m:t>
+              <m:rPr>
+                <m:nor/>
+              </m:rPr>
+              <m:t>perp</m:t>
             </m:r>
           </m:sub>
         </m:sSub>
+        <m:r>
+          <m:t>≈0.0g</m:t>
+        </m:r>
+      </m:oMath>
+      <w:r>
+        <w:rPr>
+          <w:b w:val="0"/>
+          <w:i w:val="0"/>
+          <w:sz w:val="19"/>
+        </w:rPr>
+        <w:t xml:space="preserve">). (d) Pivot 2 inverted acceleration telemetry showing </w:t>
+      </w:r>
+      <m:oMath>
+        <m:sSup>
+          <m:e>
+            <m:r>
+              <m:t>180</m:t>
+            </m:r>
+          </m:e>
+          <m:sup>
+            <m:r>
+              <m:t>∘</m:t>
+            </m:r>
+          </m:sup>
+        </m:sSup>
+      </m:oMath>
+      <w:r>
+        <w:rPr>
+          <w:b w:val="0"/>
+          <w:i w:val="0"/>
+          <w:sz w:val="19"/>
+        </w:rPr>
+        <w:t xml:space="preserve"> gravity reversal (</w:t>
+      </w:r>
+      <m:oMath>
+        <m:sSub>
+          <m:e>
+            <m:r>
+              <m:t>a</m:t>
+            </m:r>
+          </m:e>
+          <m:sub>
+            <m:r>
+              <m:rPr>
+                <m:nor/>
+              </m:rPr>
+              <m:t>rod</m:t>
+            </m:r>
+          </m:sub>
+        </m:sSub>
+        <m:r>
+          <m:t>≈+0.95g</m:t>
+        </m:r>
+      </m:oMath>
+      <w:r>
+        <w:rPr>
+          <w:b w:val="0"/>
+          <w:i w:val="0"/>
+          <w:sz w:val="19"/>
+        </w:rPr>
+        <w:t>) and static tilt (</w:t>
+      </w:r>
+      <m:oMath>
+        <m:sSub>
+          <m:e>
+            <m:r>
+              <m:t>a</m:t>
+            </m:r>
+          </m:e>
+          <m:sub>
+            <m:r>
+              <m:rPr>
+                <m:nor/>
+              </m:rPr>
+              <m:t>perp</m:t>
+            </m:r>
+          </m:sub>
+        </m:sSub>
+        <m:r>
+          <m:t>≈+0.20g</m:t>
+        </m:r>
       </m:oMath>
       <w:r>
         <w:rPr>
@@ -6767,7 +6863,7 @@
           <w:b w:val="0"/>
           <w:i w:val="0"/>
         </w:rPr>
-        <w:t>During laboratory testing, three prominent anomalies were encountered in initial software builds. Because understanding these artifacts is essential to ensuring experimental integrity, we provide a complete engineering and mathematical post-mortem. Fig. 3 illustrates the diagnostic signatures of these anomalies.</w:t>
+        <w:t>During laboratory testing, three prominent anomalies were encountered in initial software builds. Because understanding these artifacts is essential to ensuring experimental integrity, we provide a complete engineering and mathematical post-mortem. Fig. 2 illustrates the diagnostic signatures of these anomalies.</w:t>
       </w:r>
     </w:p>
     <w:p>
@@ -7763,25 +7859,7 @@
           <w:b w:val="0"/>
           <w:i w:val="0"/>
         </w:rPr>
-        <w:t xml:space="preserve"> (</w:t>
-      </w:r>
-      <m:oMath>
-        <m:r>
-          <m:t>18,478</m:t>
-        </m:r>
-        <m:r>
-          <m:rPr>
-            <m:nor/>
-          </m:rPr>
-          <m:t> samples</m:t>
-        </m:r>
-      </m:oMath>
-      <w:r>
-        <w:rPr>
-          <w:b w:val="0"/>
-          <w:i w:val="0"/>
-        </w:rPr>
-        <w:t xml:space="preserve">, mean interval </w:t>
+        <w:t xml:space="preserve"> (18,478 samples, mean interval </w:t>
       </w:r>
       <m:oMath>
         <m:r>
@@ -8045,7 +8123,7 @@
           <w:b w:val="0"/>
           <w:i w:val="0"/>
         </w:rPr>
-        <w:t>Within 18 oscillations (</w:t>
+        <w:t>Over the first 18 oscillations (</w:t>
       </w:r>
       <m:oMath>
         <m:r>
@@ -8063,7 +8141,7 @@
           <w:b w:val="0"/>
           <w:i w:val="0"/>
         </w:rPr>
-        <w:t xml:space="preserve">), natural damping reduced the peak amplitude below </w:t>
+        <w:t xml:space="preserve">), natural damping reduced the peak amplitude toward </w:t>
       </w:r>
       <m:oMath>
         <m:r>
@@ -8081,42 +8159,6 @@
             </m:r>
           </m:sup>
         </m:sSup>
-      </m:oMath>
-      <w:r>
-        <w:rPr>
-          <w:b w:val="0"/>
-          <w:i w:val="0"/>
-        </w:rPr>
-        <w:t xml:space="preserve">, dropping peak angular velocity below </w:t>
-      </w:r>
-      <m:oMath>
-        <m:f>
-          <m:fPr>
-            <m:type m:val="lin"/>
-          </m:fPr>
-          <m:num>
-            <m:sSup>
-              <m:e>
-                <m:r>
-                  <m:t>3.0</m:t>
-                </m:r>
-              </m:e>
-              <m:sup>
-                <m:r>
-                  <m:t>∘</m:t>
-                </m:r>
-              </m:sup>
-            </m:sSup>
-          </m:num>
-          <m:den>
-            <m:r>
-              <m:rPr>
-                <m:nor/>
-              </m:rPr>
-              <m:t>s</m:t>
-            </m:r>
-          </m:den>
-        </m:f>
       </m:oMath>
       <w:r>
         <w:rPr>
@@ -8136,7 +8178,34 @@
           <w:b w:val="0"/>
           <w:i w:val="0"/>
         </w:rPr>
-        <w:t xml:space="preserve">At cycle 19, the swing decayed to </w:t>
+        <w:t>At cycles 19–20 (</w:t>
+      </w:r>
+      <m:oMath>
+        <m:r>
+          <m:t>≈34</m:t>
+        </m:r>
+        <m:r>
+          <m:rPr>
+            <m:nor/>
+          </m:rPr>
+          <m:t>--</m:t>
+        </m:r>
+        <m:r>
+          <m:t>36</m:t>
+        </m:r>
+        <m:r>
+          <m:rPr>
+            <m:nor/>
+          </m:rPr>
+          <m:t> s</m:t>
+        </m:r>
+      </m:oMath>
+      <w:r>
+        <w:rPr>
+          <w:b w:val="0"/>
+          <w:i w:val="0"/>
+        </w:rPr>
+        <w:t xml:space="preserve">), the swing amplitude decayed to </w:t>
       </w:r>
       <m:oMath>
         <m:r>
@@ -8145,7 +8214,7 @@
         <m:sSup>
           <m:e>
             <m:r>
-              <m:t>0.58</m:t>
+              <m:t>0.82</m:t>
             </m:r>
           </m:e>
           <m:sup>
@@ -8160,7 +8229,7 @@
           <w:b w:val="0"/>
           <w:i w:val="0"/>
         </w:rPr>
-        <w:t xml:space="preserve">, where peak speed fell to </w:t>
+        <w:t xml:space="preserve">, where peak angular velocity dropped to </w:t>
       </w:r>
       <m:oMath>
         <m:sSub>
@@ -8184,7 +8253,7 @@
         <m:sSup>
           <m:e>
             <m:r>
-              <m:t>0.58</m:t>
+              <m:t>0.82</m:t>
             </m:r>
           </m:e>
           <m:sup>
@@ -8223,7 +8292,7 @@
         <m:sSup>
           <m:e>
             <m:r>
-              <m:t>2.06</m:t>
+              <m:t>2.91</m:t>
             </m:r>
           </m:e>
           <m:sup>
@@ -8431,6 +8500,91 @@
     </w:p>
     <w:p>
       <w:pPr>
+        <w:spacing w:before="0" w:after="80" w:line="276" w:lineRule="auto"/>
+        <w:jc w:val="both"/>
+      </w:pPr>
+      <w:r>
+        <w:rPr>
+          <w:b w:val="0"/>
+          <w:i w:val="0"/>
+        </w:rPr>
+        <w:t xml:space="preserve">The pendulum continued oscillating unrecorded down to its terminal amplitude of </w:t>
+      </w:r>
+      <m:oMath>
+        <m:sSub>
+          <m:e>
+            <m:r>
+              <m:t>θ</m:t>
+            </m:r>
+          </m:e>
+          <m:sub>
+            <m:r>
+              <m:t>f</m:t>
+            </m:r>
+          </m:sub>
+        </m:sSub>
+        <m:r>
+          <m:t>≈</m:t>
+        </m:r>
+        <m:sSup>
+          <m:e>
+            <m:r>
+              <m:t>0.53</m:t>
+            </m:r>
+          </m:e>
+          <m:sup>
+            <m:r>
+              <m:t>∘</m:t>
+            </m:r>
+          </m:sup>
+        </m:sSup>
+        <m:r>
+          <m:rPr>
+            <m:nor/>
+          </m:rPr>
+          <m:t>--</m:t>
+        </m:r>
+        <m:sSup>
+          <m:e>
+            <m:r>
+              <m:t>0.58</m:t>
+            </m:r>
+          </m:e>
+          <m:sup>
+            <m:r>
+              <m:t>∘</m:t>
+            </m:r>
+          </m:sup>
+        </m:sSup>
+      </m:oMath>
+      <w:r>
+        <w:rPr>
+          <w:b w:val="0"/>
+          <w:i w:val="0"/>
+        </w:rPr>
+        <w:t xml:space="preserve"> at </w:t>
+      </w:r>
+      <m:oMath>
+        <m:r>
+          <m:t>t=187.6</m:t>
+        </m:r>
+        <m:r>
+          <m:rPr>
+            <m:nor/>
+          </m:rPr>
+          <m:t> s</m:t>
+        </m:r>
+      </m:oMath>
+      <w:r>
+        <w:rPr>
+          <w:b w:val="0"/>
+          <w:i w:val="0"/>
+        </w:rPr>
+        <w:t>.</w:t>
+      </w:r>
+    </w:p>
+    <w:p>
+      <w:pPr>
         <w:pStyle w:val="ListNumber"/>
         <w:spacing w:before="20" w:after="40" w:line="276" w:lineRule="auto"/>
       </w:pPr>
@@ -8439,7 +8593,7 @@
           <w:b w:val="0"/>
           <w:i w:val="0"/>
         </w:rPr>
-        <w:t>The unweighted arithmetic mean of all 20 recorded entries became:</w:t>
+        <w:t>The unweighted arithmetic mean of the 20 recorded entries became:</w:t>
       </w:r>
     </w:p>
     <w:p>
@@ -8616,7 +8770,225 @@
           <w:b w:val="0"/>
           <w:i w:val="0"/>
         </w:rPr>
-        <w:t xml:space="preserve"> produced a massive perturbation in the asymmetric term:</w:t>
+        <w:t xml:space="preserve"> perturbed both terms in Bessel's denominator:</w:t>
+      </w:r>
+    </w:p>
+    <w:p>
+      <w:pPr>
+        <w:pStyle w:val="ListBullet"/>
+        <w:spacing w:before="20" w:after="40" w:line="276" w:lineRule="auto"/>
+      </w:pPr>
+      <w:r>
+        <w:rPr>
+          <w:b w:val="0"/>
+          <w:i w:val="0"/>
+        </w:rPr>
+        <w:t>The symmetric term increased:</w:t>
+      </w:r>
+    </w:p>
+    <w:p>
+      <w:pPr>
+        <w:spacing w:before="120" w:after="120"/>
+        <w:jc w:val="center"/>
+      </w:pPr>
+      <m:oMath>
+        <m:f>
+          <m:fPr>
+            <m:type m:val="bar"/>
+          </m:fPr>
+          <m:num>
+            <m:sSubSup>
+              <m:e>
+                <m:r>
+                  <m:t>T</m:t>
+                </m:r>
+              </m:e>
+              <m:sub>
+                <m:r>
+                  <m:t>1</m:t>
+                </m:r>
+              </m:sub>
+              <m:sup>
+                <m:r>
+                  <m:t>2</m:t>
+                </m:r>
+              </m:sup>
+            </m:sSubSup>
+            <m:r>
+              <m:t>+</m:t>
+            </m:r>
+            <m:sSubSup>
+              <m:e>
+                <m:r>
+                  <m:t>T</m:t>
+                </m:r>
+              </m:e>
+              <m:sub>
+                <m:r>
+                  <m:t>2</m:t>
+                </m:r>
+              </m:sub>
+              <m:sup>
+                <m:r>
+                  <m:t>2</m:t>
+                </m:r>
+              </m:sup>
+            </m:sSubSup>
+          </m:num>
+          <m:den>
+            <m:r>
+              <m:t>L</m:t>
+            </m:r>
+          </m:den>
+        </m:f>
+        <m:r>
+          <m:t>=</m:t>
+        </m:r>
+        <m:f>
+          <m:fPr>
+            <m:type m:val="bar"/>
+          </m:fPr>
+          <m:num>
+            <m:sSup>
+              <m:e>
+                <m:d>
+                  <m:dPr>
+                    <m:sepChr m:val=""/>
+                  </m:dPr>
+                  <m:e>
+                    <m:r>
+                      <m:t>1.6845</m:t>
+                    </m:r>
+                    <m:sSup>
+                      <m:e>
+                        <m:r>
+                          <m:t>)</m:t>
+                        </m:r>
+                      </m:e>
+                      <m:sup>
+                        <m:r>
+                          <m:t>2</m:t>
+                        </m:r>
+                      </m:sup>
+                    </m:sSup>
+                    <m:r>
+                      <m:t>+</m:t>
+                    </m:r>
+                    <m:r>
+                      <m:t>(</m:t>
+                    </m:r>
+                    <m:r>
+                      <m:t>2.0380</m:t>
+                    </m:r>
+                  </m:e>
+                </m:d>
+              </m:e>
+              <m:sup>
+                <m:r>
+                  <m:t>2</m:t>
+                </m:r>
+              </m:sup>
+            </m:sSup>
+          </m:num>
+          <m:den>
+            <m:r>
+              <m:t>1.0000</m:t>
+            </m:r>
+          </m:den>
+        </m:f>
+        <m:r>
+          <m:t>=2.8375+4.1534=</m:t>
+        </m:r>
+        <m:r>
+          <m:rPr>
+            <m:sty m:val="b"/>
+          </m:rPr>
+          <m:t>6.991</m:t>
+        </m:r>
+        <m:sSup>
+          <m:e>
+            <m:r>
+              <m:rPr>
+                <m:nor/>
+                <m:sty m:val="b"/>
+              </m:rPr>
+              <m:t> s</m:t>
+            </m:r>
+          </m:e>
+          <m:sup>
+            <m:r>
+              <m:rPr>
+                <m:sty m:val="b"/>
+              </m:rPr>
+              <m:t>2</m:t>
+            </m:r>
+          </m:sup>
+        </m:sSup>
+        <m:r>
+          <m:rPr>
+            <m:sty m:val="b"/>
+          </m:rPr>
+          <m:t>/</m:t>
+        </m:r>
+        <m:r>
+          <m:rPr>
+            <m:nor/>
+            <m:sty m:val="b"/>
+          </m:rPr>
+          <m:t>m</m:t>
+        </m:r>
+        <m:r>
+          <m:t>(</m:t>
+        </m:r>
+        <m:r>
+          <m:rPr>
+            <m:nor/>
+          </m:rPr>
+          <m:t>vs. true </m:t>
+        </m:r>
+        <m:r>
+          <m:t>5.977</m:t>
+        </m:r>
+        <m:sSup>
+          <m:e>
+            <m:r>
+              <m:rPr>
+                <m:nor/>
+              </m:rPr>
+              <m:t> s</m:t>
+            </m:r>
+          </m:e>
+          <m:sup>
+            <m:r>
+              <m:t>2</m:t>
+            </m:r>
+          </m:sup>
+        </m:sSup>
+        <m:r>
+          <m:t>/</m:t>
+        </m:r>
+        <m:r>
+          <m:rPr>
+            <m:nor/>
+          </m:rPr>
+          <m:t>m</m:t>
+        </m:r>
+        <m:r>
+          <m:t>)</m:t>
+        </m:r>
+      </m:oMath>
+    </w:p>
+    <w:p>
+      <w:pPr>
+        <w:pStyle w:val="ListBullet"/>
+        <w:spacing w:before="20" w:after="40" w:line="276" w:lineRule="auto"/>
+      </w:pPr>
+      <w:r>
+        <w:rPr>
+          <w:b w:val="0"/>
+          <w:i w:val="0"/>
+        </w:rPr>
+        <w:t>The asymmetric term ballooned:</w:t>
       </w:r>
     </w:p>
     <w:p>
@@ -8812,6 +9184,45 @@
           </m:rPr>
           <m:t>m</m:t>
         </m:r>
+        <m:r>
+          <m:t>(</m:t>
+        </m:r>
+        <m:r>
+          <m:rPr>
+            <m:nor/>
+          </m:rPr>
+          <m:t>vs. true </m:t>
+        </m:r>
+        <m:r>
+          <m:t>+2.158</m:t>
+        </m:r>
+        <m:sSup>
+          <m:e>
+            <m:r>
+              <m:rPr>
+                <m:nor/>
+              </m:rPr>
+              <m:t> s</m:t>
+            </m:r>
+          </m:e>
+          <m:sup>
+            <m:r>
+              <m:t>2</m:t>
+            </m:r>
+          </m:sup>
+        </m:sSup>
+        <m:r>
+          <m:t>/</m:t>
+        </m:r>
+        <m:r>
+          <m:rPr>
+            <m:nor/>
+          </m:rPr>
+          <m:t>m</m:t>
+        </m:r>
+        <m:r>
+          <m:t>)</m:t>
+        </m:r>
       </m:oMath>
     </w:p>
     <w:p>
@@ -8824,23 +9235,11 @@
           <w:b w:val="0"/>
           <w:i w:val="0"/>
         </w:rPr>
-        <w:t xml:space="preserve">The denominator ballooned from </w:t>
+        <w:t xml:space="preserve">The combined denominator jumped from </w:t>
       </w:r>
       <m:oMath>
         <m:r>
           <m:t>8.14</m:t>
-        </m:r>
-      </m:oMath>
-      <w:r>
-        <w:rPr>
-          <w:b w:val="0"/>
-          <w:i w:val="0"/>
-        </w:rPr>
-        <w:t xml:space="preserve"> to </w:t>
-      </w:r>
-      <m:oMath>
-        <m:r>
-          <m:t>16.39</m:t>
         </m:r>
         <m:sSup>
           <m:e>
@@ -8863,6 +9262,56 @@
         <m:r>
           <m:rPr>
             <m:nor/>
+          </m:rPr>
+          <m:t>m</m:t>
+        </m:r>
+      </m:oMath>
+      <w:r>
+        <w:rPr>
+          <w:b w:val="0"/>
+          <w:i w:val="0"/>
+        </w:rPr>
+        <w:t xml:space="preserve"> to </w:t>
+      </w:r>
+      <m:oMath>
+        <m:r>
+          <m:t>6.991+9.399=</m:t>
+        </m:r>
+        <m:r>
+          <m:rPr>
+            <m:sty m:val="b"/>
+          </m:rPr>
+          <m:t>16.390</m:t>
+        </m:r>
+        <m:sSup>
+          <m:e>
+            <m:r>
+              <m:rPr>
+                <m:nor/>
+                <m:sty m:val="b"/>
+              </m:rPr>
+              <m:t> s</m:t>
+            </m:r>
+          </m:e>
+          <m:sup>
+            <m:r>
+              <m:rPr>
+                <m:sty m:val="b"/>
+              </m:rPr>
+              <m:t>2</m:t>
+            </m:r>
+          </m:sup>
+        </m:sSup>
+        <m:r>
+          <m:rPr>
+            <m:sty m:val="b"/>
+          </m:rPr>
+          <m:t>/</m:t>
+        </m:r>
+        <m:r>
+          <m:rPr>
+            <m:nor/>
+            <m:sty m:val="b"/>
           </m:rPr>
           <m:t>m</m:t>
         </m:r>
@@ -8907,7 +9356,7 @@
           </m:num>
           <m:den>
             <m:r>
-              <m:t>16.39</m:t>
+              <m:t>16.390</m:t>
             </m:r>
           </m:den>
         </m:f>
@@ -9573,7 +10022,7 @@
               <m:rPr>
                 <m:nor/>
               </m:rPr>
-              <m:t>DC</m:t>
+              <m:t>tilt</m:t>
             </m:r>
           </m:sub>
         </m:sSub>
@@ -10153,7 +10602,7 @@
               <a:graphicData uri="http://schemas.openxmlformats.org/drawingml/2006/picture">
                 <pic:pic>
                   <pic:nvPicPr>
-                    <pic:cNvPr id="0" name="fig3_post_mortem_diagnostics.png"/>
+                    <pic:cNvPr id="0" name="fig2_post_mortem_diagnostics.png"/>
                     <pic:cNvPicPr/>
                   </pic:nvPicPr>
                   <pic:blipFill>
@@ -10188,7 +10637,7 @@
           <w:i w:val="0"/>
           <w:sz w:val="19"/>
         </w:rPr>
-        <w:t xml:space="preserve">Figure 3. Software Diagnostic Post-Mortems for Live Laboratory Anomalies. </w:t>
+        <w:t xml:space="preserve">Figure 2. Software Diagnostic Post-Mortems for Live Laboratory Anomalies. </w:t>
       </w:r>
       <w:r>
         <w:rPr>
@@ -10196,7 +10645,7 @@
           <w:i w:val="0"/>
           <w:sz w:val="19"/>
         </w:rPr>
-        <w:t>(a) Decay-plot splitting artifact: static frame projection of equilibrium mounting tilt (</w:t>
+        <w:t>(a) Accelerometer tilt bifurcation artifact: static projection of mounting tilt (</w:t>
       </w:r>
       <m:oMath>
         <m:sSub>
@@ -10210,7 +10659,7 @@
               <m:rPr>
                 <m:nor/>
               </m:rPr>
-              <m:t>DC</m:t>
+              <m:t>tilt</m:t>
             </m:r>
           </m:sub>
         </m:sSub>
@@ -10236,7 +10685,57 @@
           <w:i w:val="0"/>
           <w:sz w:val="19"/>
         </w:rPr>
-        <w:t xml:space="preserve">) causes alternating peak bifurcation (red/blue markers), resolved by half-swing angular velocity integration (dashed green curve). (b) Low-amplitude tail threshold failure in Dataset 2: within 18 cycles, peak swing speed dipped below the fixed </w:t>
+        <w:t>) splits turning-point peak readings into upper and lower tracks (</w:t>
+      </w:r>
+      <m:oMath>
+        <m:r>
+          <m:t>≈</m:t>
+        </m:r>
+        <m:sSup>
+          <m:e>
+            <m:r>
+              <m:t>19.7</m:t>
+            </m:r>
+          </m:e>
+          <m:sup>
+            <m:r>
+              <m:t>∘</m:t>
+            </m:r>
+          </m:sup>
+        </m:sSup>
+      </m:oMath>
+      <w:r>
+        <w:rPr>
+          <w:b w:val="0"/>
+          <w:i w:val="0"/>
+          <w:sz w:val="19"/>
+        </w:rPr>
+        <w:t xml:space="preserve"> vs </w:t>
+      </w:r>
+      <m:oMath>
+        <m:r>
+          <m:t>≈</m:t>
+        </m:r>
+        <m:sSup>
+          <m:e>
+            <m:r>
+              <m:t>3.7</m:t>
+            </m:r>
+          </m:e>
+          <m:sup>
+            <m:r>
+              <m:t>∘</m:t>
+            </m:r>
+          </m:sup>
+        </m:sSup>
+      </m:oMath>
+      <w:r>
+        <w:rPr>
+          <w:b w:val="0"/>
+          <w:i w:val="0"/>
+          <w:sz w:val="19"/>
+        </w:rPr>
+        <w:t xml:space="preserve">, red dashed curve), completely resolved by dynamic half-swing angular velocity integration (blue points, true monotonic decay). (b) Low-amplitude tail threshold failure in Dataset 2: peak swing speed dipped below the fixed </w:t>
       </w:r>
       <m:oMath>
         <m:f>
@@ -10273,7 +10772,7 @@
           <w:i w:val="0"/>
           <w:sz w:val="19"/>
         </w:rPr>
-        <w:t xml:space="preserve"> gate, resulting in skipped cycles (</w:t>
+        <w:t xml:space="preserve"> gate at cycle 20, causing missed reversals (</w:t>
       </w:r>
       <m:oMath>
         <m:r>
@@ -10311,7 +10810,7 @@
           <w:i w:val="0"/>
           <w:sz w:val="19"/>
         </w:rPr>
-        <w:t xml:space="preserve">) that artificially inflated </w:t>
+        <w:t xml:space="preserve">) that inflated </w:t>
       </w:r>
       <m:oMath>
         <m:sSub>
@@ -10340,6 +10839,25 @@
           <w:i w:val="0"/>
           <w:sz w:val="19"/>
         </w:rPr>
+        <w:t xml:space="preserve"> to </w:t>
+      </w:r>
+      <m:oMath>
+        <m:r>
+          <m:t>2.038</m:t>
+        </m:r>
+        <m:r>
+          <m:rPr>
+            <m:nor/>
+          </m:rPr>
+          <m:t> s</m:t>
+        </m:r>
+      </m:oMath>
+      <w:r>
+        <w:rPr>
+          <w:b w:val="0"/>
+          <w:i w:val="0"/>
+          <w:sz w:val="19"/>
+        </w:rPr>
         <w:t xml:space="preserve"> and collapsed </w:t>
       </w:r>
       <m:oMath>
@@ -10381,7 +10899,7 @@
           <w:i w:val="0"/>
           <w:sz w:val="19"/>
         </w:rPr>
-        <w:t xml:space="preserve">. Re-processing with a fixed </w:t>
+        <w:t xml:space="preserve">. Software filtering and a </w:t>
       </w:r>
       <m:oMath>
         <m:f>
@@ -10418,7 +10936,7 @@
           <w:i w:val="0"/>
           <w:sz w:val="19"/>
         </w:rPr>
-        <w:t xml:space="preserve"> gate and median outlier filtering recovered all 105 valid oscillations.</w:t>
+        <w:t xml:space="preserve"> gate recovered all 105 clean oscillations.</w:t>
       </w:r>
     </w:p>
     <w:p>
@@ -10445,7 +10963,7 @@
           <w:b w:val="0"/>
           <w:i w:val="0"/>
         </w:rPr>
-        <w:t>We evaluate the full experimental telemetry gathered across two independent laboratory sessions. Fig. 2 shows the amplitude decay envelopes and quality factor fits for Dataset 1.</w:t>
+        <w:t>We evaluate the full experimental telemetry gathered across two independent laboratory sessions. Fig. 3 shows the amplitude decay envelopes and quality factor fits for Dataset 1.</w:t>
       </w:r>
     </w:p>
     <w:p>
@@ -10497,25 +11015,7 @@
           <w:b w:val="0"/>
           <w:i w:val="0"/>
         </w:rPr>
-        <w:t xml:space="preserve"> (</w:t>
-      </w:r>
-      <m:oMath>
-        <m:r>
-          <m:t>8,335</m:t>
-        </m:r>
-        <m:r>
-          <m:rPr>
-            <m:nor/>
-          </m:rPr>
-          <m:t> samples</m:t>
-        </m:r>
-      </m:oMath>
-      <w:r>
-        <w:rPr>
-          <w:b w:val="0"/>
-          <w:i w:val="0"/>
-        </w:rPr>
-        <w:t xml:space="preserve">, mean interval </w:t>
+        <w:t xml:space="preserve"> (8,335 samples, mean interval </w:t>
       </w:r>
       <m:oMath>
         <m:r>
@@ -10569,25 +11069,7 @@
           <w:b w:val="0"/>
           <w:i w:val="0"/>
         </w:rPr>
-        <w:t xml:space="preserve"> (</w:t>
-      </w:r>
-      <m:oMath>
-        <m:r>
-          <m:t>9,394</m:t>
-        </m:r>
-        <m:r>
-          <m:rPr>
-            <m:nor/>
-          </m:rPr>
-          <m:t> samples</m:t>
-        </m:r>
-      </m:oMath>
-      <w:r>
-        <w:rPr>
-          <w:b w:val="0"/>
-          <w:i w:val="0"/>
-        </w:rPr>
-        <w:t xml:space="preserve">, mean interval </w:t>
+        <w:t xml:space="preserve"> (9,394 samples, mean interval </w:t>
       </w:r>
       <m:oMath>
         <m:r>
@@ -11220,21 +11702,12 @@
                 <w:i w:val="0"/>
                 <w:sz w:val="19"/>
               </w:rPr>
-              <w:t>Initial Amplitude (</w:t>
+              <w:t>Measured Initial Amplitude (</w:t>
             </w:r>
             <m:oMath>
-              <m:sSub>
-                <m:e>
-                  <m:r>
-                    <m:t>θ</m:t>
-                  </m:r>
-                </m:e>
-                <m:sub>
-                  <m:r>
-                    <m:t>0</m:t>
-                  </m:r>
-                </m:sub>
-              </m:sSub>
+              <m:r>
+                <m:t>θ(0)</m:t>
+              </m:r>
             </m:oMath>
             <w:r>
               <w:rPr>
@@ -11346,6 +11819,205 @@
             <m:oMath>
               <m:r>
                 <m:t>0.1773</m:t>
+              </m:r>
+              <m:r>
+                <m:rPr>
+                  <m:nor/>
+                </m:rPr>
+                <m:t> rad</m:t>
+              </m:r>
+            </m:oMath>
+            <w:r>
+              <w:rPr>
+                <w:rFonts w:ascii="Times New Roman" w:hAnsi="Times New Roman"/>
+                <w:b w:val="0"/>
+                <w:i w:val="0"/>
+                <w:sz w:val="19"/>
+              </w:rPr>
+              <w:t>)</w:t>
+            </w:r>
+          </w:p>
+        </w:tc>
+        <w:tc>
+          <w:tcPr>
+            <w:tcW w:type="dxa" w:w="2340"/>
+            <w:tcMar>
+              <w:top w:w="120" w:type="dxa"/>
+              <w:bottom w:w="120" w:type="dxa"/>
+              <w:left w:w="140" w:type="dxa"/>
+              <w:right w:w="140" w:type="dxa"/>
+            </w:tcMar>
+          </w:tcPr>
+          <w:p>
+            <w:pPr>
+              <w:spacing w:before="0" w:after="0" w:line="264" w:lineRule="auto"/>
+            </w:pPr>
+            <w:r>
+              <w:rPr>
+                <w:rFonts w:ascii="Times New Roman" w:hAnsi="Times New Roman"/>
+                <w:b w:val="0"/>
+                <w:i w:val="0"/>
+                <w:sz w:val="19"/>
+              </w:rPr>
+              <w:t>—</w:t>
+            </w:r>
+          </w:p>
+        </w:tc>
+      </w:tr>
+      <w:tr>
+        <w:tc>
+          <w:tcPr>
+            <w:tcW w:type="dxa" w:w="2340"/>
+            <w:tcMar>
+              <w:top w:w="120" w:type="dxa"/>
+              <w:bottom w:w="120" w:type="dxa"/>
+              <w:left w:w="140" w:type="dxa"/>
+              <w:right w:w="140" w:type="dxa"/>
+            </w:tcMar>
+          </w:tcPr>
+          <w:p>
+            <w:pPr>
+              <w:spacing w:before="0" w:after="0" w:line="264" w:lineRule="auto"/>
+            </w:pPr>
+            <w:r>
+              <w:rPr>
+                <w:rFonts w:ascii="Times New Roman" w:hAnsi="Times New Roman"/>
+                <w:b/>
+                <w:i w:val="0"/>
+                <w:sz w:val="19"/>
+              </w:rPr>
+              <w:t>Fitted Decay Intercept (</w:t>
+            </w:r>
+            <m:oMath>
+              <m:sSub>
+                <m:e>
+                  <m:r>
+                    <m:t>θ</m:t>
+                  </m:r>
+                </m:e>
+                <m:sub>
+                  <m:r>
+                    <m:t>0,</m:t>
+                  </m:r>
+                  <m:r>
+                    <m:rPr>
+                      <m:nor/>
+                    </m:rPr>
+                    <m:t>fit</m:t>
+                  </m:r>
+                </m:sub>
+              </m:sSub>
+            </m:oMath>
+            <w:r>
+              <w:rPr>
+                <w:rFonts w:ascii="Times New Roman" w:hAnsi="Times New Roman"/>
+                <w:b/>
+                <w:i w:val="0"/>
+                <w:sz w:val="19"/>
+              </w:rPr>
+              <w:t>)</w:t>
+            </w:r>
+          </w:p>
+        </w:tc>
+        <w:tc>
+          <w:tcPr>
+            <w:tcW w:type="dxa" w:w="2340"/>
+            <w:tcMar>
+              <w:top w:w="120" w:type="dxa"/>
+              <w:bottom w:w="120" w:type="dxa"/>
+              <w:left w:w="140" w:type="dxa"/>
+              <w:right w:w="140" w:type="dxa"/>
+            </w:tcMar>
+          </w:tcPr>
+          <w:p>
+            <w:pPr>
+              <w:spacing w:before="0" w:after="0" w:line="264" w:lineRule="auto"/>
+            </w:pPr>
+            <m:oMath>
+              <m:sSup>
+                <m:e>
+                  <m:r>
+                    <m:t>5.14</m:t>
+                  </m:r>
+                </m:e>
+                <m:sup>
+                  <m:r>
+                    <m:t>∘</m:t>
+                  </m:r>
+                </m:sup>
+              </m:sSup>
+            </m:oMath>
+            <w:r>
+              <w:rPr>
+                <w:rFonts w:ascii="Times New Roman" w:hAnsi="Times New Roman"/>
+                <w:b w:val="0"/>
+                <w:i w:val="0"/>
+                <w:sz w:val="19"/>
+              </w:rPr>
+              <w:t xml:space="preserve"> (</w:t>
+            </w:r>
+            <m:oMath>
+              <m:r>
+                <m:t>0.0897</m:t>
+              </m:r>
+              <m:r>
+                <m:rPr>
+                  <m:nor/>
+                </m:rPr>
+                <m:t> rad</m:t>
+              </m:r>
+            </m:oMath>
+            <w:r>
+              <w:rPr>
+                <w:rFonts w:ascii="Times New Roman" w:hAnsi="Times New Roman"/>
+                <w:b w:val="0"/>
+                <w:i w:val="0"/>
+                <w:sz w:val="19"/>
+              </w:rPr>
+              <w:t>)</w:t>
+            </w:r>
+          </w:p>
+        </w:tc>
+        <w:tc>
+          <w:tcPr>
+            <w:tcW w:type="dxa" w:w="2340"/>
+            <w:tcMar>
+              <w:top w:w="120" w:type="dxa"/>
+              <w:bottom w:w="120" w:type="dxa"/>
+              <w:left w:w="140" w:type="dxa"/>
+              <w:right w:w="140" w:type="dxa"/>
+            </w:tcMar>
+          </w:tcPr>
+          <w:p>
+            <w:pPr>
+              <w:spacing w:before="0" w:after="0" w:line="264" w:lineRule="auto"/>
+            </w:pPr>
+            <m:oMath>
+              <m:sSup>
+                <m:e>
+                  <m:r>
+                    <m:t>9.95</m:t>
+                  </m:r>
+                </m:e>
+                <m:sup>
+                  <m:r>
+                    <m:t>∘</m:t>
+                  </m:r>
+                </m:sup>
+              </m:sSup>
+            </m:oMath>
+            <w:r>
+              <w:rPr>
+                <w:rFonts w:ascii="Times New Roman" w:hAnsi="Times New Roman"/>
+                <w:b w:val="0"/>
+                <w:i w:val="0"/>
+                <w:sz w:val="19"/>
+              </w:rPr>
+              <w:t xml:space="preserve"> (</w:t>
+            </w:r>
+            <m:oMath>
+              <m:r>
+                <m:t>0.1737</m:t>
               </m:r>
               <m:r>
                 <m:rPr>
@@ -13276,7 +13948,7 @@
               <a:graphicData uri="http://schemas.openxmlformats.org/drawingml/2006/picture">
                 <pic:pic>
                   <pic:nvPicPr>
-                    <pic:cNvPr id="0" name="fig2_decay_fits.png"/>
+                    <pic:cNvPr id="0" name="fig3_decay_fits.png"/>
                     <pic:cNvPicPr/>
                   </pic:nvPicPr>
                   <pic:blipFill>
@@ -13311,7 +13983,7 @@
           <w:i w:val="0"/>
           <w:sz w:val="19"/>
         </w:rPr>
-        <w:t>Figure 2. Empirical Peak Amplitude Decay and System Quality Factor (</w:t>
+        <w:t>Figure 3. Empirical Peak Amplitude Decay and System Quality Factor (</w:t>
       </w:r>
       <m:oMath>
         <m:r>
@@ -13332,7 +14004,7 @@
           <w:i w:val="0"/>
           <w:sz w:val="19"/>
         </w:rPr>
-        <w:t xml:space="preserve">Semi-logarithmic and linear decay curves </w:t>
+        <w:t xml:space="preserve">Linear peak amplitude decay curves </w:t>
       </w:r>
       <m:oMath>
         <m:r>
@@ -13346,7 +14018,13 @@
           </m:e>
           <m:sub>
             <m:r>
-              <m:t>0</m:t>
+              <m:t>0,</m:t>
+            </m:r>
+            <m:r>
+              <m:rPr>
+                <m:nor/>
+              </m:rPr>
+              <m:t>fit</m:t>
             </m:r>
           </m:sub>
         </m:sSub>
@@ -13369,7 +14047,32 @@
           <w:i w:val="0"/>
           <w:sz w:val="19"/>
         </w:rPr>
-        <w:t xml:space="preserve"> for Pivot 1 (blue circles, </w:t>
+        <w:t xml:space="preserve"> for Pivot 1 (blue circles, initial </w:t>
+      </w:r>
+      <m:oMath>
+        <m:r>
+          <m:t>θ(0)=</m:t>
+        </m:r>
+        <m:sSup>
+          <m:e>
+            <m:r>
+              <m:t>5.20</m:t>
+            </m:r>
+          </m:e>
+          <m:sup>
+            <m:r>
+              <m:t>∘</m:t>
+            </m:r>
+          </m:sup>
+        </m:sSup>
+      </m:oMath>
+      <w:r>
+        <w:rPr>
+          <w:b w:val="0"/>
+          <w:i w:val="0"/>
+          <w:sz w:val="19"/>
+        </w:rPr>
+        <w:t xml:space="preserve">, fitted intercept </w:t>
       </w:r>
       <m:oMath>
         <m:sSub>
@@ -13380,7 +14083,13 @@
           </m:e>
           <m:sub>
             <m:r>
-              <m:t>0</m:t>
+              <m:t>0,</m:t>
+            </m:r>
+            <m:r>
+              <m:rPr>
+                <m:nor/>
+              </m:rPr>
+              <m:t>fit</m:t>
             </m:r>
           </m:sub>
         </m:sSub>
@@ -13390,7 +14099,7 @@
         <m:sSup>
           <m:e>
             <m:r>
-              <m:t>5.20</m:t>
+              <m:t>5.14</m:t>
             </m:r>
           </m:e>
           <m:sup>
@@ -13432,7 +14141,32 @@
           <w:i w:val="0"/>
           <w:sz w:val="19"/>
         </w:rPr>
-        <w:t xml:space="preserve">) and Pivot 2 (red circles, </w:t>
+        <w:t xml:space="preserve">) and Pivot 2 (red circles, initial </w:t>
+      </w:r>
+      <m:oMath>
+        <m:r>
+          <m:t>θ(0)=</m:t>
+        </m:r>
+        <m:sSup>
+          <m:e>
+            <m:r>
+              <m:t>10.16</m:t>
+            </m:r>
+          </m:e>
+          <m:sup>
+            <m:r>
+              <m:t>∘</m:t>
+            </m:r>
+          </m:sup>
+        </m:sSup>
+      </m:oMath>
+      <w:r>
+        <w:rPr>
+          <w:b w:val="0"/>
+          <w:i w:val="0"/>
+          <w:sz w:val="19"/>
+        </w:rPr>
+        <w:t xml:space="preserve">, fitted intercept </w:t>
       </w:r>
       <m:oMath>
         <m:sSub>
@@ -13443,7 +14177,13 @@
           </m:e>
           <m:sub>
             <m:r>
-              <m:t>0</m:t>
+              <m:t>0,</m:t>
+            </m:r>
+            <m:r>
+              <m:rPr>
+                <m:nor/>
+              </m:rPr>
+              <m:t>fit</m:t>
             </m:r>
           </m:sub>
         </m:sSub>
@@ -13453,7 +14193,7 @@
         <m:sSup>
           <m:e>
             <m:r>
-              <m:t>10.16</m:t>
+              <m:t>9.95</m:t>
             </m:r>
           </m:e>
           <m:sup>
@@ -13495,7 +14235,7 @@
           <w:i w:val="0"/>
           <w:sz w:val="19"/>
         </w:rPr>
-        <w:t>) from Dataset 1. Dashed lines denote non-linear least-squares exponential fits confirming linear viscous damping without aerodynamic turbulence transitions.</w:t>
+        <w:t>) from Dataset 1. Dashed green curves denote exponential fits confirming linear viscous damping.</w:t>
       </w:r>
     </w:p>
     <w:p>
@@ -13547,25 +14287,7 @@
           <w:b w:val="0"/>
           <w:i w:val="0"/>
         </w:rPr>
-        <w:t xml:space="preserve"> (</w:t>
-      </w:r>
-      <m:oMath>
-        <m:r>
-          <m:t>6,637</m:t>
-        </m:r>
-        <m:r>
-          <m:rPr>
-            <m:nor/>
-          </m:rPr>
-          <m:t> samples</m:t>
-        </m:r>
-      </m:oMath>
-      <w:r>
-        <w:rPr>
-          <w:b w:val="0"/>
-          <w:i w:val="0"/>
-        </w:rPr>
-        <w:t xml:space="preserve">, mean interval </w:t>
+        <w:t xml:space="preserve"> (6,637 samples, mean interval </w:t>
       </w:r>
       <m:oMath>
         <m:r>
@@ -13619,25 +14341,7 @@
           <w:b w:val="0"/>
           <w:i w:val="0"/>
         </w:rPr>
-        <w:t xml:space="preserve"> (</w:t>
-      </w:r>
-      <m:oMath>
-        <m:r>
-          <m:t>18,478</m:t>
-        </m:r>
-        <m:r>
-          <m:rPr>
-            <m:nor/>
-          </m:rPr>
-          <m:t> samples</m:t>
-        </m:r>
-      </m:oMath>
-      <w:r>
-        <w:rPr>
-          <w:b w:val="0"/>
-          <w:i w:val="0"/>
-        </w:rPr>
-        <w:t xml:space="preserve">, mean interval </w:t>
+        <w:t xml:space="preserve"> (18,478 samples, mean interval </w:t>
       </w:r>
       <m:oMath>
         <m:r>
@@ -14270,7 +14974,191 @@
                 <w:i w:val="0"/>
                 <w:sz w:val="19"/>
               </w:rPr>
-              <w:t>Initial Amplitude (</w:t>
+              <w:t>Measured Initial Amplitude (</w:t>
+            </w:r>
+            <m:oMath>
+              <m:r>
+                <m:t>θ(0)</m:t>
+              </m:r>
+            </m:oMath>
+            <w:r>
+              <w:rPr>
+                <w:rFonts w:ascii="Times New Roman" w:hAnsi="Times New Roman"/>
+                <w:b/>
+                <w:i w:val="0"/>
+                <w:sz w:val="19"/>
+              </w:rPr>
+              <w:t>)</w:t>
+            </w:r>
+          </w:p>
+        </w:tc>
+        <w:tc>
+          <w:tcPr>
+            <w:tcW w:type="dxa" w:w="2340"/>
+            <w:tcMar>
+              <w:top w:w="120" w:type="dxa"/>
+              <w:bottom w:w="120" w:type="dxa"/>
+              <w:left w:w="140" w:type="dxa"/>
+              <w:right w:w="140" w:type="dxa"/>
+            </w:tcMar>
+          </w:tcPr>
+          <w:p>
+            <w:pPr>
+              <w:spacing w:before="0" w:after="0" w:line="264" w:lineRule="auto"/>
+            </w:pPr>
+            <m:oMath>
+              <m:sSup>
+                <m:e>
+                  <m:r>
+                    <m:t>3.54</m:t>
+                  </m:r>
+                </m:e>
+                <m:sup>
+                  <m:r>
+                    <m:t>∘</m:t>
+                  </m:r>
+                </m:sup>
+              </m:sSup>
+            </m:oMath>
+            <w:r>
+              <w:rPr>
+                <w:rFonts w:ascii="Times New Roman" w:hAnsi="Times New Roman"/>
+                <w:b w:val="0"/>
+                <w:i w:val="0"/>
+                <w:sz w:val="19"/>
+              </w:rPr>
+              <w:t xml:space="preserve"> (</w:t>
+            </w:r>
+            <m:oMath>
+              <m:r>
+                <m:t>0.0617</m:t>
+              </m:r>
+              <m:r>
+                <m:rPr>
+                  <m:nor/>
+                </m:rPr>
+                <m:t> rad</m:t>
+              </m:r>
+            </m:oMath>
+            <w:r>
+              <w:rPr>
+                <w:rFonts w:ascii="Times New Roman" w:hAnsi="Times New Roman"/>
+                <w:b w:val="0"/>
+                <w:i w:val="0"/>
+                <w:sz w:val="19"/>
+              </w:rPr>
+              <w:t>)</w:t>
+            </w:r>
+          </w:p>
+        </w:tc>
+        <w:tc>
+          <w:tcPr>
+            <w:tcW w:type="dxa" w:w="2340"/>
+            <w:tcMar>
+              <w:top w:w="120" w:type="dxa"/>
+              <w:bottom w:w="120" w:type="dxa"/>
+              <w:left w:w="140" w:type="dxa"/>
+              <w:right w:w="140" w:type="dxa"/>
+            </w:tcMar>
+          </w:tcPr>
+          <w:p>
+            <w:pPr>
+              <w:spacing w:before="0" w:after="0" w:line="264" w:lineRule="auto"/>
+            </w:pPr>
+            <m:oMath>
+              <m:sSup>
+                <m:e>
+                  <m:r>
+                    <m:t>0.96</m:t>
+                  </m:r>
+                </m:e>
+                <m:sup>
+                  <m:r>
+                    <m:t>∘</m:t>
+                  </m:r>
+                </m:sup>
+              </m:sSup>
+            </m:oMath>
+            <w:r>
+              <w:rPr>
+                <w:rFonts w:ascii="Times New Roman" w:hAnsi="Times New Roman"/>
+                <w:b w:val="0"/>
+                <w:i w:val="0"/>
+                <w:sz w:val="19"/>
+              </w:rPr>
+              <w:t xml:space="preserve"> (</w:t>
+            </w:r>
+            <m:oMath>
+              <m:r>
+                <m:t>0.0167</m:t>
+              </m:r>
+              <m:r>
+                <m:rPr>
+                  <m:nor/>
+                </m:rPr>
+                <m:t> rad</m:t>
+              </m:r>
+            </m:oMath>
+            <w:r>
+              <w:rPr>
+                <w:rFonts w:ascii="Times New Roman" w:hAnsi="Times New Roman"/>
+                <w:b w:val="0"/>
+                <w:i w:val="0"/>
+                <w:sz w:val="19"/>
+              </w:rPr>
+              <w:t>)</w:t>
+            </w:r>
+          </w:p>
+        </w:tc>
+        <w:tc>
+          <w:tcPr>
+            <w:tcW w:type="dxa" w:w="2340"/>
+            <w:tcMar>
+              <w:top w:w="120" w:type="dxa"/>
+              <w:bottom w:w="120" w:type="dxa"/>
+              <w:left w:w="140" w:type="dxa"/>
+              <w:right w:w="140" w:type="dxa"/>
+            </w:tcMar>
+          </w:tcPr>
+          <w:p>
+            <w:pPr>
+              <w:spacing w:before="0" w:after="0" w:line="264" w:lineRule="auto"/>
+            </w:pPr>
+            <w:r>
+              <w:rPr>
+                <w:rFonts w:ascii="Times New Roman" w:hAnsi="Times New Roman"/>
+                <w:b w:val="0"/>
+                <w:i w:val="0"/>
+                <w:sz w:val="19"/>
+              </w:rPr>
+              <w:t>—</w:t>
+            </w:r>
+          </w:p>
+        </w:tc>
+      </w:tr>
+      <w:tr>
+        <w:tc>
+          <w:tcPr>
+            <w:tcW w:type="dxa" w:w="2340"/>
+            <w:tcMar>
+              <w:top w:w="120" w:type="dxa"/>
+              <w:bottom w:w="120" w:type="dxa"/>
+              <w:left w:w="140" w:type="dxa"/>
+              <w:right w:w="140" w:type="dxa"/>
+            </w:tcMar>
+          </w:tcPr>
+          <w:p>
+            <w:pPr>
+              <w:spacing w:before="0" w:after="0" w:line="264" w:lineRule="auto"/>
+            </w:pPr>
+            <w:r>
+              <w:rPr>
+                <w:rFonts w:ascii="Times New Roman" w:hAnsi="Times New Roman"/>
+                <w:b/>
+                <w:i w:val="0"/>
+                <w:sz w:val="19"/>
+              </w:rPr>
+              <w:t>Fitted Decay Intercept (</w:t>
             </w:r>
             <m:oMath>
               <m:sSub>
@@ -14281,7 +15169,13 @@
                 </m:e>
                 <m:sub>
                   <m:r>
-                    <m:t>0</m:t>
+                    <m:t>0,</m:t>
+                  </m:r>
+                  <m:r>
+                    <m:rPr>
+                      <m:nor/>
+                    </m:rPr>
+                    <m:t>fit</m:t>
                   </m:r>
                 </m:sub>
               </m:sSub>
@@ -14567,7 +15461,7 @@
               <m:sSup>
                 <m:e>
                   <m:r>
-                    <m:t>0.58</m:t>
+                    <m:t>0.53</m:t>
                   </m:r>
                 </m:e>
                 <m:sup>
@@ -14588,7 +15482,7 @@
             </w:r>
             <m:oMath>
               <m:r>
-                <m:t>0.0101</m:t>
+                <m:t>0.0093</m:t>
               </m:r>
               <m:r>
                 <m:rPr>
@@ -15319,13 +16213,117 @@
                 <w:i w:val="0"/>
                 <w:sz w:val="19"/>
               </w:rPr>
-              <w:t xml:space="preserve">Calculated </w:t>
+              <w:t xml:space="preserve">Bessel Uncorrected </w:t>
             </w:r>
             <m:oMath>
               <m:r>
                 <m:t>g</m:t>
               </m:r>
             </m:oMath>
+          </w:p>
+        </w:tc>
+        <w:tc>
+          <w:tcPr>
+            <w:tcW w:type="dxa" w:w="2340"/>
+            <w:tcMar>
+              <w:top w:w="120" w:type="dxa"/>
+              <w:bottom w:w="120" w:type="dxa"/>
+              <w:left w:w="140" w:type="dxa"/>
+              <w:right w:w="140" w:type="dxa"/>
+            </w:tcMar>
+          </w:tcPr>
+          <w:p>
+            <w:pPr>
+              <w:spacing w:before="0" w:after="0" w:line="264" w:lineRule="auto"/>
+            </w:pPr>
+            <w:r>
+              <w:rPr>
+                <w:rFonts w:ascii="Times New Roman" w:hAnsi="Times New Roman"/>
+                <w:b w:val="0"/>
+                <w:i w:val="0"/>
+                <w:sz w:val="19"/>
+              </w:rPr>
+              <w:t>—</w:t>
+            </w:r>
+          </w:p>
+        </w:tc>
+        <w:tc>
+          <w:tcPr>
+            <w:tcW w:type="dxa" w:w="2340"/>
+            <w:tcMar>
+              <w:top w:w="120" w:type="dxa"/>
+              <w:bottom w:w="120" w:type="dxa"/>
+              <w:left w:w="140" w:type="dxa"/>
+              <w:right w:w="140" w:type="dxa"/>
+            </w:tcMar>
+          </w:tcPr>
+          <w:p>
+            <w:pPr>
+              <w:spacing w:before="0" w:after="0" w:line="264" w:lineRule="auto"/>
+            </w:pPr>
+            <w:r>
+              <w:rPr>
+                <w:rFonts w:ascii="Times New Roman" w:hAnsi="Times New Roman"/>
+                <w:b w:val="0"/>
+                <w:i w:val="0"/>
+                <w:sz w:val="19"/>
+              </w:rPr>
+              <w:t>—</w:t>
+            </w:r>
+          </w:p>
+        </w:tc>
+        <w:tc>
+          <w:tcPr>
+            <w:tcW w:type="dxa" w:w="2340"/>
+            <w:tcMar>
+              <w:top w:w="120" w:type="dxa"/>
+              <w:bottom w:w="120" w:type="dxa"/>
+              <w:left w:w="140" w:type="dxa"/>
+              <w:right w:w="140" w:type="dxa"/>
+            </w:tcMar>
+          </w:tcPr>
+          <w:p>
+            <w:pPr>
+              <w:spacing w:before="0" w:after="0" w:line="264" w:lineRule="auto"/>
+            </w:pPr>
+            <m:oMath>
+              <m:r>
+                <m:t>9.7104</m:t>
+              </m:r>
+              <m:sSup>
+                <m:e>
+                  <m:r>
+                    <m:rPr>
+                      <m:nor/>
+                    </m:rPr>
+                    <m:t> m/s</m:t>
+                  </m:r>
+                </m:e>
+                <m:sup>
+                  <m:r>
+                    <m:t>2</m:t>
+                  </m:r>
+                </m:sup>
+              </m:sSup>
+            </m:oMath>
+          </w:p>
+        </w:tc>
+      </w:tr>
+      <w:tr>
+        <w:tc>
+          <w:tcPr>
+            <w:tcW w:type="dxa" w:w="2340"/>
+            <w:tcMar>
+              <w:top w:w="120" w:type="dxa"/>
+              <w:bottom w:w="120" w:type="dxa"/>
+              <w:left w:w="140" w:type="dxa"/>
+              <w:right w:w="140" w:type="dxa"/>
+            </w:tcMar>
+          </w:tcPr>
+          <w:p>
+            <w:pPr>
+              <w:spacing w:before="0" w:after="0" w:line="264" w:lineRule="auto"/>
+            </w:pPr>
             <w:r>
               <w:rPr>
                 <w:rFonts w:ascii="Times New Roman" w:hAnsi="Times New Roman"/>
@@ -15333,28 +16331,13 @@
                 <w:i w:val="0"/>
                 <w:sz w:val="19"/>
               </w:rPr>
-              <w:t xml:space="preserve"> (Nominal </w:t>
+              <w:t xml:space="preserve">Bessel Corrected </w:t>
             </w:r>
             <m:oMath>
               <m:r>
-                <m:t>d=−0.140</m:t>
-              </m:r>
-              <m:r>
-                <m:rPr>
-                  <m:nor/>
-                </m:rPr>
-                <m:t> m</m:t>
+                <m:t>g</m:t>
               </m:r>
             </m:oMath>
-            <w:r>
-              <w:rPr>
-                <w:rFonts w:ascii="Times New Roman" w:hAnsi="Times New Roman"/>
-                <w:b/>
-                <w:i w:val="0"/>
-                <w:sz w:val="19"/>
-              </w:rPr>
-              <w:t>)</w:t>
-            </w:r>
           </w:p>
         </w:tc>
         <w:tc>
@@ -17465,7 +18448,7 @@
           <w:b w:val="0"/>
           <w:i w:val="0"/>
         </w:rPr>
-        <w:t xml:space="preserve">, combined in quadrature from individual knife-edge balance line uncertainties </w:t>
+        <w:t xml:space="preserve">, combined in quadrature from individual knife-edge balance line vernier measurements </w:t>
       </w:r>
       <m:oMath>
         <m:sSub>
@@ -19890,7 +20873,7 @@
       </w:r>
       <m:oMath>
         <m:r>
-          <m:t>Q≈600</m:t>
+          <m:t>Q≈235</m:t>
         </m:r>
         <m:r>
           <m:rPr>
@@ -19899,7 +20882,7 @@
           <m:t>--</m:t>
         </m:r>
         <m:r>
-          <m:t>680</m:t>
+          <m:t>681</m:t>
         </m:r>
       </m:oMath>
       <w:r>
@@ -19907,7 +20890,28 @@
           <w:b w:val="0"/>
           <w:i w:val="0"/>
         </w:rPr>
-        <w:t xml:space="preserve">), and demonstrates how Bessel's asymmetric formulation suppresses center-of-mass balance uncertainty by a factor of </w:t>
+        <w:t xml:space="preserve"> across all experimental configurations, with </w:t>
+      </w:r>
+      <m:oMath>
+        <m:r>
+          <m:t>Q≈600</m:t>
+        </m:r>
+        <m:r>
+          <m:rPr>
+            <m:nor/>
+          </m:rPr>
+          <m:t>--</m:t>
+        </m:r>
+        <m:r>
+          <m:t>680</m:t>
+        </m:r>
+      </m:oMath>
+      <w:r>
+        <w:rPr>
+          <w:b w:val="0"/>
+          <w:i w:val="0"/>
+        </w:rPr>
+        <w:t xml:space="preserve"> under nominal balanced conditions in Dataset 1), and demonstrates how Bessel's asymmetric formulation suppresses center-of-mass balance uncertainty by a factor of </w:t>
       </w:r>
       <m:oMath>
         <m:r>

</xml_diff>

<commit_message>
Fact-check audit: verify empirical telemetry, fix Dataset 2 fitted amplitude in Table 5.2, recompile docx and pdf
</commit_message>
<xml_diff>
--- a/docs/Katers_Pendulum_Research_Report.docx
+++ b/docs/Katers_Pendulum_Research_Report.docx
@@ -16219,7 +16219,7 @@
               <m:sSup>
                 <m:e>
                   <m:r>
-                    <m:t>3.54</m:t>
+                    <m:t>3.61</m:t>
                   </m:r>
                 </m:e>
                 <m:sup>
@@ -16240,7 +16240,7 @@
             </w:r>
             <m:oMath>
               <m:r>
-                <m:t>0.0617</m:t>
+                <m:t>0.0630</m:t>
               </m:r>
               <m:r>
                 <m:rPr>
@@ -16278,7 +16278,7 @@
               <m:sSup>
                 <m:e>
                   <m:r>
-                    <m:t>0.96</m:t>
+                    <m:t>0.94</m:t>
                   </m:r>
                 </m:e>
                 <m:sup>
@@ -16299,7 +16299,7 @@
             </w:r>
             <m:oMath>
               <m:r>
-                <m:t>0.0167</m:t>
+                <m:t>0.0164</m:t>
               </m:r>
               <m:r>
                 <m:rPr>

</xml_diff>